<commit_message>
fix doc e readme, e novo slide
</commit_message>
<xml_diff>
--- a/trabalho_final/Desafio5_Flask_IMIP/slides/Sistema De Apoio À Alfabetização Hospitalar Documentação.docx
+++ b/trabalho_final/Desafio5_Flask_IMIP/slides/Sistema De Apoio À Alfabetização Hospitalar Documentação.docx
@@ -169,7 +169,9 @@
       <w:r>
         <w:rPr>
           <w:rFonts w:ascii="Times New Roman" w:hAnsi="Times New Roman" w:eastAsia="Times New Roman" w:cs="Times New Roman"/>
-          <w:color w:val="000000" w:themeColor="text1"/>
+          <w:b w:val="1"/>
+          <w:bCs w:val="1"/>
+          <w:color w:val="000000" w:themeColor="text1" w:themeTint="FF" w:themeShade="FF"/>
           <w:sz w:val="28"/>
           <w:szCs w:val="28"/>
         </w:rPr>
@@ -178,7 +180,9 @@
       <w:r>
         <w:rPr>
           <w:rFonts w:ascii="Times New Roman" w:hAnsi="Times New Roman" w:eastAsia="Times New Roman" w:cs="Times New Roman"/>
-          <w:color w:val="000000" w:themeColor="text1"/>
+          <w:b w:val="1"/>
+          <w:bCs w:val="1"/>
+          <w:color w:val="000000" w:themeColor="text1" w:themeTint="FF" w:themeShade="FF"/>
           <w:sz w:val="28"/>
           <w:szCs w:val="28"/>
         </w:rPr>
@@ -187,9 +191,9 @@
       <w:r>
         <w:rPr>
           <w:rFonts w:ascii="Times New Roman" w:hAnsi="Times New Roman" w:eastAsia="Times New Roman" w:cs="Times New Roman"/>
-          <w:b/>
-          <w:bCs/>
-          <w:color w:val="000000" w:themeColor="text1"/>
+          <w:b w:val="1"/>
+          <w:bCs w:val="1"/>
+          <w:color w:val="000000" w:themeColor="text1" w:themeTint="FF" w:themeShade="FF"/>
           <w:sz w:val="28"/>
           <w:szCs w:val="28"/>
         </w:rPr>
@@ -201,7 +205,9 @@
       <w:r>
         <w:rPr>
           <w:rFonts w:ascii="Times New Roman" w:hAnsi="Times New Roman" w:eastAsia="Times New Roman" w:cs="Times New Roman"/>
-          <w:color w:val="000000" w:themeColor="text1"/>
+          <w:b w:val="1"/>
+          <w:bCs w:val="1"/>
+          <w:color w:val="000000" w:themeColor="text1" w:themeTint="FF" w:themeShade="FF"/>
           <w:sz w:val="28"/>
           <w:szCs w:val="28"/>
         </w:rPr>
@@ -501,6 +507,8 @@
         <w:jc w:val="center"/>
         <w:rPr>
           <w:rFonts w:ascii="Times New Roman" w:hAnsi="Times New Roman" w:cs="Times New Roman"/>
+          <w:b w:val="1"/>
+          <w:bCs w:val="1"/>
           <w:sz w:val="24"/>
           <w:szCs w:val="24"/>
         </w:rPr>
@@ -508,6 +516,8 @@
       <w:r>
         <w:rPr>
           <w:rFonts w:ascii="Times New Roman" w:hAnsi="Times New Roman" w:cs="Times New Roman"/>
+          <w:b w:val="1"/>
+          <w:bCs w:val="1"/>
           <w:sz w:val="24"/>
           <w:szCs w:val="24"/>
         </w:rPr>
@@ -520,6 +530,8 @@
         <w:jc w:val="center"/>
         <w:rPr>
           <w:rFonts w:ascii="Times New Roman" w:hAnsi="Times New Roman" w:eastAsia="Times New Roman" w:cs="Times New Roman"/>
+          <w:b w:val="1"/>
+          <w:bCs w:val="1"/>
           <w:sz w:val="28"/>
           <w:szCs w:val="28"/>
         </w:rPr>
@@ -527,6 +539,8 @@
       <w:r>
         <w:rPr>
           <w:rFonts w:ascii="Times New Roman" w:hAnsi="Times New Roman" w:cs="Times New Roman"/>
+          <w:b w:val="1"/>
+          <w:bCs w:val="1"/>
           <w:sz w:val="24"/>
           <w:szCs w:val="24"/>
         </w:rPr>
@@ -831,7 +845,7 @@
       <w:r>
         <w:rPr>
           <w:rFonts w:ascii="Times New Roman" w:hAnsi="Times New Roman" w:eastAsia="Times New Roman" w:cs="Times New Roman"/>
-          <w:color w:val="000000" w:themeColor="text1"/>
+          <w:color w:val="000000" w:themeColor="text1" w:themeTint="FF" w:themeShade="FF"/>
           <w:sz w:val="24"/>
           <w:szCs w:val="24"/>
         </w:rPr>
@@ -840,41 +854,37 @@
       <w:r>
         <w:br/>
       </w:r>
-      <w:proofErr w:type="spellStart"/>
-      <w:r>
-        <w:rPr>
-          <w:rFonts w:ascii="Times New Roman" w:hAnsi="Times New Roman" w:eastAsia="Times New Roman" w:cs="Times New Roman"/>
-          <w:color w:val="000000" w:themeColor="text1"/>
+      <w:r>
+        <w:rPr>
+          <w:rFonts w:ascii="Times New Roman" w:hAnsi="Times New Roman" w:eastAsia="Times New Roman" w:cs="Times New Roman"/>
+          <w:color w:val="000000" w:themeColor="text1" w:themeTint="FF" w:themeShade="FF"/>
           <w:sz w:val="24"/>
           <w:szCs w:val="24"/>
         </w:rPr>
         <w:t>Emanuelly</w:t>
       </w:r>
-      <w:proofErr w:type="spellEnd"/>
-      <w:r>
-        <w:rPr>
-          <w:rFonts w:ascii="Times New Roman" w:hAnsi="Times New Roman" w:eastAsia="Times New Roman" w:cs="Times New Roman"/>
-          <w:color w:val="000000" w:themeColor="text1"/>
+      <w:r>
+        <w:rPr>
+          <w:rFonts w:ascii="Times New Roman" w:hAnsi="Times New Roman" w:eastAsia="Times New Roman" w:cs="Times New Roman"/>
+          <w:color w:val="000000" w:themeColor="text1" w:themeTint="FF" w:themeShade="FF"/>
           <w:sz w:val="24"/>
           <w:szCs w:val="24"/>
         </w:rPr>
         <w:t xml:space="preserve"> </w:t>
       </w:r>
-      <w:proofErr w:type="spellStart"/>
-      <w:r>
-        <w:rPr>
-          <w:rFonts w:ascii="Times New Roman" w:hAnsi="Times New Roman" w:eastAsia="Times New Roman" w:cs="Times New Roman"/>
-          <w:color w:val="000000" w:themeColor="text1"/>
+      <w:r>
+        <w:rPr>
+          <w:rFonts w:ascii="Times New Roman" w:hAnsi="Times New Roman" w:eastAsia="Times New Roman" w:cs="Times New Roman"/>
+          <w:color w:val="000000" w:themeColor="text1" w:themeTint="FF" w:themeShade="FF"/>
           <w:sz w:val="24"/>
           <w:szCs w:val="24"/>
         </w:rPr>
         <w:t>Araujo</w:t>
       </w:r>
-      <w:proofErr w:type="spellEnd"/>
-      <w:r>
-        <w:rPr>
-          <w:rFonts w:ascii="Times New Roman" w:hAnsi="Times New Roman" w:eastAsia="Times New Roman" w:cs="Times New Roman"/>
-          <w:color w:val="000000" w:themeColor="text1"/>
+      <w:r>
+        <w:rPr>
+          <w:rFonts w:ascii="Times New Roman" w:hAnsi="Times New Roman" w:eastAsia="Times New Roman" w:cs="Times New Roman"/>
+          <w:color w:val="000000" w:themeColor="text1" w:themeTint="FF" w:themeShade="FF"/>
           <w:sz w:val="24"/>
           <w:szCs w:val="24"/>
         </w:rPr>
@@ -883,7 +893,7 @@
       <w:r>
         <w:rPr>
           <w:rFonts w:ascii="Times New Roman" w:hAnsi="Times New Roman" w:eastAsia="Times New Roman" w:cs="Times New Roman"/>
-          <w:color w:val="000000" w:themeColor="text1"/>
+          <w:color w:val="000000" w:themeColor="text1" w:themeTint="FF" w:themeShade="FF"/>
           <w:sz w:val="24"/>
           <w:szCs w:val="24"/>
         </w:rPr>
@@ -895,27 +905,25 @@
       <w:r>
         <w:rPr>
           <w:rFonts w:ascii="Times New Roman" w:hAnsi="Times New Roman" w:eastAsia="Times New Roman" w:cs="Times New Roman"/>
-          <w:color w:val="000000" w:themeColor="text1"/>
+          <w:color w:val="000000" w:themeColor="text1" w:themeTint="FF" w:themeShade="FF"/>
           <w:sz w:val="24"/>
           <w:szCs w:val="24"/>
         </w:rPr>
         <w:t xml:space="preserve">Gabriel Arruda </w:t>
       </w:r>
-      <w:proofErr w:type="spellStart"/>
-      <w:r>
-        <w:rPr>
-          <w:rFonts w:ascii="Times New Roman" w:hAnsi="Times New Roman" w:eastAsia="Times New Roman" w:cs="Times New Roman"/>
-          <w:color w:val="000000" w:themeColor="text1"/>
+      <w:r>
+        <w:rPr>
+          <w:rFonts w:ascii="Times New Roman" w:hAnsi="Times New Roman" w:eastAsia="Times New Roman" w:cs="Times New Roman"/>
+          <w:color w:val="000000" w:themeColor="text1" w:themeTint="FF" w:themeShade="FF"/>
           <w:sz w:val="24"/>
           <w:szCs w:val="24"/>
         </w:rPr>
         <w:t>Caricchio</w:t>
       </w:r>
-      <w:proofErr w:type="spellEnd"/>
-      <w:r>
-        <w:rPr>
-          <w:rFonts w:ascii="Times New Roman" w:hAnsi="Times New Roman" w:eastAsia="Times New Roman" w:cs="Times New Roman"/>
-          <w:color w:val="000000" w:themeColor="text1"/>
+      <w:r>
+        <w:rPr>
+          <w:rFonts w:ascii="Times New Roman" w:hAnsi="Times New Roman" w:eastAsia="Times New Roman" w:cs="Times New Roman"/>
+          <w:color w:val="000000" w:themeColor="text1" w:themeTint="FF" w:themeShade="FF"/>
           <w:sz w:val="24"/>
           <w:szCs w:val="24"/>
         </w:rPr>
@@ -927,7 +935,7 @@
       <w:r>
         <w:rPr>
           <w:rFonts w:ascii="Times New Roman" w:hAnsi="Times New Roman" w:eastAsia="Times New Roman" w:cs="Times New Roman"/>
-          <w:color w:val="000000" w:themeColor="text1"/>
+          <w:color w:val="000000" w:themeColor="text1" w:themeTint="FF" w:themeShade="FF"/>
           <w:sz w:val="24"/>
           <w:szCs w:val="24"/>
         </w:rPr>
@@ -936,27 +944,25 @@
       <w:r>
         <w:rPr>
           <w:rFonts w:ascii="Times New Roman" w:hAnsi="Times New Roman" w:eastAsia="Times New Roman" w:cs="Times New Roman"/>
-          <w:color w:val="000000" w:themeColor="text1"/>
+          <w:color w:val="000000" w:themeColor="text1" w:themeTint="FF" w:themeShade="FF"/>
           <w:sz w:val="24"/>
           <w:szCs w:val="24"/>
         </w:rPr>
         <w:t xml:space="preserve"> de </w:t>
       </w:r>
-      <w:proofErr w:type="spellStart"/>
-      <w:r>
-        <w:rPr>
-          <w:rFonts w:ascii="Times New Roman" w:hAnsi="Times New Roman" w:eastAsia="Times New Roman" w:cs="Times New Roman"/>
-          <w:color w:val="000000" w:themeColor="text1"/>
+      <w:r>
+        <w:rPr>
+          <w:rFonts w:ascii="Times New Roman" w:hAnsi="Times New Roman" w:eastAsia="Times New Roman" w:cs="Times New Roman"/>
+          <w:color w:val="000000" w:themeColor="text1" w:themeTint="FF" w:themeShade="FF"/>
           <w:sz w:val="24"/>
           <w:szCs w:val="24"/>
         </w:rPr>
         <w:t>Araujo</w:t>
       </w:r>
-      <w:proofErr w:type="spellEnd"/>
-      <w:r>
-        <w:rPr>
-          <w:rFonts w:ascii="Times New Roman" w:hAnsi="Times New Roman" w:eastAsia="Times New Roman" w:cs="Times New Roman"/>
-          <w:color w:val="000000" w:themeColor="text1"/>
+      <w:r>
+        <w:rPr>
+          <w:rFonts w:ascii="Times New Roman" w:hAnsi="Times New Roman" w:eastAsia="Times New Roman" w:cs="Times New Roman"/>
+          <w:color w:val="000000" w:themeColor="text1" w:themeTint="FF" w:themeShade="FF"/>
           <w:sz w:val="24"/>
           <w:szCs w:val="24"/>
         </w:rPr>
@@ -968,7 +974,7 @@
       <w:r>
         <w:rPr>
           <w:rFonts w:ascii="Times New Roman" w:hAnsi="Times New Roman" w:eastAsia="Times New Roman" w:cs="Times New Roman"/>
-          <w:color w:val="000000" w:themeColor="text1"/>
+          <w:color w:val="000000" w:themeColor="text1" w:themeTint="FF" w:themeShade="FF"/>
           <w:sz w:val="24"/>
           <w:szCs w:val="24"/>
         </w:rPr>
@@ -980,11 +986,29 @@
       <w:r>
         <w:rPr>
           <w:rFonts w:ascii="Times New Roman" w:hAnsi="Times New Roman" w:eastAsia="Times New Roman" w:cs="Times New Roman"/>
-          <w:color w:val="000000" w:themeColor="text1"/>
-          <w:sz w:val="24"/>
-          <w:szCs w:val="24"/>
-        </w:rPr>
-        <w:t>Pedro Henrique José – (0180325)</w:t>
+          <w:color w:val="000000" w:themeColor="text1" w:themeTint="FF" w:themeShade="FF"/>
+          <w:sz w:val="24"/>
+          <w:szCs w:val="24"/>
+        </w:rPr>
+        <w:t>Pedro Henrique José – (0180325</w:t>
+      </w:r>
+      <w:r>
+        <w:rPr>
+          <w:rFonts w:ascii="Times New Roman" w:hAnsi="Times New Roman" w:eastAsia="Times New Roman" w:cs="Times New Roman"/>
+          <w:color w:val="000000" w:themeColor="text1" w:themeTint="FF" w:themeShade="FF"/>
+          <w:sz w:val="24"/>
+          <w:szCs w:val="24"/>
+        </w:rPr>
+        <w:t>2</w:t>
+      </w:r>
+      <w:r>
+        <w:rPr>
+          <w:rFonts w:ascii="Times New Roman" w:hAnsi="Times New Roman" w:eastAsia="Times New Roman" w:cs="Times New Roman"/>
+          <w:color w:val="000000" w:themeColor="text1" w:themeTint="FF" w:themeShade="FF"/>
+          <w:sz w:val="24"/>
+          <w:szCs w:val="24"/>
+        </w:rPr>
+        <w:t>)</w:t>
       </w:r>
     </w:p>
     <w:p>
@@ -997,21 +1021,19 @@
           <w:szCs w:val="24"/>
         </w:rPr>
       </w:pPr>
-      <w:proofErr w:type="spellStart"/>
-      <w:r>
-        <w:rPr>
-          <w:rFonts w:ascii="Times New Roman" w:hAnsi="Times New Roman" w:eastAsia="Times New Roman" w:cs="Times New Roman"/>
-          <w:color w:val="000000" w:themeColor="text1"/>
+      <w:r>
+        <w:rPr>
+          <w:rFonts w:ascii="Times New Roman" w:hAnsi="Times New Roman" w:eastAsia="Times New Roman" w:cs="Times New Roman"/>
+          <w:color w:val="000000" w:themeColor="text1" w:themeTint="FF" w:themeShade="FF"/>
           <w:sz w:val="24"/>
           <w:szCs w:val="24"/>
         </w:rPr>
         <w:t>Tarsílio</w:t>
       </w:r>
-      <w:proofErr w:type="spellEnd"/>
-      <w:r>
-        <w:rPr>
-          <w:rFonts w:ascii="Times New Roman" w:hAnsi="Times New Roman" w:eastAsia="Times New Roman" w:cs="Times New Roman"/>
-          <w:color w:val="000000" w:themeColor="text1"/>
+      <w:r>
+        <w:rPr>
+          <w:rFonts w:ascii="Times New Roman" w:hAnsi="Times New Roman" w:eastAsia="Times New Roman" w:cs="Times New Roman"/>
+          <w:color w:val="000000" w:themeColor="text1" w:themeTint="FF" w:themeShade="FF"/>
           <w:sz w:val="24"/>
           <w:szCs w:val="24"/>
         </w:rPr>
@@ -1020,7 +1042,7 @@
       <w:r>
         <w:rPr>
           <w:rFonts w:ascii="Times New Roman" w:hAnsi="Times New Roman" w:eastAsia="Times New Roman" w:cs="Times New Roman"/>
-          <w:color w:val="000000" w:themeColor="text1"/>
+          <w:color w:val="000000" w:themeColor="text1" w:themeTint="FF" w:themeShade="FF"/>
           <w:sz w:val="24"/>
           <w:szCs w:val="24"/>
         </w:rPr>
@@ -1029,7 +1051,16 @@
       <w:r>
         <w:rPr>
           <w:rFonts w:ascii="Times New Roman" w:hAnsi="Times New Roman" w:eastAsia="Times New Roman" w:cs="Times New Roman"/>
-          <w:color w:val="000000" w:themeColor="text1"/>
+          <w:color w:val="000000" w:themeColor="text1" w:themeTint="FF" w:themeShade="FF"/>
+          <w:sz w:val="24"/>
+          <w:szCs w:val="24"/>
+        </w:rPr>
+        <w:t xml:space="preserve"> </w:t>
+      </w:r>
+      <w:r>
+        <w:rPr>
+          <w:rFonts w:ascii="Times New Roman" w:hAnsi="Times New Roman" w:eastAsia="Times New Roman" w:cs="Times New Roman"/>
+          <w:color w:val="000000" w:themeColor="text1" w:themeTint="FF" w:themeShade="FF"/>
           <w:sz w:val="24"/>
           <w:szCs w:val="24"/>
         </w:rPr>
@@ -1197,467 +1228,470 @@
       <w:r>
         <w:rPr>
           <w:rFonts w:ascii="Times New Roman" w:hAnsi="Times New Roman" w:eastAsia="Times New Roman" w:cs="Times New Roman"/>
+          <w:b w:val="1"/>
+          <w:bCs w:val="1"/>
+          <w:sz w:val="28"/>
+          <w:szCs w:val="28"/>
+        </w:rPr>
+        <w:t xml:space="preserve">Sistema de Apoio à Alfabetização Hospitalar Arquitetura de Software – </w:t>
+      </w:r>
+      <w:r>
+        <w:rPr>
+          <w:rFonts w:ascii="Times New Roman" w:hAnsi="Times New Roman" w:eastAsia="Times New Roman" w:cs="Times New Roman"/>
+          <w:b w:val="1"/>
+          <w:bCs w:val="1"/>
+          <w:sz w:val="28"/>
+          <w:szCs w:val="28"/>
+        </w:rPr>
+        <w:t>Relatório</w:t>
+      </w:r>
+      <w:r>
+        <w:rPr>
+          <w:rFonts w:ascii="Times New Roman" w:hAnsi="Times New Roman" w:eastAsia="Times New Roman" w:cs="Times New Roman"/>
+          <w:b w:val="1"/>
+          <w:bCs w:val="1"/>
+          <w:sz w:val="28"/>
+          <w:szCs w:val="28"/>
+        </w:rPr>
+        <w:t xml:space="preserve"> Completo </w:t>
+      </w:r>
+      <w:r>
+        <w:br/>
+      </w:r>
+      <w:r>
+        <w:br/>
+      </w:r>
+      <w:r>
+        <w:rPr>
+          <w:rFonts w:ascii="Times New Roman" w:hAnsi="Times New Roman" w:eastAsia="Times New Roman" w:cs="Times New Roman"/>
+          <w:b w:val="1"/>
+          <w:bCs w:val="1"/>
+          <w:color w:val="000000" w:themeColor="text1" w:themeTint="FF" w:themeShade="FF"/>
+          <w:sz w:val="24"/>
+          <w:szCs w:val="24"/>
+        </w:rPr>
+        <w:t>Contexto do Problema</w:t>
+      </w:r>
+    </w:p>
+    <w:p>
+      <w:pPr>
+        <w:spacing w:before="240" w:after="240" w:line="360" w:lineRule="auto"/>
+        <w:rPr>
+          <w:rFonts w:ascii="Times New Roman" w:hAnsi="Times New Roman" w:eastAsia="Times New Roman" w:cs="Times New Roman"/>
+          <w:color w:val="000000" w:themeColor="text1"/>
+          <w:sz w:val="24"/>
+          <w:szCs w:val="24"/>
+        </w:rPr>
+      </w:pPr>
+      <w:r>
+        <w:rPr>
+          <w:rFonts w:ascii="Times New Roman" w:hAnsi="Times New Roman" w:eastAsia="Times New Roman" w:cs="Times New Roman"/>
+          <w:color w:val="000000" w:themeColor="text1" w:themeTint="FF" w:themeShade="FF"/>
+          <w:sz w:val="24"/>
+          <w:szCs w:val="24"/>
+        </w:rPr>
+        <w:t>O internamento prolongado de crianças e adolescentes pode interromper trajetórias de aprendizagem. Nesse contexto, surge a necessidade de ferramentas tecnológicas que auxiliem professores hospitalares a manter o processo educacional ativo durante o período de internação. O Sistema de Apoio à Alfabetização Hospitalar tem como objetivo permitir a criação de atividades educacionais personalizadas utilizando tecnologia humanizada e apoio de inteligência artificial, respeitando o ritmo individual e o estado emocional do aluno.</w:t>
+      </w:r>
+      <w:r>
+        <w:br/>
+      </w:r>
+      <w:r>
+        <w:br/>
+      </w:r>
+      <w:r>
+        <w:rPr>
+          <w:rFonts w:ascii="Times New Roman" w:hAnsi="Times New Roman" w:eastAsia="Times New Roman" w:cs="Times New Roman"/>
+          <w:b w:val="1"/>
+          <w:bCs w:val="1"/>
+          <w:color w:val="000000" w:themeColor="text1" w:themeTint="FF" w:themeShade="FF"/>
+          <w:sz w:val="24"/>
+          <w:szCs w:val="24"/>
+        </w:rPr>
+        <w:t xml:space="preserve">Arquitetura em </w:t>
+      </w:r>
+      <w:r>
+        <w:rPr>
+          <w:rFonts w:ascii="Times New Roman" w:hAnsi="Times New Roman" w:eastAsia="Times New Roman" w:cs="Times New Roman"/>
+          <w:b w:val="1"/>
+          <w:bCs w:val="1"/>
+          <w:color w:val="000000" w:themeColor="text1" w:themeTint="FF" w:themeShade="FF"/>
+          <w:sz w:val="24"/>
+          <w:szCs w:val="24"/>
+        </w:rPr>
+        <w:t>Hexagonal</w:t>
+      </w:r>
+    </w:p>
+    <w:p>
+      <w:pPr>
+        <w:spacing w:before="240" w:after="240" w:line="360" w:lineRule="auto"/>
+        <w:rPr>
+          <w:rFonts w:ascii="Times New Roman" w:hAnsi="Times New Roman" w:eastAsia="Times New Roman" w:cs="Times New Roman"/>
+          <w:color w:val="000000" w:themeColor="text1"/>
+          <w:sz w:val="24"/>
+          <w:szCs w:val="24"/>
+        </w:rPr>
+      </w:pPr>
+      <w:r>
+        <w:rPr>
+          <w:rFonts w:ascii="Times New Roman" w:hAnsi="Times New Roman" w:eastAsia="Times New Roman" w:cs="Times New Roman"/>
+          <w:color w:val="000000" w:themeColor="text1"/>
+          <w:sz w:val="24"/>
+          <w:szCs w:val="24"/>
+        </w:rPr>
+        <w:t>A arquitetura hexagonal, ou de "portas e adaptadores", divide o software em camadas isoladas para proteger a regra de negócio central. O núcleo da aplicação fica no centro e não conhece detalhes externos, como bancos de dados ou interfaces de usuário. A comunicação com o mundo externo ocorre por meio de portas (interfaces) conectadas a adaptadores específicos. A principal vantagem é o desacoplamento total, que facilita testes automatizados sem dependências externas. Isso também permite trocar tecnologias (como mudar de banco de dados) sem alterar uma única linha da lógica de negócios.</w:t>
+      </w:r>
+    </w:p>
+    <w:p>
+      <w:pPr>
+        <w:spacing w:before="240" w:after="240" w:line="360" w:lineRule="auto"/>
+        <w:rPr>
+          <w:rFonts w:ascii="Times New Roman" w:hAnsi="Times New Roman" w:eastAsia="Times New Roman" w:cs="Times New Roman"/>
+          <w:b/>
+          <w:bCs/>
+          <w:color w:val="000000" w:themeColor="text1"/>
+          <w:sz w:val="24"/>
+          <w:szCs w:val="24"/>
+        </w:rPr>
+      </w:pPr>
+      <w:r>
+        <w:rPr>
+          <w:rFonts w:ascii="Times New Roman" w:hAnsi="Times New Roman" w:eastAsia="Times New Roman" w:cs="Times New Roman"/>
+          <w:b/>
+          <w:bCs/>
+          <w:color w:val="000000" w:themeColor="text1"/>
+          <w:sz w:val="24"/>
+          <w:szCs w:val="24"/>
+        </w:rPr>
+        <w:t>Vantagens</w:t>
+      </w:r>
+    </w:p>
+    <w:p>
+      <w:pPr>
+        <w:spacing w:before="240" w:after="240" w:line="360" w:lineRule="auto"/>
+        <w:rPr>
+          <w:rFonts w:ascii="Times New Roman" w:hAnsi="Times New Roman" w:eastAsia="Times New Roman" w:cs="Times New Roman"/>
+          <w:color w:val="000000" w:themeColor="text1"/>
+          <w:sz w:val="24"/>
+          <w:szCs w:val="24"/>
+        </w:rPr>
+      </w:pPr>
+      <w:r>
+        <w:rPr>
+          <w:rFonts w:ascii="Times New Roman" w:hAnsi="Times New Roman" w:eastAsia="Times New Roman" w:cs="Times New Roman"/>
+          <w:color w:val="000000" w:themeColor="text1" w:themeTint="FF" w:themeShade="FF"/>
+          <w:sz w:val="24"/>
+          <w:szCs w:val="24"/>
+        </w:rPr>
+        <w:t>Manutenibilidade</w:t>
+      </w:r>
+      <w:r>
+        <w:rPr>
+          <w:rFonts w:ascii="Times New Roman" w:hAnsi="Times New Roman" w:eastAsia="Times New Roman" w:cs="Times New Roman"/>
+          <w:color w:val="000000" w:themeColor="text1" w:themeTint="FF" w:themeShade="FF"/>
+          <w:sz w:val="24"/>
+          <w:szCs w:val="24"/>
+        </w:rPr>
+        <w:t xml:space="preserve"> -</w:t>
+      </w:r>
+      <w:r>
+        <w:rPr>
+          <w:rFonts w:ascii="Times New Roman" w:hAnsi="Times New Roman" w:eastAsia="Times New Roman" w:cs="Times New Roman"/>
+          <w:color w:val="000000" w:themeColor="text1" w:themeTint="FF" w:themeShade="FF"/>
+          <w:sz w:val="24"/>
+          <w:szCs w:val="24"/>
+        </w:rPr>
+        <w:t xml:space="preserve"> É o maior trunfo. Com</w:t>
+      </w:r>
+      <w:r>
+        <w:rPr>
+          <w:rFonts w:ascii="Times New Roman" w:hAnsi="Times New Roman" w:eastAsia="Times New Roman" w:cs="Times New Roman"/>
+          <w:color w:val="000000" w:themeColor="text1" w:themeTint="FF" w:themeShade="FF"/>
+          <w:sz w:val="24"/>
+          <w:szCs w:val="24"/>
+        </w:rPr>
+        <w:t>o</w:t>
+      </w:r>
+      <w:r>
+        <w:rPr>
+          <w:rFonts w:ascii="Times New Roman" w:hAnsi="Times New Roman" w:eastAsia="Times New Roman" w:cs="Times New Roman"/>
+          <w:color w:val="000000" w:themeColor="text1" w:themeTint="FF" w:themeShade="FF"/>
+          <w:sz w:val="24"/>
+          <w:szCs w:val="24"/>
+        </w:rPr>
+        <w:t xml:space="preserve"> as responsabilidades estão separadas, </w:t>
+      </w:r>
+      <w:r>
+        <w:rPr>
+          <w:rFonts w:ascii="Times New Roman" w:hAnsi="Times New Roman" w:eastAsia="Times New Roman" w:cs="Times New Roman"/>
+          <w:color w:val="000000" w:themeColor="text1" w:themeTint="FF" w:themeShade="FF"/>
+          <w:sz w:val="24"/>
+          <w:szCs w:val="24"/>
+        </w:rPr>
+        <w:t>por exemplo</w:t>
+      </w:r>
+      <w:r>
+        <w:rPr>
+          <w:rFonts w:ascii="Times New Roman" w:hAnsi="Times New Roman" w:eastAsia="Times New Roman" w:cs="Times New Roman"/>
+          <w:color w:val="000000" w:themeColor="text1" w:themeTint="FF" w:themeShade="FF"/>
+          <w:sz w:val="24"/>
+          <w:szCs w:val="24"/>
+        </w:rPr>
+        <w:t>,</w:t>
+      </w:r>
+      <w:r>
+        <w:rPr>
+          <w:rFonts w:ascii="Times New Roman" w:hAnsi="Times New Roman" w:eastAsia="Times New Roman" w:cs="Times New Roman"/>
+          <w:color w:val="000000" w:themeColor="text1" w:themeTint="FF" w:themeShade="FF"/>
+          <w:sz w:val="24"/>
+          <w:szCs w:val="24"/>
+        </w:rPr>
+        <w:t xml:space="preserve"> em um sistema de finanças </w:t>
+      </w:r>
+      <w:r>
+        <w:rPr>
+          <w:rFonts w:ascii="Times New Roman" w:hAnsi="Times New Roman" w:eastAsia="Times New Roman" w:cs="Times New Roman"/>
+          <w:color w:val="000000" w:themeColor="text1" w:themeTint="FF" w:themeShade="FF"/>
+          <w:sz w:val="24"/>
+          <w:szCs w:val="24"/>
+        </w:rPr>
+        <w:t xml:space="preserve">se houver um erro no cálculo de imposto, você vai direto na Camada de Negócio. Você não precisa caçar o erro em 50 arquivos diferentes. </w:t>
+      </w:r>
+    </w:p>
+    <w:p>
+      <w:pPr>
+        <w:spacing w:before="240" w:after="240" w:line="360" w:lineRule="auto"/>
+        <w:rPr>
+          <w:rFonts w:ascii="Times New Roman" w:hAnsi="Times New Roman" w:eastAsia="Times New Roman" w:cs="Times New Roman"/>
+          <w:color w:val="000000" w:themeColor="text1"/>
+          <w:sz w:val="24"/>
+          <w:szCs w:val="24"/>
+        </w:rPr>
+      </w:pPr>
+      <w:r>
+        <w:rPr>
+          <w:rFonts w:ascii="Times New Roman" w:hAnsi="Times New Roman" w:eastAsia="Times New Roman" w:cs="Times New Roman"/>
+          <w:color w:val="000000" w:themeColor="text1"/>
+          <w:sz w:val="24"/>
+          <w:szCs w:val="24"/>
+        </w:rPr>
+        <w:t>Independência de Tecnologia</w:t>
+      </w:r>
+      <w:r>
+        <w:rPr>
+          <w:rFonts w:ascii="Times New Roman" w:hAnsi="Times New Roman" w:eastAsia="Times New Roman" w:cs="Times New Roman"/>
+          <w:color w:val="000000" w:themeColor="text1"/>
+          <w:sz w:val="24"/>
+          <w:szCs w:val="24"/>
+        </w:rPr>
+        <w:t xml:space="preserve"> </w:t>
+      </w:r>
+      <w:r>
+        <w:rPr>
+          <w:rFonts w:ascii="Times New Roman" w:hAnsi="Times New Roman" w:eastAsia="Times New Roman" w:cs="Times New Roman"/>
+          <w:color w:val="000000" w:themeColor="text1"/>
+          <w:sz w:val="24"/>
+          <w:szCs w:val="24"/>
+        </w:rPr>
+        <w:t xml:space="preserve">- </w:t>
+      </w:r>
+      <w:r>
+        <w:rPr>
+          <w:rFonts w:ascii="Times New Roman" w:hAnsi="Times New Roman" w:eastAsia="Times New Roman" w:cs="Times New Roman"/>
+          <w:color w:val="000000" w:themeColor="text1"/>
+          <w:sz w:val="24"/>
+          <w:szCs w:val="24"/>
+        </w:rPr>
+        <w:t xml:space="preserve">Você pode trocar a interface (mudar de um site para um app mobile) ou o banco de dados sem precisar reescrever a lógica principal do sistema. </w:t>
+      </w:r>
+    </w:p>
+    <w:p>
+      <w:pPr>
+        <w:spacing w:before="240" w:after="240" w:line="360" w:lineRule="auto"/>
+        <w:rPr>
+          <w:rFonts w:ascii="Times New Roman" w:hAnsi="Times New Roman" w:eastAsia="Times New Roman" w:cs="Times New Roman"/>
+          <w:color w:val="000000" w:themeColor="text1"/>
+          <w:sz w:val="24"/>
+          <w:szCs w:val="24"/>
+        </w:rPr>
+      </w:pPr>
+      <w:r>
+        <w:rPr>
+          <w:rFonts w:ascii="Times New Roman" w:hAnsi="Times New Roman" w:eastAsia="Times New Roman" w:cs="Times New Roman"/>
+          <w:color w:val="000000" w:themeColor="text1"/>
+          <w:sz w:val="24"/>
+          <w:szCs w:val="24"/>
+        </w:rPr>
+        <w:t>Paralelismo no Desenvolvimento</w:t>
+      </w:r>
+      <w:r>
+        <w:rPr>
+          <w:rFonts w:ascii="Times New Roman" w:hAnsi="Times New Roman" w:eastAsia="Times New Roman" w:cs="Times New Roman"/>
+          <w:color w:val="000000" w:themeColor="text1"/>
+          <w:sz w:val="24"/>
+          <w:szCs w:val="24"/>
+        </w:rPr>
+        <w:t xml:space="preserve"> </w:t>
+      </w:r>
+      <w:r>
+        <w:rPr>
+          <w:rFonts w:ascii="Times New Roman" w:hAnsi="Times New Roman" w:eastAsia="Times New Roman" w:cs="Times New Roman"/>
+          <w:color w:val="000000" w:themeColor="text1"/>
+          <w:sz w:val="24"/>
+          <w:szCs w:val="24"/>
+        </w:rPr>
+        <w:t>-</w:t>
+      </w:r>
+      <w:r>
+        <w:rPr>
+          <w:rFonts w:ascii="Times New Roman" w:hAnsi="Times New Roman" w:eastAsia="Times New Roman" w:cs="Times New Roman"/>
+          <w:color w:val="000000" w:themeColor="text1"/>
+          <w:sz w:val="24"/>
+          <w:szCs w:val="24"/>
+        </w:rPr>
+        <w:t xml:space="preserve"> Um desenvolvedor pode focar em criar as telas (Front-</w:t>
+      </w:r>
+      <w:proofErr w:type="spellStart"/>
+      <w:r>
+        <w:rPr>
+          <w:rFonts w:ascii="Times New Roman" w:hAnsi="Times New Roman" w:eastAsia="Times New Roman" w:cs="Times New Roman"/>
+          <w:color w:val="000000" w:themeColor="text1"/>
+          <w:sz w:val="24"/>
+          <w:szCs w:val="24"/>
+        </w:rPr>
+        <w:t>end</w:t>
+      </w:r>
+      <w:proofErr w:type="spellEnd"/>
+      <w:r>
+        <w:rPr>
+          <w:rFonts w:ascii="Times New Roman" w:hAnsi="Times New Roman" w:eastAsia="Times New Roman" w:cs="Times New Roman"/>
+          <w:color w:val="000000" w:themeColor="text1"/>
+          <w:sz w:val="24"/>
+          <w:szCs w:val="24"/>
+        </w:rPr>
+        <w:t>) enquanto outro trabalha nas regras de negócio (Back-</w:t>
+      </w:r>
+      <w:proofErr w:type="spellStart"/>
+      <w:r>
+        <w:rPr>
+          <w:rFonts w:ascii="Times New Roman" w:hAnsi="Times New Roman" w:eastAsia="Times New Roman" w:cs="Times New Roman"/>
+          <w:color w:val="000000" w:themeColor="text1"/>
+          <w:sz w:val="24"/>
+          <w:szCs w:val="24"/>
+        </w:rPr>
+        <w:t>end</w:t>
+      </w:r>
+      <w:proofErr w:type="spellEnd"/>
+      <w:r>
+        <w:rPr>
+          <w:rFonts w:ascii="Times New Roman" w:hAnsi="Times New Roman" w:eastAsia="Times New Roman" w:cs="Times New Roman"/>
+          <w:color w:val="000000" w:themeColor="text1"/>
+          <w:sz w:val="24"/>
+          <w:szCs w:val="24"/>
+        </w:rPr>
+        <w:t xml:space="preserve">), desde que as interfaces entre as camadas estejam definidas. </w:t>
+      </w:r>
+    </w:p>
+    <w:p>
+      <w:pPr>
+        <w:spacing w:before="240" w:after="240" w:line="360" w:lineRule="auto"/>
+        <w:rPr>
+          <w:rFonts w:ascii="Times New Roman" w:hAnsi="Times New Roman" w:eastAsia="Times New Roman" w:cs="Times New Roman"/>
+          <w:color w:val="000000" w:themeColor="text1"/>
+          <w:sz w:val="24"/>
+          <w:szCs w:val="24"/>
+        </w:rPr>
+      </w:pPr>
+      <w:proofErr w:type="spellStart"/>
+      <w:r>
+        <w:rPr>
+          <w:rFonts w:ascii="Times New Roman" w:hAnsi="Times New Roman" w:eastAsia="Times New Roman" w:cs="Times New Roman"/>
+          <w:color w:val="000000" w:themeColor="text1"/>
+          <w:sz w:val="24"/>
+          <w:szCs w:val="24"/>
+        </w:rPr>
+        <w:t>Testabilidade</w:t>
+      </w:r>
+      <w:proofErr w:type="spellEnd"/>
+      <w:r>
+        <w:rPr>
+          <w:rFonts w:ascii="Times New Roman" w:hAnsi="Times New Roman" w:eastAsia="Times New Roman" w:cs="Times New Roman"/>
+          <w:color w:val="000000" w:themeColor="text1"/>
+          <w:sz w:val="24"/>
+          <w:szCs w:val="24"/>
+        </w:rPr>
+        <w:t xml:space="preserve"> </w:t>
+      </w:r>
+      <w:r>
+        <w:rPr>
+          <w:rFonts w:ascii="Times New Roman" w:hAnsi="Times New Roman" w:eastAsia="Times New Roman" w:cs="Times New Roman"/>
+          <w:color w:val="000000" w:themeColor="text1"/>
+          <w:sz w:val="24"/>
+          <w:szCs w:val="24"/>
+        </w:rPr>
+        <w:t>- Como</w:t>
+      </w:r>
+      <w:r>
+        <w:rPr>
+          <w:rFonts w:ascii="Times New Roman" w:hAnsi="Times New Roman" w:eastAsia="Times New Roman" w:cs="Times New Roman"/>
+          <w:color w:val="000000" w:themeColor="text1"/>
+          <w:sz w:val="24"/>
+          <w:szCs w:val="24"/>
+        </w:rPr>
+        <w:t xml:space="preserve"> as camadas são isoladas, você pode criar testes unitários para a lógica de negócio sem precisar que o banco de dados esteja ligado ou que a tela esteja pronta.</w:t>
+      </w:r>
+    </w:p>
+    <w:p>
+      <w:pPr>
+        <w:spacing w:after="0" w:line="360" w:lineRule="auto"/>
+        <w:rPr>
+          <w:rFonts w:ascii="Times New Roman" w:hAnsi="Times New Roman" w:eastAsia="Times New Roman" w:cs="Times New Roman"/>
           <w:b/>
           <w:bCs/>
           <w:sz w:val="28"/>
           <w:szCs w:val="28"/>
         </w:rPr>
-        <w:t xml:space="preserve">Sistema de Apoio à Alfabetização Hospitalar Arquitetura de Software – </w:t>
-      </w:r>
-      <w:r>
-        <w:rPr>
-          <w:rFonts w:ascii="Times New Roman" w:hAnsi="Times New Roman" w:eastAsia="Times New Roman" w:cs="Times New Roman"/>
-          <w:b/>
-          <w:bCs/>
-          <w:sz w:val="28"/>
-          <w:szCs w:val="28"/>
-        </w:rPr>
-        <w:t>Relatório</w:t>
-      </w:r>
-      <w:r>
-        <w:rPr>
-          <w:rFonts w:ascii="Times New Roman" w:hAnsi="Times New Roman" w:eastAsia="Times New Roman" w:cs="Times New Roman"/>
-          <w:b/>
-          <w:bCs/>
-          <w:sz w:val="28"/>
-          <w:szCs w:val="28"/>
-        </w:rPr>
-        <w:t xml:space="preserve"> Completo </w:t>
-      </w:r>
-      <w:r>
-        <w:br/>
-      </w:r>
-      <w:r>
-        <w:br/>
-      </w:r>
-      <w:r>
-        <w:rPr>
-          <w:rFonts w:ascii="Times New Roman" w:hAnsi="Times New Roman" w:eastAsia="Times New Roman" w:cs="Times New Roman"/>
-          <w:b/>
-          <w:bCs/>
-          <w:color w:val="000000" w:themeColor="text1"/>
-          <w:sz w:val="24"/>
-          <w:szCs w:val="24"/>
-        </w:rPr>
-        <w:t>1. Contexto do Problema</w:t>
-      </w:r>
-    </w:p>
-    <w:p>
-      <w:pPr>
-        <w:spacing w:before="240" w:after="240" w:line="360" w:lineRule="auto"/>
-        <w:rPr>
-          <w:rFonts w:ascii="Times New Roman" w:hAnsi="Times New Roman" w:eastAsia="Times New Roman" w:cs="Times New Roman"/>
-          <w:color w:val="000000" w:themeColor="text1"/>
-          <w:sz w:val="24"/>
-          <w:szCs w:val="24"/>
-        </w:rPr>
-      </w:pPr>
-      <w:r>
-        <w:rPr>
-          <w:rFonts w:ascii="Times New Roman" w:hAnsi="Times New Roman" w:eastAsia="Times New Roman" w:cs="Times New Roman"/>
-          <w:color w:val="000000" w:themeColor="text1"/>
-          <w:sz w:val="24"/>
-          <w:szCs w:val="24"/>
-        </w:rPr>
-        <w:t>O internamento prolongado de crianças e adolescentes pode interromper trajetórias de aprendizagem. Nesse contexto, surge a necessidade de ferramentas tecnológicas que auxiliem professores hospitalares a manter o processo educacional ativo durante o período de internação. O Sistema de Apoio à Alfabetização Hospitalar tem como objetivo permitir a criação de atividades educacionais personalizadas utilizando tecnologia humanizada e apoio de inteligência artificial, respeitando o ritmo individual e o estado emocional do aluno.</w:t>
-      </w:r>
-      <w:r>
-        <w:br/>
-      </w:r>
-      <w:r>
-        <w:br/>
-      </w:r>
-      <w:r>
-        <w:rPr>
-          <w:rFonts w:ascii="Times New Roman" w:hAnsi="Times New Roman" w:eastAsia="Times New Roman" w:cs="Times New Roman"/>
-          <w:b/>
-          <w:bCs/>
-          <w:color w:val="000000" w:themeColor="text1"/>
-          <w:sz w:val="24"/>
-          <w:szCs w:val="24"/>
-        </w:rPr>
-        <w:t xml:space="preserve">2. Arquitetura em </w:t>
-      </w:r>
-      <w:r>
-        <w:rPr>
-          <w:rFonts w:ascii="Times New Roman" w:hAnsi="Times New Roman" w:eastAsia="Times New Roman" w:cs="Times New Roman"/>
-          <w:b/>
-          <w:bCs/>
-          <w:color w:val="000000" w:themeColor="text1"/>
-          <w:sz w:val="24"/>
-          <w:szCs w:val="24"/>
-        </w:rPr>
-        <w:t>Hexagonal</w:t>
-      </w:r>
-    </w:p>
-    <w:p>
-      <w:pPr>
-        <w:spacing w:before="240" w:after="240" w:line="360" w:lineRule="auto"/>
-        <w:rPr>
-          <w:rFonts w:ascii="Times New Roman" w:hAnsi="Times New Roman" w:eastAsia="Times New Roman" w:cs="Times New Roman"/>
-          <w:color w:val="000000" w:themeColor="text1"/>
-          <w:sz w:val="24"/>
-          <w:szCs w:val="24"/>
-        </w:rPr>
-      </w:pPr>
-      <w:r>
-        <w:rPr>
-          <w:rFonts w:ascii="Times New Roman" w:hAnsi="Times New Roman" w:eastAsia="Times New Roman" w:cs="Times New Roman"/>
-          <w:color w:val="000000" w:themeColor="text1"/>
-          <w:sz w:val="24"/>
-          <w:szCs w:val="24"/>
-        </w:rPr>
-        <w:t>A arquitetura hexagonal, ou de "portas e adaptadores", divide o software em camadas isoladas para proteger a regra de negócio central. O núcleo da aplicação fica no centro e não conhece detalhes externos, como bancos de dados ou interfaces de usuário. A comunicação com o mundo externo ocorre por meio de portas (interfaces) conectadas a adaptadores específicos. A principal vantagem é o desacoplamento total, que facilita testes automatizados sem dependências externas. Isso também permite trocar tecnologias (como mudar de banco de dados) sem alterar uma única linha da lógica de negócios.</w:t>
-      </w:r>
-    </w:p>
-    <w:p>
-      <w:pPr>
-        <w:spacing w:before="240" w:after="240" w:line="360" w:lineRule="auto"/>
-        <w:rPr>
-          <w:rFonts w:ascii="Times New Roman" w:hAnsi="Times New Roman" w:eastAsia="Times New Roman" w:cs="Times New Roman"/>
-          <w:b/>
-          <w:bCs/>
-          <w:color w:val="000000" w:themeColor="text1"/>
-          <w:sz w:val="24"/>
-          <w:szCs w:val="24"/>
-        </w:rPr>
-      </w:pPr>
-      <w:r>
-        <w:rPr>
-          <w:rFonts w:ascii="Times New Roman" w:hAnsi="Times New Roman" w:eastAsia="Times New Roman" w:cs="Times New Roman"/>
-          <w:b/>
-          <w:bCs/>
-          <w:color w:val="000000" w:themeColor="text1"/>
-          <w:sz w:val="24"/>
-          <w:szCs w:val="24"/>
-        </w:rPr>
-        <w:t>Vantagens</w:t>
-      </w:r>
-    </w:p>
-    <w:p>
-      <w:pPr>
-        <w:spacing w:before="240" w:after="240" w:line="360" w:lineRule="auto"/>
-        <w:rPr>
-          <w:rFonts w:ascii="Times New Roman" w:hAnsi="Times New Roman" w:eastAsia="Times New Roman" w:cs="Times New Roman"/>
-          <w:color w:val="000000" w:themeColor="text1"/>
-          <w:sz w:val="24"/>
-          <w:szCs w:val="24"/>
-        </w:rPr>
-      </w:pPr>
-      <w:r>
-        <w:rPr>
-          <w:rFonts w:ascii="Times New Roman" w:hAnsi="Times New Roman" w:eastAsia="Times New Roman" w:cs="Times New Roman"/>
-          <w:color w:val="000000" w:themeColor="text1"/>
-          <w:sz w:val="24"/>
-          <w:szCs w:val="24"/>
-        </w:rPr>
-        <w:t>Manutenibilidade</w:t>
-      </w:r>
-      <w:r>
-        <w:rPr>
-          <w:rFonts w:ascii="Times New Roman" w:hAnsi="Times New Roman" w:eastAsia="Times New Roman" w:cs="Times New Roman"/>
-          <w:color w:val="000000" w:themeColor="text1"/>
-          <w:sz w:val="24"/>
-          <w:szCs w:val="24"/>
-        </w:rPr>
-        <w:t xml:space="preserve"> -</w:t>
-      </w:r>
-      <w:r>
-        <w:rPr>
-          <w:rFonts w:ascii="Times New Roman" w:hAnsi="Times New Roman" w:eastAsia="Times New Roman" w:cs="Times New Roman"/>
-          <w:color w:val="000000" w:themeColor="text1"/>
-          <w:sz w:val="24"/>
-          <w:szCs w:val="24"/>
-        </w:rPr>
-        <w:t xml:space="preserve"> É o maior trunfo. Com</w:t>
-      </w:r>
-      <w:r>
-        <w:rPr>
-          <w:rFonts w:ascii="Times New Roman" w:hAnsi="Times New Roman" w:eastAsia="Times New Roman" w:cs="Times New Roman"/>
-          <w:b/>
-          <w:bCs/>
-          <w:color w:val="000000" w:themeColor="text1"/>
-          <w:sz w:val="24"/>
-          <w:szCs w:val="24"/>
-        </w:rPr>
-        <w:t xml:space="preserve"> </w:t>
-      </w:r>
-      <w:r>
-        <w:rPr>
-          <w:rFonts w:ascii="Times New Roman" w:hAnsi="Times New Roman" w:eastAsia="Times New Roman" w:cs="Times New Roman"/>
-          <w:color w:val="000000" w:themeColor="text1"/>
-          <w:sz w:val="24"/>
-          <w:szCs w:val="24"/>
-        </w:rPr>
-        <w:t xml:space="preserve">o as responsabilidades estão separadas, </w:t>
-      </w:r>
-      <w:r>
-        <w:rPr>
-          <w:rFonts w:ascii="Times New Roman" w:hAnsi="Times New Roman" w:eastAsia="Times New Roman" w:cs="Times New Roman"/>
-          <w:color w:val="000000" w:themeColor="text1"/>
-          <w:sz w:val="24"/>
-          <w:szCs w:val="24"/>
-        </w:rPr>
-        <w:t xml:space="preserve">por exemplo em um sistema de finanças </w:t>
-      </w:r>
-      <w:r>
-        <w:rPr>
-          <w:rFonts w:ascii="Times New Roman" w:hAnsi="Times New Roman" w:eastAsia="Times New Roman" w:cs="Times New Roman"/>
-          <w:color w:val="000000" w:themeColor="text1"/>
-          <w:sz w:val="24"/>
-          <w:szCs w:val="24"/>
-        </w:rPr>
-        <w:t xml:space="preserve">se houver um erro no cálculo de imposto, você vai direto na Camada de Negócio. Você não precisa caçar o erro em 50 arquivos diferentes. </w:t>
-      </w:r>
-    </w:p>
-    <w:p>
-      <w:pPr>
-        <w:spacing w:before="240" w:after="240" w:line="360" w:lineRule="auto"/>
-        <w:rPr>
-          <w:rFonts w:ascii="Times New Roman" w:hAnsi="Times New Roman" w:eastAsia="Times New Roman" w:cs="Times New Roman"/>
-          <w:color w:val="000000" w:themeColor="text1"/>
-          <w:sz w:val="24"/>
-          <w:szCs w:val="24"/>
-        </w:rPr>
-      </w:pPr>
-      <w:r>
-        <w:rPr>
-          <w:rFonts w:ascii="Times New Roman" w:hAnsi="Times New Roman" w:eastAsia="Times New Roman" w:cs="Times New Roman"/>
-          <w:color w:val="000000" w:themeColor="text1"/>
-          <w:sz w:val="24"/>
-          <w:szCs w:val="24"/>
-        </w:rPr>
-        <w:t>Independência de Tecnologia</w:t>
-      </w:r>
-      <w:r>
-        <w:rPr>
-          <w:rFonts w:ascii="Times New Roman" w:hAnsi="Times New Roman" w:eastAsia="Times New Roman" w:cs="Times New Roman"/>
-          <w:color w:val="000000" w:themeColor="text1"/>
-          <w:sz w:val="24"/>
-          <w:szCs w:val="24"/>
-        </w:rPr>
-        <w:t xml:space="preserve"> </w:t>
-      </w:r>
-      <w:r>
-        <w:rPr>
-          <w:rFonts w:ascii="Times New Roman" w:hAnsi="Times New Roman" w:eastAsia="Times New Roman" w:cs="Times New Roman"/>
-          <w:color w:val="000000" w:themeColor="text1"/>
-          <w:sz w:val="24"/>
-          <w:szCs w:val="24"/>
-        </w:rPr>
-        <w:t xml:space="preserve">- </w:t>
-      </w:r>
-      <w:r>
-        <w:rPr>
-          <w:rFonts w:ascii="Times New Roman" w:hAnsi="Times New Roman" w:eastAsia="Times New Roman" w:cs="Times New Roman"/>
-          <w:color w:val="000000" w:themeColor="text1"/>
-          <w:sz w:val="24"/>
-          <w:szCs w:val="24"/>
-        </w:rPr>
-        <w:t xml:space="preserve">Você pode trocar a interface (mudar de um site para um app mobile) ou o banco de dados sem precisar reescrever a lógica principal do sistema. </w:t>
-      </w:r>
-    </w:p>
-    <w:p>
-      <w:pPr>
-        <w:spacing w:before="240" w:after="240" w:line="360" w:lineRule="auto"/>
-        <w:rPr>
-          <w:rFonts w:ascii="Times New Roman" w:hAnsi="Times New Roman" w:eastAsia="Times New Roman" w:cs="Times New Roman"/>
-          <w:color w:val="000000" w:themeColor="text1"/>
-          <w:sz w:val="24"/>
-          <w:szCs w:val="24"/>
-        </w:rPr>
-      </w:pPr>
-      <w:r>
-        <w:rPr>
-          <w:rFonts w:ascii="Times New Roman" w:hAnsi="Times New Roman" w:eastAsia="Times New Roman" w:cs="Times New Roman"/>
-          <w:color w:val="000000" w:themeColor="text1"/>
-          <w:sz w:val="24"/>
-          <w:szCs w:val="24"/>
-        </w:rPr>
-        <w:t>Paralelismo no Desenvolvimento</w:t>
-      </w:r>
-      <w:r>
-        <w:rPr>
-          <w:rFonts w:ascii="Times New Roman" w:hAnsi="Times New Roman" w:eastAsia="Times New Roman" w:cs="Times New Roman"/>
-          <w:color w:val="000000" w:themeColor="text1"/>
-          <w:sz w:val="24"/>
-          <w:szCs w:val="24"/>
-        </w:rPr>
-        <w:t xml:space="preserve"> </w:t>
-      </w:r>
-      <w:r>
-        <w:rPr>
-          <w:rFonts w:ascii="Times New Roman" w:hAnsi="Times New Roman" w:eastAsia="Times New Roman" w:cs="Times New Roman"/>
-          <w:color w:val="000000" w:themeColor="text1"/>
-          <w:sz w:val="24"/>
-          <w:szCs w:val="24"/>
-        </w:rPr>
-        <w:t>-</w:t>
-      </w:r>
-      <w:r>
-        <w:rPr>
-          <w:rFonts w:ascii="Times New Roman" w:hAnsi="Times New Roman" w:eastAsia="Times New Roman" w:cs="Times New Roman"/>
-          <w:color w:val="000000" w:themeColor="text1"/>
-          <w:sz w:val="24"/>
-          <w:szCs w:val="24"/>
-        </w:rPr>
-        <w:t xml:space="preserve"> Um desenvolvedor pode focar em criar as telas (Front-</w:t>
-      </w:r>
-      <w:proofErr w:type="spellStart"/>
-      <w:r>
-        <w:rPr>
-          <w:rFonts w:ascii="Times New Roman" w:hAnsi="Times New Roman" w:eastAsia="Times New Roman" w:cs="Times New Roman"/>
-          <w:color w:val="000000" w:themeColor="text1"/>
-          <w:sz w:val="24"/>
-          <w:szCs w:val="24"/>
-        </w:rPr>
-        <w:t>end</w:t>
-      </w:r>
-      <w:proofErr w:type="spellEnd"/>
-      <w:r>
-        <w:rPr>
-          <w:rFonts w:ascii="Times New Roman" w:hAnsi="Times New Roman" w:eastAsia="Times New Roman" w:cs="Times New Roman"/>
-          <w:color w:val="000000" w:themeColor="text1"/>
-          <w:sz w:val="24"/>
-          <w:szCs w:val="24"/>
-        </w:rPr>
-        <w:t>) enquanto outro trabalha nas regras de negócio (Back-</w:t>
-      </w:r>
-      <w:proofErr w:type="spellStart"/>
-      <w:r>
-        <w:rPr>
-          <w:rFonts w:ascii="Times New Roman" w:hAnsi="Times New Roman" w:eastAsia="Times New Roman" w:cs="Times New Roman"/>
-          <w:color w:val="000000" w:themeColor="text1"/>
-          <w:sz w:val="24"/>
-          <w:szCs w:val="24"/>
-        </w:rPr>
-        <w:t>end</w:t>
-      </w:r>
-      <w:proofErr w:type="spellEnd"/>
-      <w:r>
-        <w:rPr>
-          <w:rFonts w:ascii="Times New Roman" w:hAnsi="Times New Roman" w:eastAsia="Times New Roman" w:cs="Times New Roman"/>
-          <w:color w:val="000000" w:themeColor="text1"/>
-          <w:sz w:val="24"/>
-          <w:szCs w:val="24"/>
-        </w:rPr>
-        <w:t xml:space="preserve">), desde que as interfaces entre as camadas estejam definidas. </w:t>
-      </w:r>
-    </w:p>
-    <w:p>
-      <w:pPr>
-        <w:spacing w:before="240" w:after="240" w:line="360" w:lineRule="auto"/>
-        <w:rPr>
-          <w:rFonts w:ascii="Times New Roman" w:hAnsi="Times New Roman" w:eastAsia="Times New Roman" w:cs="Times New Roman"/>
-          <w:color w:val="000000" w:themeColor="text1"/>
-          <w:sz w:val="24"/>
-          <w:szCs w:val="24"/>
-        </w:rPr>
-      </w:pPr>
-      <w:proofErr w:type="spellStart"/>
-      <w:r>
-        <w:rPr>
-          <w:rFonts w:ascii="Times New Roman" w:hAnsi="Times New Roman" w:eastAsia="Times New Roman" w:cs="Times New Roman"/>
-          <w:color w:val="000000" w:themeColor="text1"/>
-          <w:sz w:val="24"/>
-          <w:szCs w:val="24"/>
-        </w:rPr>
-        <w:t>Testabilidade</w:t>
-      </w:r>
-      <w:proofErr w:type="spellEnd"/>
-      <w:r>
-        <w:rPr>
-          <w:rFonts w:ascii="Times New Roman" w:hAnsi="Times New Roman" w:eastAsia="Times New Roman" w:cs="Times New Roman"/>
-          <w:color w:val="000000" w:themeColor="text1"/>
-          <w:sz w:val="24"/>
-          <w:szCs w:val="24"/>
-        </w:rPr>
-        <w:t xml:space="preserve"> </w:t>
-      </w:r>
-      <w:r>
-        <w:rPr>
-          <w:rFonts w:ascii="Times New Roman" w:hAnsi="Times New Roman" w:eastAsia="Times New Roman" w:cs="Times New Roman"/>
-          <w:color w:val="000000" w:themeColor="text1"/>
-          <w:sz w:val="24"/>
-          <w:szCs w:val="24"/>
-        </w:rPr>
-        <w:t>- Como</w:t>
-      </w:r>
-      <w:r>
-        <w:rPr>
-          <w:rFonts w:ascii="Times New Roman" w:hAnsi="Times New Roman" w:eastAsia="Times New Roman" w:cs="Times New Roman"/>
-          <w:color w:val="000000" w:themeColor="text1"/>
-          <w:sz w:val="24"/>
-          <w:szCs w:val="24"/>
-        </w:rPr>
-        <w:t xml:space="preserve"> as camadas são isoladas, você pode criar testes unitários para a lógica de negócio sem precisar que o banco de dados esteja ligado ou que a tela esteja pronta.</w:t>
-      </w:r>
+      </w:pPr>
     </w:p>
     <w:p>
       <w:pPr>
         <w:spacing w:after="0" w:line="360" w:lineRule="auto"/>
-        <w:rPr>
-          <w:rFonts w:ascii="Times New Roman" w:hAnsi="Times New Roman" w:eastAsia="Times New Roman" w:cs="Times New Roman"/>
-          <w:b/>
-          <w:bCs/>
-          <w:sz w:val="28"/>
-          <w:szCs w:val="28"/>
-        </w:rPr>
-      </w:pPr>
+      </w:pPr>
+      <w:r>
+        <w:rPr>
+          <w:rFonts w:ascii="Times New Roman" w:hAnsi="Times New Roman" w:eastAsia="Times New Roman" w:cs="Times New Roman"/>
+          <w:b w:val="1"/>
+          <w:bCs w:val="1"/>
+          <w:sz w:val="24"/>
+          <w:szCs w:val="24"/>
+        </w:rPr>
+        <w:t>Diagrama Arquitetural</w:t>
+      </w:r>
     </w:p>
     <w:p>
       <w:pPr>
         <w:spacing w:after="0" w:line="360" w:lineRule="auto"/>
-      </w:pPr>
-      <w:r>
-        <w:rPr>
-          <w:rFonts w:ascii="Times New Roman" w:hAnsi="Times New Roman" w:cs="Times New Roman"/>
-          <w:b/>
-          <w:bCs/>
-          <w:sz w:val="24"/>
-          <w:szCs w:val="24"/>
-        </w:rPr>
-        <w:t>2.1</w:t>
-      </w:r>
-      <w:r>
-        <w:rPr>
-          <w:rFonts w:ascii="Times New Roman" w:hAnsi="Times New Roman" w:eastAsia="Times New Roman" w:cs="Times New Roman"/>
-          <w:b/>
-          <w:bCs/>
-          <w:sz w:val="24"/>
-          <w:szCs w:val="24"/>
-        </w:rPr>
-        <w:t xml:space="preserve"> Diagrama Arquitetural</w:t>
-      </w:r>
-    </w:p>
-    <w:p>
-      <w:pPr>
-        <w:spacing w:after="0" w:line="360" w:lineRule="auto"/>
-        <w:rPr>
-          <w:rFonts w:ascii="Times New Roman" w:hAnsi="Times New Roman" w:eastAsia="Times New Roman" w:cs="Times New Roman"/>
-        </w:rPr>
-      </w:pPr>
-      <w:r>
-        <w:rPr>
-          <w:noProof/>
-        </w:rPr>
+        <w:rPr>
+          <w:rFonts w:ascii="Times New Roman" w:hAnsi="Times New Roman" w:eastAsia="Times New Roman" w:cs="Times New Roman"/>
+        </w:rPr>
+      </w:pPr>
+      <w:r>
         <w:drawing>
-          <wp:inline distT="0" distB="0" distL="0" distR="0" wp14:anchorId="2EC86FDE" wp14:editId="28DF902B">
+          <wp:inline wp14:editId="4DC3218C" wp14:anchorId="2EC86FDE">
             <wp:extent cx="5972175" cy="3978160"/>
             <wp:effectExtent l="0" t="0" r="0" b="0"/>
             <wp:docPr id="198309795" name="drawing"/>
             <wp:cNvGraphicFramePr>
-              <a:graphicFrameLocks xmlns:a="http://schemas.openxmlformats.org/drawingml/2006/main" noChangeAspect="1"/>
+              <a:graphicFrameLocks noChangeAspect="1"/>
             </wp:cNvGraphicFramePr>
-            <a:graphic xmlns:a="http://schemas.openxmlformats.org/drawingml/2006/main">
-              <a:graphicData uri="http://schemas.openxmlformats.org/drawingml/2006/picture">
+            <a:graphic>
+              <a:graphicData xmlns:a="http://schemas.openxmlformats.org/drawingml/2006/main" uri="http://schemas.openxmlformats.org/drawingml/2006/picture">
                 <pic:pic xmlns:pic="http://schemas.openxmlformats.org/drawingml/2006/picture">
                   <pic:nvPicPr>
                     <pic:cNvPr id="198309795" name="Picture 198309795"/>
                     <pic:cNvPicPr/>
                   </pic:nvPicPr>
                   <pic:blipFill>
-                    <a:blip r:embed="rId11">
+                    <a:blip xmlns:r="http://schemas.openxmlformats.org/officeDocument/2006/relationships" r:embed="rId11">
                       <a:extLst>
                         <a:ext uri="{28A0092B-C50C-407E-A947-70E740481C1C}">
                           <a14:useLocalDpi xmlns:a14="http://schemas.microsoft.com/office/drawing/2010/main"/>
@@ -1686,22 +1720,12 @@
       <w:r>
         <w:rPr>
           <w:rFonts w:ascii="Times New Roman" w:hAnsi="Times New Roman" w:eastAsia="Times New Roman" w:cs="Times New Roman"/>
-          <w:b/>
-          <w:bCs/>
-          <w:sz w:val="24"/>
-          <w:szCs w:val="24"/>
-        </w:rPr>
-        <w:t>3.</w:t>
-      </w:r>
-      <w:r>
-        <w:rPr>
-          <w:rFonts w:ascii="Times New Roman" w:hAnsi="Times New Roman" w:eastAsia="Times New Roman" w:cs="Times New Roman"/>
-          <w:b/>
-          <w:bCs/>
-          <w:sz w:val="24"/>
-          <w:szCs w:val="24"/>
-        </w:rPr>
-        <w:t xml:space="preserve"> Design de Componentes</w:t>
+          <w:b w:val="1"/>
+          <w:bCs w:val="1"/>
+          <w:sz w:val="24"/>
+          <w:szCs w:val="24"/>
+        </w:rPr>
+        <w:t>Design de Componentes</w:t>
       </w:r>
       <w:r>
         <w:br/>
@@ -1717,28 +1741,26 @@
       <w:r>
         <w:rPr>
           <w:rFonts w:ascii="Times New Roman" w:hAnsi="Times New Roman" w:eastAsia="Times New Roman" w:cs="Times New Roman"/>
-          <w:b/>
-          <w:bCs/>
-          <w:sz w:val="24"/>
-          <w:szCs w:val="24"/>
-        </w:rPr>
-        <w:t xml:space="preserve">3.1 Camada </w:t>
-      </w:r>
-      <w:proofErr w:type="spellStart"/>
-      <w:r>
-        <w:rPr>
-          <w:rFonts w:ascii="Times New Roman" w:hAnsi="Times New Roman" w:eastAsia="Times New Roman" w:cs="Times New Roman"/>
-          <w:b/>
-          <w:bCs/>
+          <w:b w:val="1"/>
+          <w:bCs w:val="1"/>
+          <w:sz w:val="24"/>
+          <w:szCs w:val="24"/>
+        </w:rPr>
+        <w:t xml:space="preserve">Camada </w:t>
+      </w:r>
+      <w:r>
+        <w:rPr>
+          <w:rFonts w:ascii="Times New Roman" w:hAnsi="Times New Roman" w:eastAsia="Times New Roman" w:cs="Times New Roman"/>
+          <w:b w:val="1"/>
+          <w:bCs w:val="1"/>
         </w:rPr>
         <w:t>Adapter</w:t>
       </w:r>
-      <w:proofErr w:type="spellEnd"/>
-      <w:r>
-        <w:rPr>
-          <w:rFonts w:ascii="Times New Roman" w:hAnsi="Times New Roman" w:eastAsia="Times New Roman" w:cs="Times New Roman"/>
-          <w:b/>
-          <w:bCs/>
+      <w:r>
+        <w:rPr>
+          <w:rFonts w:ascii="Times New Roman" w:hAnsi="Times New Roman" w:eastAsia="Times New Roman" w:cs="Times New Roman"/>
+          <w:b w:val="1"/>
+          <w:bCs w:val="1"/>
         </w:rPr>
         <w:t xml:space="preserve"> (interfaces):</w:t>
       </w:r>
@@ -1979,6 +2001,12 @@
         <w:rPr>
           <w:rFonts w:ascii="Times New Roman" w:hAnsi="Times New Roman" w:eastAsia="Times New Roman" w:cs="Times New Roman"/>
         </w:rPr>
+        <w:t>s</w:t>
+      </w:r>
+      <w:r>
+        <w:rPr>
+          <w:rFonts w:ascii="Times New Roman" w:hAnsi="Times New Roman" w:eastAsia="Times New Roman" w:cs="Times New Roman"/>
+        </w:rPr>
         <w:t xml:space="preserve"> tecnologias </w:t>
       </w:r>
       <w:r>
@@ -1991,7 +2019,31 @@
         <w:rPr>
           <w:rFonts w:ascii="Times New Roman" w:hAnsi="Times New Roman" w:eastAsia="Times New Roman" w:cs="Times New Roman"/>
         </w:rPr>
-        <w:t>em vez de mexer em todo o código devido a uma tecnologia só será preciso ajustar o adaptador</w:t>
+        <w:t>em vez de mexer em todo o código devido a uma tecnologia</w:t>
+      </w:r>
+      <w:r>
+        <w:rPr>
+          <w:rFonts w:ascii="Times New Roman" w:hAnsi="Times New Roman" w:eastAsia="Times New Roman" w:cs="Times New Roman"/>
+        </w:rPr>
+        <w:t xml:space="preserve">, </w:t>
+      </w:r>
+      <w:r>
+        <w:rPr>
+          <w:rFonts w:ascii="Times New Roman" w:hAnsi="Times New Roman" w:eastAsia="Times New Roman" w:cs="Times New Roman"/>
+        </w:rPr>
+        <w:t xml:space="preserve">será preciso ajustar </w:t>
+      </w:r>
+      <w:r>
+        <w:rPr>
+          <w:rFonts w:ascii="Times New Roman" w:hAnsi="Times New Roman" w:eastAsia="Times New Roman" w:cs="Times New Roman"/>
+        </w:rPr>
+        <w:t xml:space="preserve">apenas </w:t>
+      </w:r>
+      <w:r>
+        <w:rPr>
+          <w:rFonts w:ascii="Times New Roman" w:hAnsi="Times New Roman" w:eastAsia="Times New Roman" w:cs="Times New Roman"/>
+        </w:rPr>
+        <w:t>o adaptador</w:t>
       </w:r>
       <w:r>
         <w:rPr>
@@ -2006,8 +2058,8 @@
         <w:spacing w:before="319" w:after="319" w:line="360" w:lineRule="auto"/>
         <w:rPr>
           <w:rFonts w:ascii="Times New Roman" w:hAnsi="Times New Roman" w:eastAsia="Times New Roman" w:cs="Times New Roman"/>
-          <w:b/>
-          <w:bCs/>
+          <w:b w:val="1"/>
+          <w:bCs w:val="1"/>
           <w:i w:val="0"/>
           <w:iCs w:val="0"/>
           <w:color w:val="auto"/>
@@ -2018,22 +2070,21 @@
       <w:r>
         <w:rPr>
           <w:rFonts w:ascii="Times New Roman" w:hAnsi="Times New Roman" w:eastAsia="Times New Roman" w:cs="Times New Roman"/>
-          <w:b/>
-          <w:bCs/>
+          <w:b w:val="1"/>
+          <w:bCs w:val="1"/>
           <w:i w:val="0"/>
           <w:iCs w:val="0"/>
           <w:color w:val="auto"/>
           <w:sz w:val="24"/>
           <w:szCs w:val="24"/>
         </w:rPr>
-        <w:t xml:space="preserve">3.2 Camada de </w:t>
-      </w:r>
-      <w:proofErr w:type="spellStart"/>
-      <w:r>
-        <w:rPr>
-          <w:rFonts w:ascii="Times New Roman" w:hAnsi="Times New Roman" w:eastAsia="Times New Roman" w:cs="Times New Roman"/>
-          <w:b/>
-          <w:bCs/>
+        <w:t xml:space="preserve">Camada de </w:t>
+      </w:r>
+      <w:r>
+        <w:rPr>
+          <w:rFonts w:ascii="Times New Roman" w:hAnsi="Times New Roman" w:eastAsia="Times New Roman" w:cs="Times New Roman"/>
+          <w:b w:val="1"/>
+          <w:bCs w:val="1"/>
           <w:i w:val="0"/>
           <w:iCs w:val="0"/>
           <w:color w:val="auto"/>
@@ -2042,12 +2093,11 @@
         </w:rPr>
         <w:t>Conection</w:t>
       </w:r>
-      <w:proofErr w:type="spellEnd"/>
-      <w:r>
-        <w:rPr>
-          <w:rFonts w:ascii="Times New Roman" w:hAnsi="Times New Roman" w:eastAsia="Times New Roman" w:cs="Times New Roman"/>
-          <w:b/>
-          <w:bCs/>
+      <w:r>
+        <w:rPr>
+          <w:rFonts w:ascii="Times New Roman" w:hAnsi="Times New Roman" w:eastAsia="Times New Roman" w:cs="Times New Roman"/>
+          <w:b w:val="1"/>
+          <w:bCs w:val="1"/>
           <w:i w:val="0"/>
           <w:iCs w:val="0"/>
           <w:color w:val="auto"/>
@@ -2059,8 +2109,8 @@
       <w:r>
         <w:rPr>
           <w:rFonts w:ascii="Times New Roman" w:hAnsi="Times New Roman" w:eastAsia="Times New Roman" w:cs="Times New Roman"/>
-          <w:b/>
-          <w:bCs/>
+          <w:b w:val="1"/>
+          <w:bCs w:val="1"/>
           <w:i w:val="0"/>
           <w:iCs w:val="0"/>
           <w:color w:val="auto"/>
@@ -2072,8 +2122,8 @@
       <w:r>
         <w:rPr>
           <w:rFonts w:ascii="Times New Roman" w:hAnsi="Times New Roman" w:eastAsia="Times New Roman" w:cs="Times New Roman"/>
-          <w:b/>
-          <w:bCs/>
+          <w:b w:val="1"/>
+          <w:bCs w:val="1"/>
           <w:i w:val="0"/>
           <w:iCs w:val="0"/>
           <w:color w:val="auto"/>
@@ -2085,8 +2135,8 @@
       <w:r>
         <w:rPr>
           <w:rFonts w:ascii="Times New Roman" w:hAnsi="Times New Roman" w:eastAsia="Times New Roman" w:cs="Times New Roman"/>
-          <w:b/>
-          <w:bCs/>
+          <w:b w:val="1"/>
+          <w:bCs w:val="1"/>
           <w:i w:val="0"/>
           <w:iCs w:val="0"/>
           <w:color w:val="auto"/>
@@ -2111,8 +2161,8 @@
       <w:r>
         <w:rPr>
           <w:rFonts w:ascii="Times New Roman" w:hAnsi="Times New Roman" w:eastAsia="Times New Roman" w:cs="Times New Roman"/>
-          <w:b/>
-          <w:bCs/>
+          <w:b w:val="1"/>
+          <w:bCs w:val="1"/>
         </w:rPr>
         <w:t>Responsabilidade:</w:t>
       </w:r>
@@ -2126,7 +2176,19 @@
         <w:rPr>
           <w:rFonts w:ascii="Times New Roman" w:hAnsi="Times New Roman" w:eastAsia="Times New Roman" w:cs="Times New Roman"/>
         </w:rPr>
-        <w:t>Fazer a implementação concreta do uso de recurso externos como banco de dados e API.</w:t>
+        <w:t>Fazer a implementação concreta do uso de recurso externos como banco</w:t>
+      </w:r>
+      <w:r>
+        <w:rPr>
+          <w:rFonts w:ascii="Times New Roman" w:hAnsi="Times New Roman" w:eastAsia="Times New Roman" w:cs="Times New Roman"/>
+        </w:rPr>
+        <w:t>s</w:t>
+      </w:r>
+      <w:r>
+        <w:rPr>
+          <w:rFonts w:ascii="Times New Roman" w:hAnsi="Times New Roman" w:eastAsia="Times New Roman" w:cs="Times New Roman"/>
+        </w:rPr>
+        <w:t xml:space="preserve"> de dados e API.</w:t>
       </w:r>
     </w:p>
     <w:p>
@@ -2251,34 +2313,24 @@
       <w:r>
         <w:rPr>
           <w:rFonts w:ascii="Times New Roman" w:hAnsi="Times New Roman" w:eastAsia="Times New Roman" w:cs="Times New Roman"/>
-          <w:b/>
-          <w:bCs/>
-          <w:sz w:val="24"/>
-          <w:szCs w:val="24"/>
-        </w:rPr>
-        <w:t xml:space="preserve">3.3 </w:t>
-      </w:r>
-      <w:r>
-        <w:rPr>
-          <w:rFonts w:ascii="Times New Roman" w:hAnsi="Times New Roman" w:eastAsia="Times New Roman" w:cs="Times New Roman"/>
-          <w:b/>
-          <w:bCs/>
+          <w:b w:val="1"/>
+          <w:bCs w:val="1"/>
         </w:rPr>
         <w:t>Domain</w:t>
       </w:r>
       <w:r>
         <w:rPr>
           <w:rFonts w:ascii="Times New Roman" w:hAnsi="Times New Roman" w:eastAsia="Times New Roman" w:cs="Times New Roman"/>
-          <w:b/>
-          <w:bCs/>
+          <w:b w:val="1"/>
+          <w:bCs w:val="1"/>
         </w:rPr>
         <w:t xml:space="preserve"> (núcleo do sistema)</w:t>
       </w:r>
       <w:r>
         <w:rPr>
           <w:rFonts w:ascii="Times New Roman" w:hAnsi="Times New Roman" w:eastAsia="Times New Roman" w:cs="Times New Roman"/>
-          <w:b/>
-          <w:bCs/>
+          <w:b w:val="1"/>
+          <w:bCs w:val="1"/>
         </w:rPr>
         <w:t>:</w:t>
       </w:r>
@@ -2543,8 +2595,8 @@
       <w:r>
         <w:rPr>
           <w:rFonts w:ascii="Times New Roman" w:hAnsi="Times New Roman" w:eastAsia="Times New Roman" w:cs="Times New Roman"/>
-          <w:b/>
-          <w:bCs/>
+          <w:b w:val="1"/>
+          <w:bCs w:val="1"/>
         </w:rPr>
         <w:t>Função:</w:t>
       </w:r>
@@ -2582,16 +2634,26 @@
         <w:rPr>
           <w:rFonts w:ascii="Times New Roman" w:hAnsi="Times New Roman" w:eastAsia="Times New Roman" w:cs="Times New Roman"/>
         </w:rPr>
-        <w:t xml:space="preserve"> e instancia o app </w:t>
-      </w:r>
-      <w:proofErr w:type="spellStart"/>
+        <w:t xml:space="preserve"> e inst</w:t>
+      </w:r>
+      <w:r>
+        <w:rPr>
+          <w:rFonts w:ascii="Times New Roman" w:hAnsi="Times New Roman" w:eastAsia="Times New Roman" w:cs="Times New Roman"/>
+        </w:rPr>
+        <w:t>â</w:t>
+      </w:r>
+      <w:r>
+        <w:rPr>
+          <w:rFonts w:ascii="Times New Roman" w:hAnsi="Times New Roman" w:eastAsia="Times New Roman" w:cs="Times New Roman"/>
+        </w:rPr>
+        <w:t xml:space="preserve">ncia o app </w:t>
+      </w:r>
       <w:r>
         <w:rPr>
           <w:rFonts w:ascii="Times New Roman" w:hAnsi="Times New Roman" w:eastAsia="Times New Roman" w:cs="Times New Roman"/>
         </w:rPr>
         <w:t>flask</w:t>
       </w:r>
-      <w:proofErr w:type="spellEnd"/>
       <w:r>
         <w:rPr>
           <w:rFonts w:ascii="Times New Roman" w:hAnsi="Times New Roman" w:eastAsia="Times New Roman" w:cs="Times New Roman"/>
@@ -2604,37 +2666,35 @@
         <w:spacing w:before="319" w:after="319" w:line="360" w:lineRule="auto"/>
         <w:rPr>
           <w:rFonts w:ascii="Times New Roman" w:hAnsi="Times New Roman" w:eastAsia="Times New Roman" w:cs="Times New Roman"/>
-          <w:b/>
-          <w:bCs/>
-          <w:sz w:val="24"/>
-          <w:szCs w:val="24"/>
-        </w:rPr>
-      </w:pPr>
-      <w:r>
-        <w:rPr>
-          <w:rFonts w:ascii="Times New Roman" w:hAnsi="Times New Roman" w:eastAsia="Times New Roman" w:cs="Times New Roman"/>
-          <w:b/>
-          <w:bCs/>
-          <w:sz w:val="24"/>
-          <w:szCs w:val="24"/>
-        </w:rPr>
-        <w:t xml:space="preserve">3.4 Camada de </w:t>
-      </w:r>
-      <w:proofErr w:type="spellStart"/>
-      <w:r>
-        <w:rPr>
-          <w:rFonts w:ascii="Times New Roman" w:hAnsi="Times New Roman" w:eastAsia="Times New Roman" w:cs="Times New Roman"/>
-          <w:b/>
-          <w:bCs/>
+          <w:b w:val="1"/>
+          <w:bCs w:val="1"/>
+          <w:sz w:val="24"/>
+          <w:szCs w:val="24"/>
+        </w:rPr>
+      </w:pPr>
+      <w:r>
+        <w:rPr>
+          <w:rFonts w:ascii="Times New Roman" w:hAnsi="Times New Roman" w:eastAsia="Times New Roman" w:cs="Times New Roman"/>
+          <w:b w:val="1"/>
+          <w:bCs w:val="1"/>
+          <w:sz w:val="24"/>
+          <w:szCs w:val="24"/>
+        </w:rPr>
+        <w:t xml:space="preserve">Camada de </w:t>
+      </w:r>
+      <w:r>
+        <w:rPr>
+          <w:rFonts w:ascii="Times New Roman" w:hAnsi="Times New Roman" w:eastAsia="Times New Roman" w:cs="Times New Roman"/>
+          <w:b w:val="1"/>
+          <w:bCs w:val="1"/>
         </w:rPr>
         <w:t>Ports</w:t>
       </w:r>
-      <w:proofErr w:type="spellEnd"/>
-      <w:r>
-        <w:rPr>
-          <w:rFonts w:ascii="Times New Roman" w:hAnsi="Times New Roman" w:eastAsia="Times New Roman" w:cs="Times New Roman"/>
-          <w:b/>
-          <w:bCs/>
+      <w:r>
+        <w:rPr>
+          <w:rFonts w:ascii="Times New Roman" w:hAnsi="Times New Roman" w:eastAsia="Times New Roman" w:cs="Times New Roman"/>
+          <w:b w:val="1"/>
+          <w:bCs w:val="1"/>
           <w:sz w:val="24"/>
           <w:szCs w:val="24"/>
         </w:rPr>
@@ -2643,8 +2703,8 @@
       <w:r>
         <w:rPr>
           <w:rFonts w:ascii="Times New Roman" w:hAnsi="Times New Roman" w:eastAsia="Times New Roman" w:cs="Times New Roman"/>
-          <w:b/>
-          <w:bCs/>
+          <w:b w:val="1"/>
+          <w:bCs w:val="1"/>
           <w:sz w:val="24"/>
           <w:szCs w:val="24"/>
         </w:rPr>
@@ -2653,8 +2713,8 @@
       <w:r>
         <w:rPr>
           <w:rFonts w:ascii="Times New Roman" w:hAnsi="Times New Roman" w:eastAsia="Times New Roman" w:cs="Times New Roman"/>
-          <w:b/>
-          <w:bCs/>
+          <w:b w:val="1"/>
+          <w:bCs w:val="1"/>
           <w:sz w:val="24"/>
           <w:szCs w:val="24"/>
         </w:rPr>
@@ -2663,8 +2723,8 @@
       <w:r>
         <w:rPr>
           <w:rFonts w:ascii="Times New Roman" w:hAnsi="Times New Roman" w:eastAsia="Times New Roman" w:cs="Times New Roman"/>
-          <w:b/>
-          <w:bCs/>
+          <w:b w:val="1"/>
+          <w:bCs w:val="1"/>
         </w:rPr>
         <w:t>:</w:t>
       </w:r>
@@ -2784,7 +2844,19 @@
         <w:rPr>
           <w:rFonts w:ascii="Times New Roman" w:hAnsi="Times New Roman" w:eastAsia="Times New Roman" w:cs="Times New Roman"/>
         </w:rPr>
-        <w:t>entarda</w:t>
+        <w:t>ent</w:t>
+      </w:r>
+      <w:r>
+        <w:rPr>
+          <w:rFonts w:ascii="Times New Roman" w:hAnsi="Times New Roman" w:eastAsia="Times New Roman" w:cs="Times New Roman"/>
+        </w:rPr>
+        <w:t>ra</w:t>
+      </w:r>
+      <w:r>
+        <w:rPr>
+          <w:rFonts w:ascii="Times New Roman" w:hAnsi="Times New Roman" w:eastAsia="Times New Roman" w:cs="Times New Roman"/>
+        </w:rPr>
+        <w:t>da</w:t>
       </w:r>
       <w:r>
         <w:rPr>
@@ -2838,219 +2910,428 @@
       <w:r>
         <w:rPr>
           <w:rFonts w:ascii="Times New Roman" w:hAnsi="Times New Roman" w:eastAsia="Times New Roman" w:cs="Times New Roman"/>
+          <w:b w:val="1"/>
+          <w:bCs w:val="1"/>
+          <w:sz w:val="24"/>
+          <w:szCs w:val="24"/>
+        </w:rPr>
+        <w:t xml:space="preserve">Requisitos Funcionais </w:t>
+      </w:r>
+    </w:p>
+    <w:p>
+      <w:pPr>
+        <w:spacing w:after="0" w:line="360" w:lineRule="auto"/>
+      </w:pPr>
+      <w:r>
+        <w:rPr>
+          <w:rFonts w:ascii="Times New Roman" w:hAnsi="Times New Roman" w:eastAsia="Times New Roman" w:cs="Times New Roman"/>
+          <w:sz w:val="24"/>
+          <w:szCs w:val="24"/>
+        </w:rPr>
+        <w:t>• Cadastro de professores e administradores</w:t>
+      </w:r>
+      <w:r>
+        <w:rPr>
+          <w:rFonts w:ascii="Times New Roman" w:hAnsi="Times New Roman" w:eastAsia="Times New Roman" w:cs="Times New Roman"/>
+          <w:sz w:val="24"/>
+          <w:szCs w:val="24"/>
+        </w:rPr>
+        <w:t>;</w:t>
+      </w:r>
+    </w:p>
+    <w:p>
+      <w:pPr>
+        <w:spacing w:after="0" w:line="360" w:lineRule="auto"/>
+      </w:pPr>
+      <w:r>
+        <w:rPr>
+          <w:rFonts w:ascii="Times New Roman" w:hAnsi="Times New Roman" w:eastAsia="Times New Roman" w:cs="Times New Roman"/>
+          <w:sz w:val="24"/>
+          <w:szCs w:val="24"/>
+        </w:rPr>
+        <w:t>• Autenticação de usuários por login</w:t>
+      </w:r>
+      <w:r>
+        <w:rPr>
+          <w:rFonts w:ascii="Times New Roman" w:hAnsi="Times New Roman" w:eastAsia="Times New Roman" w:cs="Times New Roman"/>
+          <w:sz w:val="24"/>
+          <w:szCs w:val="24"/>
+        </w:rPr>
+        <w:t>;</w:t>
+      </w:r>
+    </w:p>
+    <w:p>
+      <w:pPr>
+        <w:spacing w:after="0" w:line="360" w:lineRule="auto"/>
+      </w:pPr>
+      <w:r>
+        <w:rPr>
+          <w:rFonts w:ascii="Times New Roman" w:hAnsi="Times New Roman" w:eastAsia="Times New Roman" w:cs="Times New Roman"/>
+          <w:sz w:val="24"/>
+          <w:szCs w:val="24"/>
+        </w:rPr>
+        <w:t>• Criação de atividades educacionais</w:t>
+      </w:r>
+      <w:r>
+        <w:rPr>
+          <w:rFonts w:ascii="Times New Roman" w:hAnsi="Times New Roman" w:eastAsia="Times New Roman" w:cs="Times New Roman"/>
+          <w:sz w:val="24"/>
+          <w:szCs w:val="24"/>
+        </w:rPr>
+        <w:t>;</w:t>
+      </w:r>
+      <w:r>
+        <w:rPr>
+          <w:rFonts w:ascii="Times New Roman" w:hAnsi="Times New Roman" w:eastAsia="Times New Roman" w:cs="Times New Roman"/>
+          <w:sz w:val="24"/>
+          <w:szCs w:val="24"/>
+        </w:rPr>
+        <w:t xml:space="preserve"> </w:t>
+      </w:r>
+    </w:p>
+    <w:p>
+      <w:pPr>
+        <w:spacing w:after="0" w:line="360" w:lineRule="auto"/>
+      </w:pPr>
+      <w:r>
+        <w:rPr>
+          <w:rFonts w:ascii="Times New Roman" w:hAnsi="Times New Roman" w:eastAsia="Times New Roman" w:cs="Times New Roman"/>
+          <w:sz w:val="24"/>
+          <w:szCs w:val="24"/>
+        </w:rPr>
+        <w:t>• Personalização de atividades para cada aluno</w:t>
+      </w:r>
+      <w:r>
+        <w:rPr>
+          <w:rFonts w:ascii="Times New Roman" w:hAnsi="Times New Roman" w:eastAsia="Times New Roman" w:cs="Times New Roman"/>
+          <w:sz w:val="24"/>
+          <w:szCs w:val="24"/>
+        </w:rPr>
+        <w:t>;</w:t>
+      </w:r>
+      <w:r>
+        <w:rPr>
+          <w:rFonts w:ascii="Times New Roman" w:hAnsi="Times New Roman" w:eastAsia="Times New Roman" w:cs="Times New Roman"/>
+          <w:sz w:val="24"/>
+          <w:szCs w:val="24"/>
+        </w:rPr>
+        <w:t xml:space="preserve"> </w:t>
+      </w:r>
+    </w:p>
+    <w:p>
+      <w:pPr>
+        <w:spacing w:after="0" w:line="360" w:lineRule="auto"/>
+      </w:pPr>
+      <w:r>
+        <w:rPr>
+          <w:rFonts w:ascii="Times New Roman" w:hAnsi="Times New Roman" w:eastAsia="Times New Roman" w:cs="Times New Roman"/>
+          <w:sz w:val="24"/>
+          <w:szCs w:val="24"/>
+        </w:rPr>
+        <w:t>• Registro de progresso pedagógico</w:t>
+      </w:r>
+      <w:r>
+        <w:rPr>
+          <w:rFonts w:ascii="Times New Roman" w:hAnsi="Times New Roman" w:eastAsia="Times New Roman" w:cs="Times New Roman"/>
+          <w:sz w:val="24"/>
+          <w:szCs w:val="24"/>
+        </w:rPr>
+        <w:t>;</w:t>
+      </w:r>
+      <w:r>
+        <w:rPr>
+          <w:rFonts w:ascii="Times New Roman" w:hAnsi="Times New Roman" w:eastAsia="Times New Roman" w:cs="Times New Roman"/>
+          <w:sz w:val="24"/>
+          <w:szCs w:val="24"/>
+        </w:rPr>
+        <w:t xml:space="preserve"> </w:t>
+      </w:r>
+    </w:p>
+    <w:p>
+      <w:pPr>
+        <w:spacing w:after="0" w:line="360" w:lineRule="auto"/>
+      </w:pPr>
+      <w:r>
+        <w:rPr>
+          <w:rFonts w:ascii="Times New Roman" w:hAnsi="Times New Roman" w:eastAsia="Times New Roman" w:cs="Times New Roman"/>
+          <w:sz w:val="24"/>
+          <w:szCs w:val="24"/>
+        </w:rPr>
+        <w:t xml:space="preserve">• Visualização das atividades pelos alunos. </w:t>
+      </w:r>
+    </w:p>
+    <w:p>
+      <w:pPr>
+        <w:spacing w:after="0" w:line="360" w:lineRule="auto"/>
+        <w:rPr>
+          <w:rFonts w:ascii="Times New Roman" w:hAnsi="Times New Roman" w:eastAsia="Times New Roman" w:cs="Times New Roman"/>
+          <w:sz w:val="24"/>
+          <w:szCs w:val="24"/>
+        </w:rPr>
+      </w:pPr>
+    </w:p>
+    <w:p>
+      <w:pPr>
+        <w:spacing w:after="0" w:line="360" w:lineRule="auto"/>
+      </w:pPr>
+      <w:r>
+        <w:rPr>
+          <w:rFonts w:ascii="Times New Roman" w:hAnsi="Times New Roman" w:eastAsia="Times New Roman" w:cs="Times New Roman"/>
+          <w:b w:val="1"/>
+          <w:bCs w:val="1"/>
+          <w:sz w:val="24"/>
+          <w:szCs w:val="24"/>
+        </w:rPr>
+        <w:t xml:space="preserve">Requisitos Não Funcionais </w:t>
+      </w:r>
+    </w:p>
+    <w:p>
+      <w:pPr>
+        <w:spacing w:after="0" w:line="360" w:lineRule="auto"/>
+      </w:pPr>
+      <w:r>
+        <w:rPr>
+          <w:rFonts w:ascii="Times New Roman" w:hAnsi="Times New Roman" w:eastAsia="Times New Roman" w:cs="Times New Roman"/>
+          <w:sz w:val="24"/>
+          <w:szCs w:val="24"/>
+        </w:rPr>
+        <w:t>• Segurança e proteção dos dados dos alunos</w:t>
+      </w:r>
+      <w:r>
+        <w:rPr>
+          <w:rFonts w:ascii="Times New Roman" w:hAnsi="Times New Roman" w:eastAsia="Times New Roman" w:cs="Times New Roman"/>
+          <w:sz w:val="24"/>
+          <w:szCs w:val="24"/>
+        </w:rPr>
+        <w:t>;</w:t>
+      </w:r>
+      <w:r>
+        <w:rPr>
+          <w:rFonts w:ascii="Times New Roman" w:hAnsi="Times New Roman" w:eastAsia="Times New Roman" w:cs="Times New Roman"/>
+          <w:sz w:val="24"/>
+          <w:szCs w:val="24"/>
+        </w:rPr>
+        <w:t xml:space="preserve"> </w:t>
+      </w:r>
+    </w:p>
+    <w:p>
+      <w:pPr>
+        <w:spacing w:after="0" w:line="360" w:lineRule="auto"/>
+      </w:pPr>
+      <w:r>
+        <w:rPr>
+          <w:rFonts w:ascii="Times New Roman" w:hAnsi="Times New Roman" w:eastAsia="Times New Roman" w:cs="Times New Roman"/>
+          <w:sz w:val="24"/>
+          <w:szCs w:val="24"/>
+        </w:rPr>
+        <w:t>• Usabilidade com interface simples e intuitiva</w:t>
+      </w:r>
+      <w:r>
+        <w:rPr>
+          <w:rFonts w:ascii="Times New Roman" w:hAnsi="Times New Roman" w:eastAsia="Times New Roman" w:cs="Times New Roman"/>
+          <w:sz w:val="24"/>
+          <w:szCs w:val="24"/>
+        </w:rPr>
+        <w:t>;</w:t>
+      </w:r>
+      <w:r>
+        <w:rPr>
+          <w:rFonts w:ascii="Times New Roman" w:hAnsi="Times New Roman" w:eastAsia="Times New Roman" w:cs="Times New Roman"/>
+          <w:sz w:val="24"/>
+          <w:szCs w:val="24"/>
+        </w:rPr>
+        <w:t xml:space="preserve"> </w:t>
+      </w:r>
+    </w:p>
+    <w:p>
+      <w:pPr>
+        <w:spacing w:after="0" w:line="360" w:lineRule="auto"/>
+      </w:pPr>
+      <w:r>
+        <w:rPr>
+          <w:rFonts w:ascii="Times New Roman" w:hAnsi="Times New Roman" w:eastAsia="Times New Roman" w:cs="Times New Roman"/>
+          <w:sz w:val="24"/>
+          <w:szCs w:val="24"/>
+        </w:rPr>
+        <w:t>• Disponibilidade do sistema em ambiente hospitalar</w:t>
+      </w:r>
+      <w:r>
+        <w:rPr>
+          <w:rFonts w:ascii="Times New Roman" w:hAnsi="Times New Roman" w:eastAsia="Times New Roman" w:cs="Times New Roman"/>
+          <w:sz w:val="24"/>
+          <w:szCs w:val="24"/>
+        </w:rPr>
+        <w:t>;</w:t>
+      </w:r>
+    </w:p>
+    <w:p>
+      <w:pPr>
+        <w:spacing w:after="0" w:line="360" w:lineRule="auto"/>
+      </w:pPr>
+      <w:r>
+        <w:rPr>
+          <w:rFonts w:ascii="Times New Roman" w:hAnsi="Times New Roman" w:eastAsia="Times New Roman" w:cs="Times New Roman"/>
+          <w:sz w:val="24"/>
+          <w:szCs w:val="24"/>
+        </w:rPr>
+        <w:t>• Manutenibilidade da arquitetura</w:t>
+      </w:r>
+      <w:r>
+        <w:rPr>
+          <w:rFonts w:ascii="Times New Roman" w:hAnsi="Times New Roman" w:eastAsia="Times New Roman" w:cs="Times New Roman"/>
+          <w:sz w:val="24"/>
+          <w:szCs w:val="24"/>
+        </w:rPr>
+        <w:t>;</w:t>
+      </w:r>
+    </w:p>
+    <w:p>
+      <w:pPr>
+        <w:spacing w:after="0" w:line="360" w:lineRule="auto"/>
+        <w:rPr>
+          <w:rFonts w:ascii="Times New Roman" w:hAnsi="Times New Roman" w:eastAsia="Times New Roman" w:cs="Times New Roman"/>
+          <w:sz w:val="24"/>
+          <w:szCs w:val="24"/>
+        </w:rPr>
+      </w:pPr>
+      <w:r>
+        <w:rPr>
+          <w:rFonts w:ascii="Times New Roman" w:hAnsi="Times New Roman" w:eastAsia="Times New Roman" w:cs="Times New Roman"/>
+          <w:sz w:val="24"/>
+          <w:szCs w:val="24"/>
+        </w:rPr>
+        <w:t>• Escalabilidade para futuras integrações com IA</w:t>
+      </w:r>
+      <w:r>
+        <w:rPr>
+          <w:rFonts w:ascii="Times New Roman" w:hAnsi="Times New Roman" w:eastAsia="Times New Roman" w:cs="Times New Roman"/>
+          <w:sz w:val="24"/>
+          <w:szCs w:val="24"/>
+        </w:rPr>
+        <w:t>;</w:t>
+      </w:r>
+    </w:p>
+    <w:p>
+      <w:pPr>
+        <w:spacing w:after="0" w:line="360" w:lineRule="auto"/>
+        <w:rPr>
+          <w:rFonts w:ascii="Times New Roman" w:hAnsi="Times New Roman" w:eastAsia="Times New Roman" w:cs="Times New Roman"/>
+          <w:sz w:val="24"/>
+          <w:szCs w:val="24"/>
+        </w:rPr>
+      </w:pPr>
+      <w:r>
+        <w:rPr>
+          <w:rFonts w:ascii="Times New Roman" w:hAnsi="Times New Roman" w:eastAsia="Times New Roman" w:cs="Times New Roman"/>
+          <w:sz w:val="24"/>
+          <w:szCs w:val="24"/>
+        </w:rPr>
+        <w:t xml:space="preserve">• Responsividade </w:t>
+      </w:r>
+      <w:r>
+        <w:rPr>
+          <w:rFonts w:ascii="Times New Roman" w:hAnsi="Times New Roman" w:eastAsia="Times New Roman" w:cs="Times New Roman"/>
+          <w:sz w:val="24"/>
+          <w:szCs w:val="24"/>
+        </w:rPr>
+        <w:t>visual para aparelhos mobile</w:t>
+      </w:r>
+      <w:r>
+        <w:rPr>
+          <w:rFonts w:ascii="Times New Roman" w:hAnsi="Times New Roman" w:eastAsia="Times New Roman" w:cs="Times New Roman"/>
+          <w:sz w:val="24"/>
+          <w:szCs w:val="24"/>
+        </w:rPr>
+        <w:t>.</w:t>
+      </w:r>
+      <w:r>
+        <w:br/>
+      </w:r>
+    </w:p>
+    <w:p>
+      <w:pPr>
+        <w:spacing w:after="0" w:line="360" w:lineRule="auto"/>
+        <w:rPr>
+          <w:rFonts w:ascii="Times New Roman" w:hAnsi="Times New Roman" w:eastAsia="Times New Roman" w:cs="Times New Roman"/>
+          <w:b w:val="1"/>
+          <w:bCs w:val="1"/>
+          <w:sz w:val="24"/>
+          <w:szCs w:val="24"/>
+        </w:rPr>
+      </w:pPr>
+      <w:r>
+        <w:rPr>
+          <w:rFonts w:ascii="Times New Roman" w:hAnsi="Times New Roman" w:eastAsia="Times New Roman" w:cs="Times New Roman"/>
+          <w:b w:val="1"/>
+          <w:bCs w:val="1"/>
+          <w:sz w:val="24"/>
+          <w:szCs w:val="24"/>
+        </w:rPr>
+        <w:t xml:space="preserve">Documento de </w:t>
+      </w:r>
+      <w:r>
+        <w:rPr>
+          <w:rFonts w:ascii="Times New Roman" w:hAnsi="Times New Roman" w:eastAsia="Times New Roman" w:cs="Times New Roman"/>
+          <w:b w:val="1"/>
+          <w:bCs w:val="1"/>
+          <w:sz w:val="24"/>
+          <w:szCs w:val="24"/>
+        </w:rPr>
+        <w:t>Rationale</w:t>
+      </w:r>
+    </w:p>
+    <w:p>
+      <w:pPr>
+        <w:spacing w:before="240" w:after="240" w:line="360" w:lineRule="auto"/>
+        <w:rPr>
+          <w:rFonts w:ascii="Times New Roman" w:hAnsi="Times New Roman" w:eastAsia="Times New Roman" w:cs="Times New Roman"/>
+          <w:sz w:val="24"/>
+          <w:szCs w:val="24"/>
+        </w:rPr>
+      </w:pPr>
+      <w:r>
+        <w:rPr>
+          <w:rFonts w:ascii="Times New Roman" w:hAnsi="Times New Roman" w:eastAsia="Times New Roman" w:cs="Times New Roman"/>
+          <w:sz w:val="24"/>
+          <w:szCs w:val="24"/>
+        </w:rPr>
+        <w:t xml:space="preserve">O </w:t>
+      </w:r>
+      <w:proofErr w:type="spellStart"/>
+      <w:r>
+        <w:rPr>
+          <w:rFonts w:ascii="Times New Roman" w:hAnsi="Times New Roman" w:eastAsia="Times New Roman" w:cs="Times New Roman"/>
+          <w:sz w:val="24"/>
+          <w:szCs w:val="24"/>
+        </w:rPr>
+        <w:t>Rationale</w:t>
+      </w:r>
+      <w:proofErr w:type="spellEnd"/>
+      <w:r>
+        <w:rPr>
+          <w:rFonts w:ascii="Times New Roman" w:hAnsi="Times New Roman" w:eastAsia="Times New Roman" w:cs="Times New Roman"/>
+          <w:sz w:val="24"/>
+          <w:szCs w:val="24"/>
+        </w:rPr>
+        <w:t xml:space="preserve"> deste projeto detalha as justificativas para as decisões arquiteturais tomadas, garantindo que o </w:t>
+      </w:r>
+      <w:r>
+        <w:rPr>
+          <w:rFonts w:ascii="Times New Roman" w:hAnsi="Times New Roman" w:eastAsia="Times New Roman" w:cs="Times New Roman"/>
           <w:b/>
           <w:bCs/>
           <w:sz w:val="24"/>
           <w:szCs w:val="24"/>
         </w:rPr>
-        <w:t xml:space="preserve">4. Requisitos Funcionais </w:t>
-      </w:r>
-    </w:p>
-    <w:p>
-      <w:pPr>
-        <w:spacing w:after="0" w:line="360" w:lineRule="auto"/>
-      </w:pPr>
-      <w:r>
-        <w:rPr>
-          <w:rFonts w:ascii="Times New Roman" w:hAnsi="Times New Roman" w:eastAsia="Times New Roman" w:cs="Times New Roman"/>
-          <w:sz w:val="24"/>
-          <w:szCs w:val="24"/>
-        </w:rPr>
-        <w:t xml:space="preserve">• Cadastro de professores e administradores. </w:t>
-      </w:r>
-    </w:p>
-    <w:p>
-      <w:pPr>
-        <w:spacing w:after="0" w:line="360" w:lineRule="auto"/>
-      </w:pPr>
-      <w:r>
-        <w:rPr>
-          <w:rFonts w:ascii="Times New Roman" w:hAnsi="Times New Roman" w:eastAsia="Times New Roman" w:cs="Times New Roman"/>
-          <w:sz w:val="24"/>
-          <w:szCs w:val="24"/>
-        </w:rPr>
-        <w:t xml:space="preserve">• Autenticação de usuários por login. </w:t>
-      </w:r>
-    </w:p>
-    <w:p>
-      <w:pPr>
-        <w:spacing w:after="0" w:line="360" w:lineRule="auto"/>
-      </w:pPr>
-      <w:r>
-        <w:rPr>
-          <w:rFonts w:ascii="Times New Roman" w:hAnsi="Times New Roman" w:eastAsia="Times New Roman" w:cs="Times New Roman"/>
-          <w:sz w:val="24"/>
-          <w:szCs w:val="24"/>
-        </w:rPr>
-        <w:t xml:space="preserve">• Criação de atividades educacionais. </w:t>
-      </w:r>
-    </w:p>
-    <w:p>
-      <w:pPr>
-        <w:spacing w:after="0" w:line="360" w:lineRule="auto"/>
-      </w:pPr>
-      <w:r>
-        <w:rPr>
-          <w:rFonts w:ascii="Times New Roman" w:hAnsi="Times New Roman" w:eastAsia="Times New Roman" w:cs="Times New Roman"/>
-          <w:sz w:val="24"/>
-          <w:szCs w:val="24"/>
-        </w:rPr>
-        <w:t xml:space="preserve">• Personalização de atividades para cada aluno. </w:t>
-      </w:r>
-    </w:p>
-    <w:p>
-      <w:pPr>
-        <w:spacing w:after="0" w:line="360" w:lineRule="auto"/>
-      </w:pPr>
-      <w:r>
-        <w:rPr>
-          <w:rFonts w:ascii="Times New Roman" w:hAnsi="Times New Roman" w:eastAsia="Times New Roman" w:cs="Times New Roman"/>
-          <w:sz w:val="24"/>
-          <w:szCs w:val="24"/>
-        </w:rPr>
-        <w:t xml:space="preserve">• Registro de progresso pedagógico. </w:t>
-      </w:r>
-    </w:p>
-    <w:p>
-      <w:pPr>
-        <w:spacing w:after="0" w:line="360" w:lineRule="auto"/>
-      </w:pPr>
-      <w:r>
-        <w:rPr>
-          <w:rFonts w:ascii="Times New Roman" w:hAnsi="Times New Roman" w:eastAsia="Times New Roman" w:cs="Times New Roman"/>
-          <w:sz w:val="24"/>
-          <w:szCs w:val="24"/>
-        </w:rPr>
-        <w:t xml:space="preserve">• Visualização das atividades pelos alunos. </w:t>
-      </w:r>
-    </w:p>
-    <w:p>
-      <w:pPr>
-        <w:spacing w:after="0" w:line="360" w:lineRule="auto"/>
-        <w:rPr>
-          <w:rFonts w:ascii="Times New Roman" w:hAnsi="Times New Roman" w:eastAsia="Times New Roman" w:cs="Times New Roman"/>
-          <w:sz w:val="24"/>
-          <w:szCs w:val="24"/>
-        </w:rPr>
-      </w:pPr>
-    </w:p>
-    <w:p>
-      <w:pPr>
-        <w:spacing w:after="0" w:line="360" w:lineRule="auto"/>
-      </w:pPr>
-      <w:r>
-        <w:rPr>
-          <w:rFonts w:ascii="Times New Roman" w:hAnsi="Times New Roman" w:eastAsia="Times New Roman" w:cs="Times New Roman"/>
-          <w:b/>
-          <w:bCs/>
-          <w:sz w:val="24"/>
-          <w:szCs w:val="24"/>
-        </w:rPr>
-        <w:t xml:space="preserve">5. Requisitos Não Funcionais </w:t>
-      </w:r>
-    </w:p>
-    <w:p>
-      <w:pPr>
-        <w:spacing w:after="0" w:line="360" w:lineRule="auto"/>
-      </w:pPr>
-      <w:r>
-        <w:rPr>
-          <w:rFonts w:ascii="Times New Roman" w:hAnsi="Times New Roman" w:eastAsia="Times New Roman" w:cs="Times New Roman"/>
-          <w:sz w:val="24"/>
-          <w:szCs w:val="24"/>
-        </w:rPr>
-        <w:t xml:space="preserve">• Segurança e proteção dos dados dos alunos. </w:t>
-      </w:r>
-    </w:p>
-    <w:p>
-      <w:pPr>
-        <w:spacing w:after="0" w:line="360" w:lineRule="auto"/>
-      </w:pPr>
-      <w:r>
-        <w:rPr>
-          <w:rFonts w:ascii="Times New Roman" w:hAnsi="Times New Roman" w:eastAsia="Times New Roman" w:cs="Times New Roman"/>
-          <w:sz w:val="24"/>
-          <w:szCs w:val="24"/>
-        </w:rPr>
-        <w:t xml:space="preserve">• Usabilidade com interface simples e intuitiva. </w:t>
-      </w:r>
-    </w:p>
-    <w:p>
-      <w:pPr>
-        <w:spacing w:after="0" w:line="360" w:lineRule="auto"/>
-      </w:pPr>
-      <w:r>
-        <w:rPr>
-          <w:rFonts w:ascii="Times New Roman" w:hAnsi="Times New Roman" w:eastAsia="Times New Roman" w:cs="Times New Roman"/>
-          <w:sz w:val="24"/>
-          <w:szCs w:val="24"/>
-        </w:rPr>
-        <w:t xml:space="preserve">• Disponibilidade do sistema em ambiente hospitalar. </w:t>
-      </w:r>
-    </w:p>
-    <w:p>
-      <w:pPr>
-        <w:spacing w:after="0" w:line="360" w:lineRule="auto"/>
-      </w:pPr>
-      <w:r>
-        <w:rPr>
-          <w:rFonts w:ascii="Times New Roman" w:hAnsi="Times New Roman" w:eastAsia="Times New Roman" w:cs="Times New Roman"/>
-          <w:sz w:val="24"/>
-          <w:szCs w:val="24"/>
-        </w:rPr>
-        <w:t xml:space="preserve">• Manutenibilidade da arquitetura. </w:t>
-      </w:r>
-    </w:p>
-    <w:p>
-      <w:pPr>
-        <w:spacing w:after="0" w:line="360" w:lineRule="auto"/>
-        <w:rPr>
-          <w:rFonts w:ascii="Times New Roman" w:hAnsi="Times New Roman" w:eastAsia="Times New Roman" w:cs="Times New Roman"/>
-          <w:sz w:val="24"/>
-          <w:szCs w:val="24"/>
-        </w:rPr>
-      </w:pPr>
-      <w:r>
-        <w:rPr>
-          <w:rFonts w:ascii="Times New Roman" w:hAnsi="Times New Roman" w:eastAsia="Times New Roman" w:cs="Times New Roman"/>
-          <w:sz w:val="24"/>
-          <w:szCs w:val="24"/>
-        </w:rPr>
-        <w:t>• Escalabilidade para futuras integrações com IA.</w:t>
-      </w:r>
-      <w:r>
-        <w:rPr>
-          <w:rFonts w:ascii="Times New Roman" w:hAnsi="Times New Roman" w:eastAsia="Times New Roman" w:cs="Times New Roman"/>
-          <w:sz w:val="24"/>
-          <w:szCs w:val="24"/>
-        </w:rPr>
-        <w:t xml:space="preserve"> </w:t>
-      </w:r>
-    </w:p>
-    <w:p>
-      <w:pPr>
-        <w:spacing w:after="0" w:line="360" w:lineRule="auto"/>
-        <w:rPr>
-          <w:rFonts w:ascii="Times New Roman" w:hAnsi="Times New Roman" w:eastAsia="Times New Roman" w:cs="Times New Roman"/>
-          <w:sz w:val="24"/>
-          <w:szCs w:val="24"/>
-        </w:rPr>
-      </w:pPr>
-      <w:r>
-        <w:rPr>
-          <w:rFonts w:ascii="Times New Roman" w:hAnsi="Times New Roman" w:eastAsia="Times New Roman" w:cs="Times New Roman"/>
-          <w:sz w:val="24"/>
-          <w:szCs w:val="24"/>
-        </w:rPr>
-        <w:t xml:space="preserve">• Responsividade </w:t>
-      </w:r>
-      <w:r>
-        <w:rPr>
-          <w:rFonts w:ascii="Times New Roman" w:hAnsi="Times New Roman" w:eastAsia="Times New Roman" w:cs="Times New Roman"/>
-          <w:sz w:val="24"/>
-          <w:szCs w:val="24"/>
-        </w:rPr>
-        <w:t>visual para aparelhos mobile</w:t>
+        <w:t>Sistema de Apoio à Alfabetização Hospitalar</w:t>
+      </w:r>
+      <w:r>
+        <w:rPr>
+          <w:rFonts w:ascii="Times New Roman" w:hAnsi="Times New Roman" w:eastAsia="Times New Roman" w:cs="Times New Roman"/>
+          <w:sz w:val="24"/>
+          <w:szCs w:val="24"/>
+        </w:rPr>
+        <w:t xml:space="preserve"> cumpra seu propósito pedagógico e técnico.</w:t>
       </w:r>
       <w:r>
         <w:br/>
@@ -3058,93 +3339,34 @@
     </w:p>
     <w:p>
       <w:pPr>
-        <w:spacing w:after="0" w:line="360" w:lineRule="auto"/>
-        <w:rPr>
-          <w:rFonts w:ascii="Times New Roman" w:hAnsi="Times New Roman" w:eastAsia="Times New Roman" w:cs="Times New Roman"/>
-          <w:b/>
-          <w:bCs/>
-          <w:sz w:val="24"/>
-          <w:szCs w:val="24"/>
-        </w:rPr>
-      </w:pPr>
-      <w:r>
-        <w:rPr>
-          <w:rFonts w:ascii="Times New Roman" w:hAnsi="Times New Roman" w:eastAsia="Times New Roman" w:cs="Times New Roman"/>
-          <w:b/>
-          <w:bCs/>
-          <w:sz w:val="24"/>
-          <w:szCs w:val="24"/>
-        </w:rPr>
-        <w:t xml:space="preserve">6. Documento de </w:t>
-      </w:r>
-      <w:proofErr w:type="spellStart"/>
-      <w:r>
-        <w:rPr>
-          <w:rFonts w:ascii="Times New Roman" w:hAnsi="Times New Roman" w:eastAsia="Times New Roman" w:cs="Times New Roman"/>
-          <w:b/>
-          <w:bCs/>
-          <w:sz w:val="24"/>
-          <w:szCs w:val="24"/>
-        </w:rPr>
-        <w:t>Rationale</w:t>
-      </w:r>
-      <w:proofErr w:type="spellEnd"/>
-    </w:p>
-    <w:p>
-      <w:pPr>
         <w:spacing w:before="240" w:after="240" w:line="360" w:lineRule="auto"/>
         <w:rPr>
           <w:rFonts w:ascii="Times New Roman" w:hAnsi="Times New Roman" w:eastAsia="Times New Roman" w:cs="Times New Roman"/>
-          <w:sz w:val="24"/>
-          <w:szCs w:val="24"/>
-        </w:rPr>
-      </w:pPr>
-      <w:r>
-        <w:rPr>
-          <w:rFonts w:ascii="Times New Roman" w:hAnsi="Times New Roman" w:eastAsia="Times New Roman" w:cs="Times New Roman"/>
-          <w:sz w:val="24"/>
-          <w:szCs w:val="24"/>
-        </w:rPr>
-        <w:t xml:space="preserve">O </w:t>
-      </w:r>
-      <w:proofErr w:type="spellStart"/>
-      <w:r>
-        <w:rPr>
-          <w:rFonts w:ascii="Times New Roman" w:hAnsi="Times New Roman" w:eastAsia="Times New Roman" w:cs="Times New Roman"/>
-          <w:sz w:val="24"/>
-          <w:szCs w:val="24"/>
-        </w:rPr>
-        <w:t>Rationale</w:t>
-      </w:r>
-      <w:proofErr w:type="spellEnd"/>
-      <w:r>
-        <w:rPr>
-          <w:rFonts w:ascii="Times New Roman" w:hAnsi="Times New Roman" w:eastAsia="Times New Roman" w:cs="Times New Roman"/>
-          <w:sz w:val="24"/>
-          <w:szCs w:val="24"/>
-        </w:rPr>
-        <w:t xml:space="preserve"> deste projeto detalha as justificativas para as decisões arquiteturais tomadas, garantindo que o </w:t>
-      </w:r>
-      <w:r>
-        <w:rPr>
-          <w:rFonts w:ascii="Times New Roman" w:hAnsi="Times New Roman" w:eastAsia="Times New Roman" w:cs="Times New Roman"/>
-          <w:b/>
-          <w:bCs/>
-          <w:sz w:val="24"/>
-          <w:szCs w:val="24"/>
-        </w:rPr>
-        <w:t>Sistema de Apoio à Alfabetização Hospitalar</w:t>
-      </w:r>
-      <w:r>
-        <w:rPr>
-          <w:rFonts w:ascii="Times New Roman" w:hAnsi="Times New Roman" w:eastAsia="Times New Roman" w:cs="Times New Roman"/>
-          <w:sz w:val="24"/>
-          <w:szCs w:val="24"/>
-        </w:rPr>
-        <w:t xml:space="preserve"> cumpra seu propósito pedagógico e técnico.</w:t>
-      </w:r>
-      <w:r>
-        <w:br/>
+          <w:b w:val="1"/>
+          <w:bCs w:val="1"/>
+          <w:sz w:val="24"/>
+          <w:szCs w:val="24"/>
+        </w:rPr>
+      </w:pPr>
+      <w:r>
+        <w:rPr>
+          <w:rFonts w:ascii="Times New Roman" w:hAnsi="Times New Roman" w:eastAsia="Times New Roman" w:cs="Times New Roman"/>
+          <w:b w:val="1"/>
+          <w:bCs w:val="1"/>
+          <w:sz w:val="24"/>
+          <w:szCs w:val="24"/>
+        </w:rPr>
+        <w:t xml:space="preserve">Justificativa da Arquitetura </w:t>
+      </w:r>
+      <w:r>
+        <w:rPr>
+          <w:rFonts w:ascii="Times New Roman" w:hAnsi="Times New Roman" w:eastAsia="Times New Roman" w:cs="Times New Roman"/>
+          <w:b w:val="1"/>
+          <w:bCs w:val="1"/>
+          <w:sz w:val="24"/>
+          <w:szCs w:val="24"/>
+        </w:rPr>
+        <w:t>Hexagonal</w:t>
       </w:r>
     </w:p>
     <w:p>
@@ -3152,70 +3374,38 @@
         <w:spacing w:before="240" w:after="240" w:line="360" w:lineRule="auto"/>
         <w:rPr>
           <w:rFonts w:ascii="Times New Roman" w:hAnsi="Times New Roman" w:eastAsia="Times New Roman" w:cs="Times New Roman"/>
-          <w:b/>
-          <w:bCs/>
-          <w:sz w:val="24"/>
-          <w:szCs w:val="24"/>
-        </w:rPr>
-      </w:pPr>
-      <w:r>
-        <w:rPr>
-          <w:rFonts w:ascii="Times New Roman" w:hAnsi="Times New Roman" w:eastAsia="Times New Roman" w:cs="Times New Roman"/>
-          <w:b/>
-          <w:bCs/>
-          <w:sz w:val="24"/>
-          <w:szCs w:val="24"/>
-        </w:rPr>
-        <w:t xml:space="preserve">6.1 Justificativa da Arquitetura </w:t>
-      </w:r>
-      <w:r>
-        <w:rPr>
-          <w:rFonts w:ascii="Times New Roman" w:hAnsi="Times New Roman" w:eastAsia="Times New Roman" w:cs="Times New Roman"/>
-          <w:b/>
-          <w:bCs/>
+          <w:sz w:val="24"/>
+          <w:szCs w:val="24"/>
+        </w:rPr>
+      </w:pPr>
+      <w:r>
+        <w:rPr>
+          <w:rFonts w:ascii="Times New Roman" w:hAnsi="Times New Roman" w:eastAsia="Times New Roman" w:cs="Times New Roman"/>
+          <w:sz w:val="24"/>
+          <w:szCs w:val="24"/>
+        </w:rPr>
+        <w:t xml:space="preserve">A escolha pela </w:t>
+      </w:r>
+      <w:r>
+        <w:rPr>
+          <w:rFonts w:ascii="Times New Roman" w:hAnsi="Times New Roman" w:eastAsia="Times New Roman" w:cs="Times New Roman"/>
+          <w:b w:val="1"/>
+          <w:bCs w:val="1"/>
+          <w:sz w:val="24"/>
+          <w:szCs w:val="24"/>
+        </w:rPr>
+        <w:t xml:space="preserve">Arquitetura </w:t>
+      </w:r>
+      <w:r>
+        <w:rPr>
+          <w:rFonts w:ascii="Times New Roman" w:hAnsi="Times New Roman" w:eastAsia="Times New Roman" w:cs="Times New Roman"/>
+          <w:b w:val="1"/>
+          <w:bCs w:val="1"/>
           <w:sz w:val="24"/>
           <w:szCs w:val="24"/>
         </w:rPr>
         <w:t>Hexagonal</w:t>
       </w:r>
-    </w:p>
-    <w:p>
-      <w:pPr>
-        <w:spacing w:before="240" w:after="240" w:line="360" w:lineRule="auto"/>
-        <w:rPr>
-          <w:rFonts w:ascii="Times New Roman" w:hAnsi="Times New Roman" w:eastAsia="Times New Roman" w:cs="Times New Roman"/>
-          <w:sz w:val="24"/>
-          <w:szCs w:val="24"/>
-        </w:rPr>
-      </w:pPr>
-      <w:r>
-        <w:rPr>
-          <w:rFonts w:ascii="Times New Roman" w:hAnsi="Times New Roman" w:eastAsia="Times New Roman" w:cs="Times New Roman"/>
-          <w:sz w:val="24"/>
-          <w:szCs w:val="24"/>
-        </w:rPr>
-        <w:t xml:space="preserve">A escolha pela </w:t>
-      </w:r>
-      <w:r>
-        <w:rPr>
-          <w:rFonts w:ascii="Times New Roman" w:hAnsi="Times New Roman" w:eastAsia="Times New Roman" w:cs="Times New Roman"/>
-          <w:b/>
-          <w:bCs/>
-          <w:sz w:val="24"/>
-          <w:szCs w:val="24"/>
-        </w:rPr>
-        <w:t xml:space="preserve">Arquitetura </w:t>
-      </w:r>
-      <w:r>
-        <w:rPr>
-          <w:rFonts w:ascii="Times New Roman" w:hAnsi="Times New Roman" w:eastAsia="Times New Roman" w:cs="Times New Roman"/>
-          <w:b/>
-          <w:bCs/>
-          <w:sz w:val="24"/>
-          <w:szCs w:val="24"/>
-        </w:rPr>
-        <w:t>Hexagonal</w:t>
-      </w:r>
       <w:r>
         <w:rPr>
           <w:rFonts w:ascii="Times New Roman" w:hAnsi="Times New Roman" w:eastAsia="Times New Roman" w:cs="Times New Roman"/>
@@ -3223,6 +3413,14 @@
           <w:szCs w:val="24"/>
         </w:rPr>
         <w:t xml:space="preserve"> fundamenta-se na necessidade </w:t>
+      </w:r>
+      <w:r>
+        <w:rPr>
+          <w:rFonts w:ascii="Times New Roman" w:hAnsi="Times New Roman" w:eastAsia="Times New Roman" w:cs="Times New Roman"/>
+          <w:sz w:val="24"/>
+          <w:szCs w:val="24"/>
+        </w:rPr>
+        <w:t xml:space="preserve">de </w:t>
       </w:r>
       <w:r>
         <w:rPr>
@@ -3266,8 +3464,8 @@
       <w:r>
         <w:rPr>
           <w:rFonts w:ascii="Times New Roman" w:hAnsi="Times New Roman" w:eastAsia="Times New Roman" w:cs="Times New Roman"/>
-          <w:b/>
-          <w:bCs/>
+          <w:b w:val="1"/>
+          <w:bCs w:val="1"/>
           <w:sz w:val="24"/>
           <w:szCs w:val="24"/>
         </w:rPr>
@@ -3300,8 +3498,8 @@
       <w:r>
         <w:rPr>
           <w:rFonts w:ascii="Times New Roman" w:hAnsi="Times New Roman" w:eastAsia="Times New Roman" w:cs="Times New Roman"/>
-          <w:i/>
-          <w:iCs/>
+          <w:i w:val="1"/>
+          <w:iCs w:val="1"/>
           <w:sz w:val="24"/>
           <w:szCs w:val="24"/>
         </w:rPr>
@@ -3329,7 +3527,15 @@
           <w:sz w:val="24"/>
           <w:szCs w:val="24"/>
         </w:rPr>
-        <w:t>interface simplificada. O isolamento da camada de apresentação permite essas mudanças sem afetar os dados pedagógicos.</w:t>
+        <w:t>interface simplificada. O isolamento da camada de apresentação permite essas mudanças sem afetar os dados pedagógicos</w:t>
+      </w:r>
+      <w:r>
+        <w:rPr>
+          <w:rFonts w:ascii="Times New Roman" w:hAnsi="Times New Roman" w:eastAsia="Times New Roman" w:cs="Times New Roman"/>
+          <w:sz w:val="24"/>
+          <w:szCs w:val="24"/>
+        </w:rPr>
+        <w:t>;</w:t>
       </w:r>
     </w:p>
     <w:p>
@@ -3386,12 +3592,53 @@
         <w:spacing w:before="240" w:after="240" w:line="360" w:lineRule="auto"/>
         <w:rPr>
           <w:rFonts w:ascii="Times New Roman" w:hAnsi="Times New Roman" w:eastAsia="Times New Roman" w:cs="Times New Roman"/>
+          <w:b w:val="1"/>
+          <w:bCs w:val="1"/>
+          <w:sz w:val="24"/>
+          <w:szCs w:val="24"/>
+        </w:rPr>
+      </w:pPr>
+      <w:r>
+        <w:rPr>
+          <w:rFonts w:ascii="Times New Roman" w:hAnsi="Times New Roman" w:eastAsia="Times New Roman" w:cs="Times New Roman"/>
+          <w:b w:val="1"/>
+          <w:bCs w:val="1"/>
+          <w:sz w:val="24"/>
+          <w:szCs w:val="24"/>
+        </w:rPr>
+        <w:t>Justificativa dos Requisitos Funcionais</w:t>
+      </w:r>
+    </w:p>
+    <w:p>
+      <w:pPr>
+        <w:spacing w:before="240" w:after="240" w:line="360" w:lineRule="auto"/>
+      </w:pPr>
+      <w:r>
+        <w:rPr>
+          <w:rFonts w:ascii="Times New Roman" w:hAnsi="Times New Roman" w:eastAsia="Times New Roman" w:cs="Times New Roman"/>
+          <w:sz w:val="24"/>
+          <w:szCs w:val="24"/>
+        </w:rPr>
+        <w:t xml:space="preserve">Os requisitos de </w:t>
+      </w:r>
+      <w:r>
+        <w:rPr>
+          <w:rFonts w:ascii="Times New Roman" w:hAnsi="Times New Roman" w:eastAsia="Times New Roman" w:cs="Times New Roman"/>
           <w:b/>
           <w:bCs/>
           <w:sz w:val="24"/>
           <w:szCs w:val="24"/>
         </w:rPr>
-      </w:pPr>
+        <w:t>Cadastro e Autenticação</w:t>
+      </w:r>
+      <w:r>
+        <w:rPr>
+          <w:rFonts w:ascii="Times New Roman" w:hAnsi="Times New Roman" w:eastAsia="Times New Roman" w:cs="Times New Roman"/>
+          <w:sz w:val="24"/>
+          <w:szCs w:val="24"/>
+        </w:rPr>
+        <w:t xml:space="preserve"> foram priorizados para garantir a autoria das atividades e a segurança no ambiente hospitalar. A </w:t>
+      </w:r>
       <w:r>
         <w:rPr>
           <w:rFonts w:ascii="Times New Roman" w:hAnsi="Times New Roman" w:eastAsia="Times New Roman" w:cs="Times New Roman"/>
@@ -3400,96 +3647,55 @@
           <w:sz w:val="24"/>
           <w:szCs w:val="24"/>
         </w:rPr>
-        <w:t>6.2 Justificativa dos Requisitos Funcionais</w:t>
+        <w:t>Personalização de Atividades</w:t>
+      </w:r>
+      <w:r>
+        <w:rPr>
+          <w:rFonts w:ascii="Times New Roman" w:hAnsi="Times New Roman" w:eastAsia="Times New Roman" w:cs="Times New Roman"/>
+          <w:sz w:val="24"/>
+          <w:szCs w:val="24"/>
+        </w:rPr>
+        <w:t xml:space="preserve"> é o núcleo do sistema, pois o "</w:t>
+      </w:r>
+      <w:proofErr w:type="spellStart"/>
+      <w:r>
+        <w:rPr>
+          <w:rFonts w:ascii="Times New Roman" w:hAnsi="Times New Roman" w:eastAsia="Times New Roman" w:cs="Times New Roman"/>
+          <w:sz w:val="24"/>
+          <w:szCs w:val="24"/>
+        </w:rPr>
+        <w:t>Rationale</w:t>
+      </w:r>
+      <w:proofErr w:type="spellEnd"/>
+      <w:r>
+        <w:rPr>
+          <w:rFonts w:ascii="Times New Roman" w:hAnsi="Times New Roman" w:eastAsia="Times New Roman" w:cs="Times New Roman"/>
+          <w:sz w:val="24"/>
+          <w:szCs w:val="24"/>
+        </w:rPr>
+        <w:t>" pedagógico defende que cada criança interna possui um tempo de resposta e uma carga emocional distinta, exigindo um software flexível e não puramente genérico.</w:t>
       </w:r>
     </w:p>
     <w:p>
       <w:pPr>
         <w:spacing w:before="240" w:after="240" w:line="360" w:lineRule="auto"/>
-      </w:pPr>
-      <w:r>
-        <w:rPr>
-          <w:rFonts w:ascii="Times New Roman" w:hAnsi="Times New Roman" w:eastAsia="Times New Roman" w:cs="Times New Roman"/>
-          <w:sz w:val="24"/>
-          <w:szCs w:val="24"/>
-        </w:rPr>
-        <w:t xml:space="preserve">Os requisitos de </w:t>
-      </w:r>
-      <w:r>
-        <w:rPr>
-          <w:rFonts w:ascii="Times New Roman" w:hAnsi="Times New Roman" w:eastAsia="Times New Roman" w:cs="Times New Roman"/>
-          <w:b/>
-          <w:bCs/>
-          <w:sz w:val="24"/>
-          <w:szCs w:val="24"/>
-        </w:rPr>
-        <w:t>Cadastro e Autenticação</w:t>
-      </w:r>
-      <w:r>
-        <w:rPr>
-          <w:rFonts w:ascii="Times New Roman" w:hAnsi="Times New Roman" w:eastAsia="Times New Roman" w:cs="Times New Roman"/>
-          <w:sz w:val="24"/>
-          <w:szCs w:val="24"/>
-        </w:rPr>
-        <w:t xml:space="preserve"> foram priorizados para garantir a autoria das atividades e a segurança no ambiente hospitalar. A </w:t>
-      </w:r>
-      <w:r>
-        <w:rPr>
-          <w:rFonts w:ascii="Times New Roman" w:hAnsi="Times New Roman" w:eastAsia="Times New Roman" w:cs="Times New Roman"/>
-          <w:b/>
-          <w:bCs/>
-          <w:sz w:val="24"/>
-          <w:szCs w:val="24"/>
-        </w:rPr>
-        <w:t>Personalização de Atividades</w:t>
-      </w:r>
-      <w:r>
-        <w:rPr>
-          <w:rFonts w:ascii="Times New Roman" w:hAnsi="Times New Roman" w:eastAsia="Times New Roman" w:cs="Times New Roman"/>
-          <w:sz w:val="24"/>
-          <w:szCs w:val="24"/>
-        </w:rPr>
-        <w:t xml:space="preserve"> é o núcleo do sistema, pois o "</w:t>
-      </w:r>
-      <w:proofErr w:type="spellStart"/>
-      <w:r>
-        <w:rPr>
-          <w:rFonts w:ascii="Times New Roman" w:hAnsi="Times New Roman" w:eastAsia="Times New Roman" w:cs="Times New Roman"/>
-          <w:sz w:val="24"/>
-          <w:szCs w:val="24"/>
-        </w:rPr>
-        <w:t>Rationale</w:t>
-      </w:r>
-      <w:proofErr w:type="spellEnd"/>
-      <w:r>
-        <w:rPr>
-          <w:rFonts w:ascii="Times New Roman" w:hAnsi="Times New Roman" w:eastAsia="Times New Roman" w:cs="Times New Roman"/>
-          <w:sz w:val="24"/>
-          <w:szCs w:val="24"/>
-        </w:rPr>
-        <w:t>" pedagógico defende que cada criança interna possui um tempo de resposta e uma carga emocional distinta, exigindo um software flexível e não puramente genérico.</w:t>
-      </w:r>
-    </w:p>
-    <w:p>
-      <w:pPr>
-        <w:spacing w:before="240" w:after="240" w:line="360" w:lineRule="auto"/>
-        <w:rPr>
-          <w:rFonts w:ascii="Times New Roman" w:hAnsi="Times New Roman" w:eastAsia="Times New Roman" w:cs="Times New Roman"/>
-          <w:b/>
-          <w:bCs/>
-          <w:sz w:val="24"/>
-          <w:szCs w:val="24"/>
-        </w:rPr>
-      </w:pPr>
-      <w:r>
-        <w:rPr>
-          <w:rFonts w:ascii="Times New Roman" w:hAnsi="Times New Roman" w:eastAsia="Times New Roman" w:cs="Times New Roman"/>
-          <w:b/>
-          <w:bCs/>
-          <w:sz w:val="24"/>
-          <w:szCs w:val="24"/>
-        </w:rPr>
-        <w:t>6.3 Decisões sobre Requisitos Não Funcionais</w:t>
+        <w:rPr>
+          <w:rFonts w:ascii="Times New Roman" w:hAnsi="Times New Roman" w:eastAsia="Times New Roman" w:cs="Times New Roman"/>
+          <w:b w:val="1"/>
+          <w:bCs w:val="1"/>
+          <w:sz w:val="24"/>
+          <w:szCs w:val="24"/>
+        </w:rPr>
+      </w:pPr>
+      <w:r>
+        <w:rPr>
+          <w:rFonts w:ascii="Times New Roman" w:hAnsi="Times New Roman" w:eastAsia="Times New Roman" w:cs="Times New Roman"/>
+          <w:b w:val="1"/>
+          <w:bCs w:val="1"/>
+          <w:sz w:val="24"/>
+          <w:szCs w:val="24"/>
+        </w:rPr>
+        <w:t>Decisões sobre Requisitos Não Funcionais</w:t>
       </w:r>
     </w:p>
     <w:p>
@@ -3509,8 +3715,8 @@
       <w:r>
         <w:rPr>
           <w:rFonts w:ascii="Times New Roman" w:hAnsi="Times New Roman" w:eastAsia="Times New Roman" w:cs="Times New Roman"/>
-          <w:b/>
-          <w:bCs/>
+          <w:b w:val="1"/>
+          <w:bCs w:val="1"/>
           <w:sz w:val="24"/>
           <w:szCs w:val="24"/>
         </w:rPr>
@@ -3522,7 +3728,15 @@
           <w:sz w:val="24"/>
           <w:szCs w:val="24"/>
         </w:rPr>
-        <w:t xml:space="preserve"> Dado que o sistema lida com dados de menores e informações de saúde, a segurança não é apenas técnica, mas uma conformidade ética e legal obrigatória.</w:t>
+        <w:t xml:space="preserve"> Dado que o sistema lida com dados de menores e informações de saúde, a segurança não é apenas técnica, mas uma conformidade ética e legal obrigatória</w:t>
+      </w:r>
+      <w:r>
+        <w:rPr>
+          <w:rFonts w:ascii="Times New Roman" w:hAnsi="Times New Roman" w:eastAsia="Times New Roman" w:cs="Times New Roman"/>
+          <w:sz w:val="24"/>
+          <w:szCs w:val="24"/>
+        </w:rPr>
+        <w:t>;</w:t>
       </w:r>
     </w:p>
     <w:p>
@@ -3565,37 +3779,27 @@
         <w:spacing w:before="240" w:after="240" w:line="360" w:lineRule="auto"/>
         <w:rPr>
           <w:rFonts w:ascii="Times New Roman" w:hAnsi="Times New Roman" w:eastAsia="Times New Roman" w:cs="Times New Roman"/>
-          <w:b/>
-          <w:bCs/>
-          <w:sz w:val="24"/>
-          <w:szCs w:val="24"/>
-        </w:rPr>
-      </w:pPr>
-      <w:r>
-        <w:rPr>
-          <w:rFonts w:ascii="Times New Roman" w:hAnsi="Times New Roman" w:eastAsia="Times New Roman" w:cs="Times New Roman"/>
-          <w:b/>
-          <w:bCs/>
-          <w:sz w:val="24"/>
-          <w:szCs w:val="24"/>
-        </w:rPr>
-        <w:t>7</w:t>
-      </w:r>
-      <w:r>
-        <w:rPr>
-          <w:rFonts w:ascii="Times New Roman" w:hAnsi="Times New Roman" w:eastAsia="Times New Roman" w:cs="Times New Roman"/>
-          <w:b/>
-          <w:bCs/>
-          <w:sz w:val="24"/>
-          <w:szCs w:val="24"/>
-        </w:rPr>
-        <w:t>.</w:t>
-      </w:r>
-      <w:r>
-        <w:rPr>
-          <w:rFonts w:ascii="Times New Roman" w:hAnsi="Times New Roman" w:eastAsia="Times New Roman" w:cs="Times New Roman"/>
-          <w:b/>
-          <w:bCs/>
+          <w:b w:val="1"/>
+          <w:bCs w:val="1"/>
+          <w:sz w:val="24"/>
+          <w:szCs w:val="24"/>
+        </w:rPr>
+      </w:pPr>
+      <w:r>
+        <w:rPr>
+          <w:rFonts w:ascii="Times New Roman" w:hAnsi="Times New Roman" w:eastAsia="Times New Roman" w:cs="Times New Roman"/>
+          <w:b w:val="1"/>
+          <w:bCs w:val="1"/>
+          <w:sz w:val="24"/>
+          <w:szCs w:val="24"/>
+        </w:rPr>
+        <w:t>Análise</w:t>
+      </w:r>
+      <w:r>
+        <w:rPr>
+          <w:rFonts w:ascii="Times New Roman" w:hAnsi="Times New Roman" w:eastAsia="Times New Roman" w:cs="Times New Roman"/>
+          <w:b w:val="1"/>
+          <w:bCs w:val="1"/>
           <w:sz w:val="24"/>
           <w:szCs w:val="24"/>
         </w:rPr>
@@ -3604,8 +3808,129 @@
       <w:r>
         <w:rPr>
           <w:rFonts w:ascii="Times New Roman" w:hAnsi="Times New Roman" w:eastAsia="Times New Roman" w:cs="Times New Roman"/>
-          <w:b/>
-          <w:bCs/>
+          <w:b w:val="1"/>
+          <w:bCs w:val="1"/>
+          <w:sz w:val="24"/>
+          <w:szCs w:val="24"/>
+        </w:rPr>
+        <w:t>de Trade-</w:t>
+      </w:r>
+      <w:r>
+        <w:rPr>
+          <w:rFonts w:ascii="Times New Roman" w:hAnsi="Times New Roman" w:eastAsia="Times New Roman" w:cs="Times New Roman"/>
+          <w:b w:val="1"/>
+          <w:bCs w:val="1"/>
+          <w:sz w:val="24"/>
+          <w:szCs w:val="24"/>
+        </w:rPr>
+        <w:t>offs</w:t>
+      </w:r>
+      <w:r>
+        <w:br/>
+      </w:r>
+      <w:r>
+        <w:rPr>
+          <w:rFonts w:ascii="Times New Roman" w:hAnsi="Times New Roman" w:eastAsia="Times New Roman" w:cs="Times New Roman"/>
+          <w:sz w:val="24"/>
+          <w:szCs w:val="24"/>
+        </w:rPr>
+        <w:t>A definição da arquitetura deste sistema envolveu a análise de compromissos (</w:t>
+      </w:r>
+      <w:r>
+        <w:rPr>
+          <w:rFonts w:ascii="Times New Roman" w:hAnsi="Times New Roman" w:eastAsia="Times New Roman" w:cs="Times New Roman"/>
+          <w:i w:val="1"/>
+          <w:iCs w:val="1"/>
+          <w:sz w:val="24"/>
+          <w:szCs w:val="24"/>
+        </w:rPr>
+        <w:t>trade-</w:t>
+      </w:r>
+      <w:r>
+        <w:rPr>
+          <w:rFonts w:ascii="Times New Roman" w:hAnsi="Times New Roman" w:eastAsia="Times New Roman" w:cs="Times New Roman"/>
+          <w:i w:val="1"/>
+          <w:iCs w:val="1"/>
+          <w:sz w:val="24"/>
+          <w:szCs w:val="24"/>
+        </w:rPr>
+        <w:t>offs</w:t>
+      </w:r>
+      <w:r>
+        <w:rPr>
+          <w:rFonts w:ascii="Times New Roman" w:hAnsi="Times New Roman" w:eastAsia="Times New Roman" w:cs="Times New Roman"/>
+          <w:sz w:val="24"/>
+          <w:szCs w:val="24"/>
+        </w:rPr>
+        <w:t xml:space="preserve">) entre requisitos conflitantes, buscando o equilíbrio ideal entre a proteção de dados sensíveis </w:t>
+      </w:r>
+    </w:p>
+    <w:p>
+      <w:pPr>
+        <w:spacing w:after="0" w:line="360" w:lineRule="auto"/>
+        <w:rPr>
+          <w:rFonts w:ascii="Times New Roman" w:hAnsi="Times New Roman" w:eastAsia="Times New Roman" w:cs="Times New Roman"/>
+          <w:sz w:val="24"/>
+          <w:szCs w:val="24"/>
+        </w:rPr>
+      </w:pPr>
+      <w:r>
+        <w:rPr>
+          <w:rFonts w:ascii="Times New Roman" w:hAnsi="Times New Roman" w:eastAsia="Times New Roman" w:cs="Times New Roman"/>
+          <w:sz w:val="24"/>
+          <w:szCs w:val="24"/>
+        </w:rPr>
+        <w:t>a fluidez da experiência do usuário (especialmente crianças em ambiente hospitalar).</w:t>
+      </w:r>
+      <w:r>
+        <w:br/>
+      </w:r>
+    </w:p>
+    <w:p>
+      <w:pPr>
+        <w:spacing w:after="0" w:line="360" w:lineRule="auto"/>
+        <w:rPr>
+          <w:rFonts w:ascii="Times New Roman" w:hAnsi="Times New Roman" w:eastAsia="Times New Roman" w:cs="Times New Roman"/>
+          <w:b w:val="1"/>
+          <w:bCs w:val="1"/>
+          <w:color w:val="000000" w:themeColor="text1"/>
+          <w:sz w:val="24"/>
+          <w:szCs w:val="24"/>
+        </w:rPr>
+      </w:pPr>
+      <w:r>
+        <w:rPr>
+          <w:rFonts w:ascii="Times New Roman" w:hAnsi="Times New Roman" w:eastAsia="Times New Roman" w:cs="Times New Roman"/>
+          <w:b w:val="1"/>
+          <w:bCs w:val="1"/>
+          <w:color w:val="000000" w:themeColor="text1" w:themeTint="FF" w:themeShade="FF"/>
+          <w:sz w:val="24"/>
+          <w:szCs w:val="24"/>
+        </w:rPr>
+        <w:t>Segurança vs. Desempenho</w:t>
+      </w:r>
+    </w:p>
+    <w:p>
+      <w:pPr>
+        <w:spacing w:before="240" w:after="240" w:line="360" w:lineRule="auto"/>
+        <w:rPr>
+          <w:rFonts w:ascii="Times New Roman" w:hAnsi="Times New Roman" w:eastAsia="Times New Roman" w:cs="Times New Roman"/>
+          <w:sz w:val="24"/>
+          <w:szCs w:val="24"/>
+          <w:u w:val="single"/>
+        </w:rPr>
+      </w:pPr>
+      <w:r>
+        <w:rPr>
+          <w:rFonts w:ascii="Times New Roman" w:hAnsi="Times New Roman" w:eastAsia="Times New Roman" w:cs="Times New Roman"/>
+          <w:sz w:val="24"/>
+          <w:szCs w:val="24"/>
+        </w:rPr>
+        <w:t>A implementação de protocolos rigorosos de segurança,</w:t>
+      </w:r>
+      <w:r>
+        <w:rPr>
+          <w:rFonts w:ascii="Times New Roman" w:hAnsi="Times New Roman" w:eastAsia="Times New Roman" w:cs="Times New Roman"/>
           <w:sz w:val="24"/>
           <w:szCs w:val="24"/>
         </w:rPr>
@@ -3614,168 +3939,19 @@
       <w:r>
         <w:rPr>
           <w:rFonts w:ascii="Times New Roman" w:hAnsi="Times New Roman" w:eastAsia="Times New Roman" w:cs="Times New Roman"/>
-          <w:b/>
-          <w:bCs/>
-          <w:sz w:val="24"/>
-          <w:szCs w:val="24"/>
-        </w:rPr>
-        <w:t>Análise</w:t>
-      </w:r>
-      <w:r>
-        <w:rPr>
-          <w:rFonts w:ascii="Times New Roman" w:hAnsi="Times New Roman" w:eastAsia="Times New Roman" w:cs="Times New Roman"/>
-          <w:b/>
-          <w:bCs/>
-          <w:sz w:val="24"/>
-          <w:szCs w:val="24"/>
-        </w:rPr>
-        <w:t xml:space="preserve"> </w:t>
-      </w:r>
-      <w:r>
-        <w:rPr>
-          <w:rFonts w:ascii="Times New Roman" w:hAnsi="Times New Roman" w:eastAsia="Times New Roman" w:cs="Times New Roman"/>
-          <w:b/>
-          <w:bCs/>
-          <w:sz w:val="24"/>
-          <w:szCs w:val="24"/>
-        </w:rPr>
-        <w:t>de Trade-</w:t>
-      </w:r>
-      <w:proofErr w:type="spellStart"/>
-      <w:r>
-        <w:rPr>
-          <w:rFonts w:ascii="Times New Roman" w:hAnsi="Times New Roman" w:eastAsia="Times New Roman" w:cs="Times New Roman"/>
-          <w:b/>
-          <w:bCs/>
-          <w:sz w:val="24"/>
-          <w:szCs w:val="24"/>
-        </w:rPr>
-        <w:t>offs</w:t>
-      </w:r>
-      <w:proofErr w:type="spellEnd"/>
-      <w:r>
-        <w:br/>
-      </w:r>
-      <w:r>
-        <w:rPr>
-          <w:rFonts w:ascii="Times New Roman" w:hAnsi="Times New Roman" w:eastAsia="Times New Roman" w:cs="Times New Roman"/>
-          <w:sz w:val="24"/>
-          <w:szCs w:val="24"/>
-        </w:rPr>
-        <w:t>A definição da arquitetura deste sistema envolveu a análise de compromissos (</w:t>
-      </w:r>
-      <w:r>
-        <w:rPr>
-          <w:rFonts w:ascii="Times New Roman" w:hAnsi="Times New Roman" w:eastAsia="Times New Roman" w:cs="Times New Roman"/>
-          <w:i/>
-          <w:iCs/>
-          <w:sz w:val="24"/>
-          <w:szCs w:val="24"/>
-        </w:rPr>
-        <w:t>trade-</w:t>
-      </w:r>
-      <w:proofErr w:type="spellStart"/>
-      <w:r>
-        <w:rPr>
-          <w:rFonts w:ascii="Times New Roman" w:hAnsi="Times New Roman" w:eastAsia="Times New Roman" w:cs="Times New Roman"/>
-          <w:i/>
-          <w:iCs/>
-          <w:sz w:val="24"/>
-          <w:szCs w:val="24"/>
-        </w:rPr>
-        <w:t>offs</w:t>
-      </w:r>
-      <w:proofErr w:type="spellEnd"/>
-      <w:r>
-        <w:rPr>
-          <w:rFonts w:ascii="Times New Roman" w:hAnsi="Times New Roman" w:eastAsia="Times New Roman" w:cs="Times New Roman"/>
-          <w:sz w:val="24"/>
-          <w:szCs w:val="24"/>
-        </w:rPr>
-        <w:t xml:space="preserve">) entre requisitos conflitantes, buscando o equilíbrio ideal entre a proteção de dados sensíveis </w:t>
-      </w:r>
-    </w:p>
-    <w:p>
-      <w:pPr>
-        <w:spacing w:after="0" w:line="360" w:lineRule="auto"/>
-        <w:rPr>
-          <w:rFonts w:ascii="Times New Roman" w:hAnsi="Times New Roman" w:eastAsia="Times New Roman" w:cs="Times New Roman"/>
-          <w:sz w:val="24"/>
-          <w:szCs w:val="24"/>
-        </w:rPr>
-      </w:pPr>
-      <w:r>
-        <w:rPr>
-          <w:rFonts w:ascii="Times New Roman" w:hAnsi="Times New Roman" w:eastAsia="Times New Roman" w:cs="Times New Roman"/>
-          <w:sz w:val="24"/>
-          <w:szCs w:val="24"/>
-        </w:rPr>
-        <w:t>a fluidez da experiência do usuário (especialmente crianças em ambiente hospitalar).</w:t>
-      </w:r>
-      <w:r>
-        <w:br/>
-      </w:r>
-    </w:p>
-    <w:p>
-      <w:pPr>
-        <w:spacing w:after="0" w:line="360" w:lineRule="auto"/>
-        <w:rPr>
-          <w:rFonts w:ascii="Times New Roman" w:hAnsi="Times New Roman" w:eastAsia="Times New Roman" w:cs="Times New Roman"/>
-          <w:b/>
-          <w:bCs/>
-          <w:color w:val="000000" w:themeColor="text1"/>
-          <w:sz w:val="24"/>
-          <w:szCs w:val="24"/>
-        </w:rPr>
-      </w:pPr>
-      <w:r>
-        <w:rPr>
-          <w:rFonts w:ascii="Times New Roman" w:hAnsi="Times New Roman" w:eastAsia="Times New Roman" w:cs="Times New Roman"/>
-          <w:b/>
-          <w:bCs/>
-          <w:color w:val="000000" w:themeColor="text1"/>
-          <w:sz w:val="24"/>
-          <w:szCs w:val="24"/>
-        </w:rPr>
-        <w:t>7.1 Segurança vs. Desempenho</w:t>
-      </w:r>
-    </w:p>
-    <w:p>
-      <w:pPr>
-        <w:spacing w:before="240" w:after="240" w:line="360" w:lineRule="auto"/>
-        <w:rPr>
-          <w:rFonts w:ascii="Times New Roman" w:hAnsi="Times New Roman" w:eastAsia="Times New Roman" w:cs="Times New Roman"/>
-          <w:sz w:val="24"/>
-          <w:szCs w:val="24"/>
-          <w:u w:val="single"/>
-        </w:rPr>
-      </w:pPr>
-      <w:r>
-        <w:rPr>
-          <w:rFonts w:ascii="Times New Roman" w:hAnsi="Times New Roman" w:eastAsia="Times New Roman" w:cs="Times New Roman"/>
-          <w:sz w:val="24"/>
-          <w:szCs w:val="24"/>
-        </w:rPr>
-        <w:t>A implementação de protocolos rigorosos de segurança,</w:t>
-      </w:r>
-      <w:r>
-        <w:rPr>
-          <w:rFonts w:ascii="Times New Roman" w:hAnsi="Times New Roman" w:eastAsia="Times New Roman" w:cs="Times New Roman"/>
-          <w:sz w:val="24"/>
-          <w:szCs w:val="24"/>
-        </w:rPr>
-        <w:t xml:space="preserve"> </w:t>
-      </w:r>
-      <w:proofErr w:type="spellStart"/>
-      <w:r>
-        <w:rPr>
-          <w:rFonts w:ascii="Times New Roman" w:hAnsi="Times New Roman" w:eastAsia="Times New Roman" w:cs="Times New Roman"/>
           <w:sz w:val="24"/>
           <w:szCs w:val="24"/>
         </w:rPr>
         <w:t>hash</w:t>
       </w:r>
-      <w:proofErr w:type="spellEnd"/>
+      <w:r>
+        <w:rPr>
+          <w:rFonts w:ascii="Times New Roman" w:hAnsi="Times New Roman" w:eastAsia="Times New Roman" w:cs="Times New Roman"/>
+          <w:sz w:val="24"/>
+          <w:szCs w:val="24"/>
+        </w:rPr>
+        <w:t>ing</w:t>
+      </w:r>
       <w:r>
         <w:rPr>
           <w:rFonts w:ascii="Times New Roman" w:hAnsi="Times New Roman" w:eastAsia="Times New Roman" w:cs="Times New Roman"/>
@@ -3865,8 +4041,8 @@
         <w:spacing w:before="240" w:after="240" w:line="360" w:lineRule="auto"/>
         <w:rPr>
           <w:rFonts w:ascii="Times New Roman" w:hAnsi="Times New Roman" w:eastAsia="Times New Roman" w:cs="Times New Roman"/>
-          <w:b/>
-          <w:bCs/>
+          <w:b w:val="1"/>
+          <w:bCs w:val="1"/>
           <w:color w:val="000000" w:themeColor="text1"/>
           <w:sz w:val="24"/>
           <w:szCs w:val="24"/>
@@ -3875,35 +4051,13 @@
       <w:r>
         <w:rPr>
           <w:rFonts w:ascii="Times New Roman" w:hAnsi="Times New Roman" w:eastAsia="Times New Roman" w:cs="Times New Roman"/>
-          <w:b/>
-          <w:bCs/>
-          <w:color w:val="000000" w:themeColor="text1"/>
-          <w:sz w:val="24"/>
-          <w:szCs w:val="24"/>
-        </w:rPr>
-        <w:t>7.</w:t>
-      </w:r>
-      <w:r>
-        <w:rPr>
-          <w:rFonts w:ascii="Times New Roman" w:hAnsi="Times New Roman" w:eastAsia="Times New Roman" w:cs="Times New Roman"/>
-          <w:b/>
-          <w:bCs/>
-          <w:color w:val="000000" w:themeColor="text1"/>
-          <w:sz w:val="24"/>
-          <w:szCs w:val="24"/>
-        </w:rPr>
-        <w:t>2</w:t>
-      </w:r>
-      <w:r>
-        <w:rPr>
-          <w:rFonts w:ascii="Times New Roman" w:hAnsi="Times New Roman" w:eastAsia="Times New Roman" w:cs="Times New Roman"/>
-          <w:b/>
-          <w:bCs/>
-          <w:color w:val="000000" w:themeColor="text1"/>
-          <w:sz w:val="24"/>
-          <w:szCs w:val="24"/>
-        </w:rPr>
-        <w:t xml:space="preserve"> Robustez vs. Usabilidade</w:t>
+          <w:b w:val="1"/>
+          <w:bCs w:val="1"/>
+          <w:color w:val="000000" w:themeColor="text1" w:themeTint="FF" w:themeShade="FF"/>
+          <w:sz w:val="24"/>
+          <w:szCs w:val="24"/>
+        </w:rPr>
+        <w:t>Robustez vs. Usabilidade</w:t>
       </w:r>
     </w:p>
     <w:p>
@@ -3944,8 +4098,8 @@
       <w:r>
         <w:rPr>
           <w:rFonts w:ascii="Times New Roman" w:hAnsi="Times New Roman" w:eastAsia="Times New Roman" w:cs="Times New Roman"/>
-          <w:b/>
-          <w:bCs/>
+          <w:b w:val="1"/>
+          <w:bCs w:val="1"/>
           <w:sz w:val="24"/>
           <w:szCs w:val="24"/>
         </w:rPr>
@@ -3957,7 +4111,15 @@
           <w:sz w:val="24"/>
           <w:szCs w:val="24"/>
         </w:rPr>
-        <w:t xml:space="preserve"> em chamadas de API de IA evitando que a interface "trave" enquanto o sistema processa a personalização da atividade.</w:t>
+        <w:t xml:space="preserve"> em chamadas de API de IA evitando que a interface "trave" enquanto o sistema processa a personalização da atividade</w:t>
+      </w:r>
+      <w:r>
+        <w:rPr>
+          <w:rFonts w:ascii="Times New Roman" w:hAnsi="Times New Roman" w:eastAsia="Times New Roman" w:cs="Times New Roman"/>
+          <w:sz w:val="24"/>
+          <w:szCs w:val="24"/>
+        </w:rPr>
+        <w:t>;</w:t>
       </w:r>
     </w:p>
     <w:p>
@@ -4028,12 +4190,129 @@
         <w:spacing w:before="240" w:after="240" w:line="360" w:lineRule="auto"/>
         <w:rPr>
           <w:rFonts w:ascii="Times New Roman" w:hAnsi="Times New Roman" w:eastAsia="Times New Roman" w:cs="Times New Roman"/>
+          <w:b w:val="1"/>
+          <w:bCs w:val="1"/>
+          <w:sz w:val="24"/>
+          <w:szCs w:val="24"/>
+        </w:rPr>
+      </w:pPr>
+      <w:r>
+        <w:rPr>
+          <w:rFonts w:ascii="Times New Roman" w:hAnsi="Times New Roman" w:eastAsia="Times New Roman" w:cs="Times New Roman"/>
+          <w:b w:val="1"/>
+          <w:bCs w:val="1"/>
+          <w:sz w:val="24"/>
+          <w:szCs w:val="24"/>
+        </w:rPr>
+        <w:t>Segurança de Dados (LGPD e ECA)</w:t>
+      </w:r>
+      <w:r>
+        <w:br/>
+      </w:r>
+    </w:p>
+    <w:p>
+      <w:pPr>
+        <w:spacing w:before="240" w:after="240" w:line="360" w:lineRule="auto"/>
+        <w:rPr>
+          <w:rFonts w:ascii="Times New Roman" w:hAnsi="Times New Roman" w:eastAsia="Times New Roman" w:cs="Times New Roman"/>
+          <w:sz w:val="24"/>
+          <w:szCs w:val="24"/>
+        </w:rPr>
+      </w:pPr>
+      <w:r>
+        <w:rPr>
+          <w:rFonts w:ascii="Times New Roman" w:hAnsi="Times New Roman" w:eastAsia="Times New Roman" w:cs="Times New Roman"/>
+          <w:sz w:val="24"/>
+          <w:szCs w:val="24"/>
+        </w:rPr>
+        <w:t xml:space="preserve">O tratamento de dados no </w:t>
+      </w:r>
+      <w:r>
+        <w:rPr>
+          <w:rFonts w:ascii="Times New Roman" w:hAnsi="Times New Roman" w:eastAsia="Times New Roman" w:cs="Times New Roman"/>
           <w:b/>
           <w:bCs/>
           <w:sz w:val="24"/>
           <w:szCs w:val="24"/>
         </w:rPr>
-      </w:pPr>
+        <w:t>Sistema de Apoio à Alfabetização Hospitalar</w:t>
+      </w:r>
+      <w:r>
+        <w:rPr>
+          <w:rFonts w:ascii="Times New Roman" w:hAnsi="Times New Roman" w:eastAsia="Times New Roman" w:cs="Times New Roman"/>
+          <w:sz w:val="24"/>
+          <w:szCs w:val="24"/>
+        </w:rPr>
+        <w:t xml:space="preserve"> é regido </w:t>
+      </w:r>
+      <w:r>
+        <w:rPr>
+          <w:rFonts w:ascii="Times New Roman" w:hAnsi="Times New Roman" w:eastAsia="Times New Roman" w:cs="Times New Roman"/>
+          <w:sz w:val="24"/>
+          <w:szCs w:val="24"/>
+        </w:rPr>
+        <w:t>pelo princípio</w:t>
+      </w:r>
+      <w:r>
+        <w:rPr>
+          <w:rFonts w:ascii="Times New Roman" w:hAnsi="Times New Roman" w:eastAsia="Times New Roman" w:cs="Times New Roman"/>
+          <w:sz w:val="24"/>
+          <w:szCs w:val="24"/>
+        </w:rPr>
+        <w:t xml:space="preserve"> da "Privacidade por Design" (</w:t>
+      </w:r>
+      <w:proofErr w:type="spellStart"/>
+      <w:r>
+        <w:rPr>
+          <w:rFonts w:ascii="Times New Roman" w:hAnsi="Times New Roman" w:eastAsia="Times New Roman" w:cs="Times New Roman"/>
+          <w:i/>
+          <w:iCs/>
+          <w:sz w:val="24"/>
+          <w:szCs w:val="24"/>
+        </w:rPr>
+        <w:t>Privacy</w:t>
+      </w:r>
+      <w:proofErr w:type="spellEnd"/>
+      <w:r>
+        <w:rPr>
+          <w:rFonts w:ascii="Times New Roman" w:hAnsi="Times New Roman" w:eastAsia="Times New Roman" w:cs="Times New Roman"/>
+          <w:i/>
+          <w:iCs/>
+          <w:sz w:val="24"/>
+          <w:szCs w:val="24"/>
+        </w:rPr>
+        <w:t xml:space="preserve"> </w:t>
+      </w:r>
+      <w:proofErr w:type="spellStart"/>
+      <w:r>
+        <w:rPr>
+          <w:rFonts w:ascii="Times New Roman" w:hAnsi="Times New Roman" w:eastAsia="Times New Roman" w:cs="Times New Roman"/>
+          <w:i/>
+          <w:iCs/>
+          <w:sz w:val="24"/>
+          <w:szCs w:val="24"/>
+        </w:rPr>
+        <w:t>by</w:t>
+      </w:r>
+      <w:proofErr w:type="spellEnd"/>
+      <w:r>
+        <w:rPr>
+          <w:rFonts w:ascii="Times New Roman" w:hAnsi="Times New Roman" w:eastAsia="Times New Roman" w:cs="Times New Roman"/>
+          <w:i/>
+          <w:iCs/>
+          <w:sz w:val="24"/>
+          <w:szCs w:val="24"/>
+        </w:rPr>
+        <w:t xml:space="preserve"> Design</w:t>
+      </w:r>
+      <w:r>
+        <w:rPr>
+          <w:rFonts w:ascii="Times New Roman" w:hAnsi="Times New Roman" w:eastAsia="Times New Roman" w:cs="Times New Roman"/>
+          <w:sz w:val="24"/>
+          <w:szCs w:val="24"/>
+        </w:rPr>
+        <w:t xml:space="preserve">), garantindo conformidade com a </w:t>
+      </w:r>
       <w:r>
         <w:rPr>
           <w:rFonts w:ascii="Times New Roman" w:hAnsi="Times New Roman" w:eastAsia="Times New Roman" w:cs="Times New Roman"/>
@@ -4042,7 +4321,15 @@
           <w:sz w:val="24"/>
           <w:szCs w:val="24"/>
         </w:rPr>
-        <w:t>8.</w:t>
+        <w:t>LGPD (Lei 13.709/2018)</w:t>
+      </w:r>
+      <w:r>
+        <w:rPr>
+          <w:rFonts w:ascii="Times New Roman" w:hAnsi="Times New Roman" w:eastAsia="Times New Roman" w:cs="Times New Roman"/>
+          <w:sz w:val="24"/>
+          <w:szCs w:val="24"/>
+        </w:rPr>
+        <w:t xml:space="preserve"> e o </w:t>
       </w:r>
       <w:r>
         <w:rPr>
@@ -4052,10 +4339,15 @@
           <w:sz w:val="24"/>
           <w:szCs w:val="24"/>
         </w:rPr>
-        <w:t xml:space="preserve"> Segurança de Dados (LGPD e ECA)</w:t>
-      </w:r>
-      <w:r>
-        <w:br/>
+        <w:t>ECA (Lei 8.069/1990)</w:t>
+      </w:r>
+      <w:r>
+        <w:rPr>
+          <w:rFonts w:ascii="Times New Roman" w:hAnsi="Times New Roman" w:eastAsia="Times New Roman" w:cs="Times New Roman"/>
+          <w:sz w:val="24"/>
+          <w:szCs w:val="24"/>
+        </w:rPr>
+        <w:t>.</w:t>
       </w:r>
     </w:p>
     <w:p>
@@ -4063,161 +4355,21 @@
         <w:spacing w:before="240" w:after="240" w:line="360" w:lineRule="auto"/>
         <w:rPr>
           <w:rFonts w:ascii="Times New Roman" w:hAnsi="Times New Roman" w:eastAsia="Times New Roman" w:cs="Times New Roman"/>
-          <w:sz w:val="24"/>
-          <w:szCs w:val="24"/>
-        </w:rPr>
-      </w:pPr>
-      <w:r>
-        <w:rPr>
-          <w:rFonts w:ascii="Times New Roman" w:hAnsi="Times New Roman" w:eastAsia="Times New Roman" w:cs="Times New Roman"/>
-          <w:sz w:val="24"/>
-          <w:szCs w:val="24"/>
-        </w:rPr>
-        <w:t xml:space="preserve">O tratamento de dados no </w:t>
-      </w:r>
-      <w:r>
-        <w:rPr>
-          <w:rFonts w:ascii="Times New Roman" w:hAnsi="Times New Roman" w:eastAsia="Times New Roman" w:cs="Times New Roman"/>
-          <w:b/>
-          <w:bCs/>
-          <w:sz w:val="24"/>
-          <w:szCs w:val="24"/>
-        </w:rPr>
-        <w:t>Sistema de Apoio à Alfabetização Hospitalar</w:t>
-      </w:r>
-      <w:r>
-        <w:rPr>
-          <w:rFonts w:ascii="Times New Roman" w:hAnsi="Times New Roman" w:eastAsia="Times New Roman" w:cs="Times New Roman"/>
-          <w:sz w:val="24"/>
-          <w:szCs w:val="24"/>
-        </w:rPr>
-        <w:t xml:space="preserve"> é regido </w:t>
-      </w:r>
-      <w:r>
-        <w:rPr>
-          <w:rFonts w:ascii="Times New Roman" w:hAnsi="Times New Roman" w:eastAsia="Times New Roman" w:cs="Times New Roman"/>
-          <w:sz w:val="24"/>
-          <w:szCs w:val="24"/>
-        </w:rPr>
-        <w:t>pelo princípio</w:t>
-      </w:r>
-      <w:r>
-        <w:rPr>
-          <w:rFonts w:ascii="Times New Roman" w:hAnsi="Times New Roman" w:eastAsia="Times New Roman" w:cs="Times New Roman"/>
-          <w:sz w:val="24"/>
-          <w:szCs w:val="24"/>
-        </w:rPr>
-        <w:t xml:space="preserve"> da "Privacidade por Design" (</w:t>
-      </w:r>
-      <w:proofErr w:type="spellStart"/>
-      <w:r>
-        <w:rPr>
-          <w:rFonts w:ascii="Times New Roman" w:hAnsi="Times New Roman" w:eastAsia="Times New Roman" w:cs="Times New Roman"/>
-          <w:i/>
-          <w:iCs/>
-          <w:sz w:val="24"/>
-          <w:szCs w:val="24"/>
-        </w:rPr>
-        <w:t>Privacy</w:t>
-      </w:r>
-      <w:proofErr w:type="spellEnd"/>
-      <w:r>
-        <w:rPr>
-          <w:rFonts w:ascii="Times New Roman" w:hAnsi="Times New Roman" w:eastAsia="Times New Roman" w:cs="Times New Roman"/>
-          <w:i/>
-          <w:iCs/>
-          <w:sz w:val="24"/>
-          <w:szCs w:val="24"/>
-        </w:rPr>
-        <w:t xml:space="preserve"> </w:t>
-      </w:r>
-      <w:proofErr w:type="spellStart"/>
-      <w:r>
-        <w:rPr>
-          <w:rFonts w:ascii="Times New Roman" w:hAnsi="Times New Roman" w:eastAsia="Times New Roman" w:cs="Times New Roman"/>
-          <w:i/>
-          <w:iCs/>
-          <w:sz w:val="24"/>
-          <w:szCs w:val="24"/>
-        </w:rPr>
-        <w:t>by</w:t>
-      </w:r>
-      <w:proofErr w:type="spellEnd"/>
-      <w:r>
-        <w:rPr>
-          <w:rFonts w:ascii="Times New Roman" w:hAnsi="Times New Roman" w:eastAsia="Times New Roman" w:cs="Times New Roman"/>
-          <w:i/>
-          <w:iCs/>
-          <w:sz w:val="24"/>
-          <w:szCs w:val="24"/>
-        </w:rPr>
-        <w:t xml:space="preserve"> Design</w:t>
-      </w:r>
-      <w:r>
-        <w:rPr>
-          <w:rFonts w:ascii="Times New Roman" w:hAnsi="Times New Roman" w:eastAsia="Times New Roman" w:cs="Times New Roman"/>
-          <w:sz w:val="24"/>
-          <w:szCs w:val="24"/>
-        </w:rPr>
-        <w:t xml:space="preserve">), garantindo conformidade com a </w:t>
-      </w:r>
-      <w:r>
-        <w:rPr>
-          <w:rFonts w:ascii="Times New Roman" w:hAnsi="Times New Roman" w:eastAsia="Times New Roman" w:cs="Times New Roman"/>
-          <w:b/>
-          <w:bCs/>
-          <w:sz w:val="24"/>
-          <w:szCs w:val="24"/>
-        </w:rPr>
-        <w:t>LGPD (Lei 13.709/2018)</w:t>
-      </w:r>
-      <w:r>
-        <w:rPr>
-          <w:rFonts w:ascii="Times New Roman" w:hAnsi="Times New Roman" w:eastAsia="Times New Roman" w:cs="Times New Roman"/>
-          <w:sz w:val="24"/>
-          <w:szCs w:val="24"/>
-        </w:rPr>
-        <w:t xml:space="preserve"> e o </w:t>
-      </w:r>
-      <w:r>
-        <w:rPr>
-          <w:rFonts w:ascii="Times New Roman" w:hAnsi="Times New Roman" w:eastAsia="Times New Roman" w:cs="Times New Roman"/>
-          <w:b/>
-          <w:bCs/>
-          <w:sz w:val="24"/>
-          <w:szCs w:val="24"/>
-        </w:rPr>
-        <w:t>ECA (Lei 8.069/1990)</w:t>
-      </w:r>
-      <w:r>
-        <w:rPr>
-          <w:rFonts w:ascii="Times New Roman" w:hAnsi="Times New Roman" w:eastAsia="Times New Roman" w:cs="Times New Roman"/>
-          <w:sz w:val="24"/>
-          <w:szCs w:val="24"/>
-        </w:rPr>
-        <w:t>.</w:t>
-      </w:r>
-    </w:p>
-    <w:p>
-      <w:pPr>
-        <w:spacing w:before="240" w:after="240" w:line="360" w:lineRule="auto"/>
-        <w:rPr>
-          <w:rFonts w:ascii="Times New Roman" w:hAnsi="Times New Roman" w:eastAsia="Times New Roman" w:cs="Times New Roman"/>
-          <w:b/>
-          <w:bCs/>
-          <w:sz w:val="24"/>
-          <w:szCs w:val="24"/>
-        </w:rPr>
-      </w:pPr>
-      <w:r>
-        <w:rPr>
-          <w:rFonts w:ascii="Times New Roman" w:hAnsi="Times New Roman" w:eastAsia="Times New Roman" w:cs="Times New Roman"/>
-          <w:b/>
-          <w:bCs/>
-          <w:sz w:val="24"/>
-          <w:szCs w:val="24"/>
-        </w:rPr>
-        <w:t>8.1 Proteção de Dados de Menores (ECA)</w:t>
+          <w:b w:val="1"/>
+          <w:bCs w:val="1"/>
+          <w:sz w:val="24"/>
+          <w:szCs w:val="24"/>
+        </w:rPr>
+      </w:pPr>
+      <w:r>
+        <w:rPr>
+          <w:rFonts w:ascii="Times New Roman" w:hAnsi="Times New Roman" w:eastAsia="Times New Roman" w:cs="Times New Roman"/>
+          <w:b w:val="1"/>
+          <w:bCs w:val="1"/>
+          <w:sz w:val="24"/>
+          <w:szCs w:val="24"/>
+        </w:rPr>
+        <w:t>Proteção de Dados de Menores (ECA)</w:t>
       </w:r>
     </w:p>
     <w:p>
@@ -4268,8 +4420,8 @@
       <w:r>
         <w:rPr>
           <w:rFonts w:ascii="Times New Roman" w:hAnsi="Times New Roman" w:eastAsia="Times New Roman" w:cs="Times New Roman"/>
-          <w:b/>
-          <w:bCs/>
+          <w:b w:val="1"/>
+          <w:bCs w:val="1"/>
           <w:sz w:val="24"/>
           <w:szCs w:val="24"/>
         </w:rPr>
@@ -4281,7 +4433,15 @@
           <w:sz w:val="24"/>
           <w:szCs w:val="24"/>
         </w:rPr>
-        <w:t xml:space="preserve"> O acesso aos dados pedagógicos e de saúde exige a autorização prévia e clara dos responsáveis legais.</w:t>
+        <w:t xml:space="preserve"> O acesso aos dados pedagógicos e de saúde exige a autorização prévia e clara dos responsáveis legais</w:t>
+      </w:r>
+      <w:r>
+        <w:rPr>
+          <w:rFonts w:ascii="Times New Roman" w:hAnsi="Times New Roman" w:eastAsia="Times New Roman" w:cs="Times New Roman"/>
+          <w:sz w:val="24"/>
+          <w:szCs w:val="24"/>
+        </w:rPr>
+        <w:t>;</w:t>
       </w:r>
     </w:p>
     <w:p>
@@ -4322,41 +4482,21 @@
         <w:spacing w:before="240" w:after="240" w:line="360" w:lineRule="auto"/>
         <w:rPr>
           <w:rFonts w:ascii="Times New Roman" w:hAnsi="Times New Roman" w:eastAsia="Times New Roman" w:cs="Times New Roman"/>
-          <w:b/>
-          <w:bCs/>
-          <w:sz w:val="24"/>
-          <w:szCs w:val="24"/>
-        </w:rPr>
-      </w:pPr>
-      <w:r>
-        <w:rPr>
-          <w:rFonts w:ascii="Times New Roman" w:hAnsi="Times New Roman" w:eastAsia="Times New Roman" w:cs="Times New Roman"/>
-          <w:b/>
-          <w:bCs/>
-          <w:sz w:val="24"/>
-          <w:szCs w:val="24"/>
-        </w:rPr>
-        <w:t>8.</w:t>
-      </w:r>
-      <w:r>
-        <w:rPr>
-          <w:rFonts w:ascii="Times New Roman" w:hAnsi="Times New Roman" w:eastAsia="Times New Roman" w:cs="Times New Roman"/>
-          <w:b/>
-          <w:bCs/>
-          <w:sz w:val="24"/>
-          <w:szCs w:val="24"/>
-        </w:rPr>
-        <w:t>2</w:t>
-      </w:r>
-      <w:r>
-        <w:rPr>
-          <w:rFonts w:ascii="Times New Roman" w:hAnsi="Times New Roman" w:eastAsia="Times New Roman" w:cs="Times New Roman"/>
-          <w:b/>
-          <w:bCs/>
-          <w:sz w:val="24"/>
-          <w:szCs w:val="24"/>
-        </w:rPr>
-        <w:t xml:space="preserve"> Medidas Técnicas de Segurança</w:t>
+          <w:b w:val="1"/>
+          <w:bCs w:val="1"/>
+          <w:sz w:val="24"/>
+          <w:szCs w:val="24"/>
+        </w:rPr>
+      </w:pPr>
+      <w:r>
+        <w:rPr>
+          <w:rFonts w:ascii="Times New Roman" w:hAnsi="Times New Roman" w:eastAsia="Times New Roman" w:cs="Times New Roman"/>
+          <w:b w:val="1"/>
+          <w:bCs w:val="1"/>
+          <w:sz w:val="24"/>
+          <w:szCs w:val="24"/>
+        </w:rPr>
+        <w:t>Medidas Técnicas de Segurança</w:t>
       </w:r>
     </w:p>
     <w:p>
@@ -4376,8 +4516,8 @@
       <w:r>
         <w:rPr>
           <w:rFonts w:ascii="Times New Roman" w:hAnsi="Times New Roman" w:eastAsia="Times New Roman" w:cs="Times New Roman"/>
-          <w:b/>
-          <w:bCs/>
+          <w:b w:val="1"/>
+          <w:bCs w:val="1"/>
           <w:sz w:val="24"/>
           <w:szCs w:val="24"/>
         </w:rPr>
@@ -4389,7 +4529,15 @@
           <w:sz w:val="24"/>
           <w:szCs w:val="24"/>
         </w:rPr>
-        <w:t xml:space="preserve"> Em relatórios estatísticos ou de pesquisa, os nomes dos alunos são substituídos por identificadores únicos não rastreáveis.</w:t>
+        <w:t xml:space="preserve"> Em relatórios estatísticos ou de pesquisa, os nomes dos alunos são substituídos por identificadores únicos não rastreáveis</w:t>
+      </w:r>
+      <w:r>
+        <w:rPr>
+          <w:rFonts w:ascii="Times New Roman" w:hAnsi="Times New Roman" w:eastAsia="Times New Roman" w:cs="Times New Roman"/>
+          <w:sz w:val="24"/>
+          <w:szCs w:val="24"/>
+        </w:rPr>
+        <w:t>;</w:t>
       </w:r>
     </w:p>
     <w:p>
@@ -4448,41 +4596,31 @@
         <w:spacing w:before="240" w:after="240" w:line="360" w:lineRule="auto"/>
         <w:rPr>
           <w:rFonts w:ascii="Times New Roman" w:hAnsi="Times New Roman" w:eastAsia="Times New Roman" w:cs="Times New Roman"/>
-          <w:b/>
-          <w:bCs/>
-          <w:sz w:val="24"/>
-          <w:szCs w:val="24"/>
-        </w:rPr>
-      </w:pPr>
-      <w:r>
-        <w:rPr>
-          <w:rFonts w:ascii="Times New Roman" w:hAnsi="Times New Roman" w:eastAsia="Times New Roman" w:cs="Times New Roman"/>
-          <w:b/>
-          <w:bCs/>
-          <w:sz w:val="24"/>
-          <w:szCs w:val="24"/>
-        </w:rPr>
-        <w:t>8.</w:t>
-      </w:r>
-      <w:r>
-        <w:rPr>
-          <w:rFonts w:ascii="Times New Roman" w:hAnsi="Times New Roman" w:eastAsia="Times New Roman" w:cs="Times New Roman"/>
-          <w:b/>
-          <w:bCs/>
-          <w:sz w:val="24"/>
-          <w:szCs w:val="24"/>
-        </w:rPr>
-        <w:t>3</w:t>
-      </w:r>
-      <w:r>
-        <w:rPr>
-          <w:rFonts w:ascii="Times New Roman" w:hAnsi="Times New Roman" w:eastAsia="Times New Roman" w:cs="Times New Roman"/>
-          <w:b/>
-          <w:bCs/>
-          <w:sz w:val="24"/>
-          <w:szCs w:val="24"/>
-        </w:rPr>
-        <w:t xml:space="preserve"> Fortalecimento da Segurança via Design Arquitetural</w:t>
+          <w:b w:val="1"/>
+          <w:bCs w:val="1"/>
+          <w:sz w:val="24"/>
+          <w:szCs w:val="24"/>
+        </w:rPr>
+      </w:pPr>
+      <w:r>
+        <w:rPr>
+          <w:rFonts w:ascii="Times New Roman" w:hAnsi="Times New Roman" w:eastAsia="Times New Roman" w:cs="Times New Roman"/>
+          <w:b w:val="1"/>
+          <w:bCs w:val="1"/>
+          <w:sz w:val="24"/>
+          <w:szCs w:val="24"/>
+        </w:rPr>
+        <w:t>Fortalecimento da Segurança via Design Arquitetural</w:t>
+      </w:r>
+      <w:r>
+        <w:rPr>
+          <w:rFonts w:ascii="Times New Roman" w:hAnsi="Times New Roman" w:eastAsia="Times New Roman" w:cs="Times New Roman"/>
+          <w:b w:val="1"/>
+          <w:bCs w:val="1"/>
+          <w:sz w:val="24"/>
+          <w:szCs w:val="24"/>
+        </w:rPr>
+        <w:t>:</w:t>
       </w:r>
       <w:r>
         <w:rPr>
@@ -4607,15 +4745,39 @@
           <w:sz w:val="24"/>
           <w:szCs w:val="24"/>
         </w:rPr>
-        <w:t>Frontend</w:t>
-      </w:r>
-      <w:r>
-        <w:rPr>
-          <w:rFonts w:ascii="Times New Roman" w:hAnsi="Times New Roman" w:eastAsia="Times New Roman" w:cs="Times New Roman"/>
-          <w:sz w:val="24"/>
-          <w:szCs w:val="24"/>
-        </w:rPr>
-        <w:t>) exponham variáveis de ambiente críticas.</w:t>
+        <w:t>Front</w:t>
+      </w:r>
+      <w:r>
+        <w:rPr>
+          <w:rFonts w:ascii="Times New Roman" w:hAnsi="Times New Roman" w:eastAsia="Times New Roman" w:cs="Times New Roman"/>
+          <w:sz w:val="24"/>
+          <w:szCs w:val="24"/>
+        </w:rPr>
+        <w:t>-</w:t>
+      </w:r>
+      <w:r>
+        <w:rPr>
+          <w:rFonts w:ascii="Times New Roman" w:hAnsi="Times New Roman" w:eastAsia="Times New Roman" w:cs="Times New Roman"/>
+          <w:sz w:val="24"/>
+          <w:szCs w:val="24"/>
+        </w:rPr>
+        <w:t>end</w:t>
+      </w:r>
+      <w:r>
+        <w:rPr>
+          <w:rFonts w:ascii="Times New Roman" w:hAnsi="Times New Roman" w:eastAsia="Times New Roman" w:cs="Times New Roman"/>
+          <w:sz w:val="24"/>
+          <w:szCs w:val="24"/>
+        </w:rPr>
+        <w:t>) exponham variáveis de ambiente críticas</w:t>
+      </w:r>
+      <w:r>
+        <w:rPr>
+          <w:rFonts w:ascii="Times New Roman" w:hAnsi="Times New Roman" w:eastAsia="Times New Roman" w:cs="Times New Roman"/>
+          <w:sz w:val="24"/>
+          <w:szCs w:val="24"/>
+        </w:rPr>
+        <w:t>;</w:t>
       </w:r>
     </w:p>
     <w:p>
@@ -4712,7 +4874,7 @@
           <w:sz w:val="24"/>
           <w:szCs w:val="24"/>
         </w:rPr>
-        <w:t>.</w:t>
+        <w:t>;</w:t>
       </w:r>
     </w:p>
     <w:p>
@@ -4794,184 +4956,199 @@
         <w:spacing w:before="240" w:after="240" w:line="360" w:lineRule="auto"/>
         <w:rPr>
           <w:rFonts w:ascii="Times New Roman" w:hAnsi="Times New Roman" w:eastAsia="Times New Roman" w:cs="Times New Roman"/>
-          <w:b/>
-          <w:bCs/>
-          <w:sz w:val="24"/>
-          <w:szCs w:val="24"/>
-        </w:rPr>
-      </w:pPr>
-      <w:r>
-        <w:rPr>
-          <w:rFonts w:ascii="Times New Roman" w:hAnsi="Times New Roman" w:eastAsia="Times New Roman" w:cs="Times New Roman"/>
-          <w:b/>
-          <w:bCs/>
-          <w:sz w:val="24"/>
-          <w:szCs w:val="24"/>
-        </w:rPr>
-        <w:t>9</w:t>
-      </w:r>
-      <w:r>
-        <w:rPr>
-          <w:rFonts w:ascii="Times New Roman" w:hAnsi="Times New Roman" w:eastAsia="Times New Roman" w:cs="Times New Roman"/>
-          <w:b/>
-          <w:bCs/>
-          <w:sz w:val="24"/>
-          <w:szCs w:val="24"/>
-        </w:rPr>
-        <w:t>.</w:t>
-      </w:r>
-      <w:r>
-        <w:rPr>
-          <w:rFonts w:ascii="Times New Roman" w:hAnsi="Times New Roman" w:eastAsia="Times New Roman" w:cs="Times New Roman"/>
-          <w:b/>
-          <w:bCs/>
+          <w:b w:val="1"/>
+          <w:bCs w:val="1"/>
+          <w:sz w:val="24"/>
+          <w:szCs w:val="24"/>
+        </w:rPr>
+      </w:pPr>
+      <w:r>
+        <w:rPr>
+          <w:rFonts w:ascii="Times New Roman" w:hAnsi="Times New Roman" w:eastAsia="Times New Roman" w:cs="Times New Roman"/>
+          <w:b w:val="1"/>
+          <w:bCs w:val="1"/>
+          <w:sz w:val="24"/>
+          <w:szCs w:val="24"/>
+        </w:rPr>
+        <w:t xml:space="preserve">Conclusão </w:t>
+      </w:r>
+      <w:r>
+        <w:br/>
+      </w:r>
+      <w:r>
+        <w:rPr>
+          <w:rFonts w:ascii="Times New Roman" w:hAnsi="Times New Roman" w:eastAsia="Times New Roman" w:cs="Times New Roman"/>
+          <w:sz w:val="24"/>
+          <w:szCs w:val="24"/>
+        </w:rPr>
+        <w:t xml:space="preserve">O desenvolvimento da arquitetura para o </w:t>
+      </w:r>
+      <w:r>
+        <w:rPr>
+          <w:rFonts w:ascii="Times New Roman" w:hAnsi="Times New Roman" w:eastAsia="Times New Roman" w:cs="Times New Roman"/>
+          <w:b w:val="1"/>
+          <w:bCs w:val="1"/>
+          <w:sz w:val="24"/>
+          <w:szCs w:val="24"/>
+        </w:rPr>
+        <w:t>Sistema de Apoio à Alfabetização Hospitalar</w:t>
+      </w:r>
+      <w:r>
+        <w:rPr>
+          <w:rFonts w:ascii="Times New Roman" w:hAnsi="Times New Roman" w:eastAsia="Times New Roman" w:cs="Times New Roman"/>
+          <w:sz w:val="24"/>
+          <w:szCs w:val="24"/>
+        </w:rPr>
+        <w:t xml:space="preserve"> demonstra que a tecnologia, quando aplicada de forma humanizada, pode mitigar os impactos negativos do internamento prolongado no desenvolvimento educacional de crianças e adolescentes.</w:t>
+      </w:r>
+    </w:p>
+    <w:p>
+      <w:pPr>
+        <w:spacing w:before="240" w:after="240" w:line="360" w:lineRule="auto"/>
+      </w:pPr>
+      <w:r>
+        <w:rPr>
+          <w:rFonts w:ascii="Times New Roman" w:hAnsi="Times New Roman" w:eastAsia="Times New Roman" w:cs="Times New Roman"/>
+          <w:sz w:val="24"/>
+          <w:szCs w:val="24"/>
+        </w:rPr>
+        <w:t xml:space="preserve">A escolha pela organização </w:t>
+      </w:r>
+      <w:r>
+        <w:rPr>
+          <w:rFonts w:ascii="Times New Roman" w:hAnsi="Times New Roman" w:eastAsia="Times New Roman" w:cs="Times New Roman"/>
+          <w:sz w:val="24"/>
+          <w:szCs w:val="24"/>
+        </w:rPr>
+        <w:t>hexagonal</w:t>
+      </w:r>
+      <w:r>
+        <w:rPr>
+          <w:rFonts w:ascii="Times New Roman" w:hAnsi="Times New Roman" w:eastAsia="Times New Roman" w:cs="Times New Roman"/>
+          <w:sz w:val="24"/>
+          <w:szCs w:val="24"/>
+        </w:rPr>
+        <w:t xml:space="preserve"> e pelo "</w:t>
+      </w:r>
+      <w:proofErr w:type="spellStart"/>
+      <w:r>
+        <w:rPr>
+          <w:rFonts w:ascii="Times New Roman" w:hAnsi="Times New Roman" w:eastAsia="Times New Roman" w:cs="Times New Roman"/>
+          <w:sz w:val="24"/>
+          <w:szCs w:val="24"/>
+        </w:rPr>
+        <w:t>Privacy</w:t>
+      </w:r>
+      <w:proofErr w:type="spellEnd"/>
+      <w:r>
+        <w:rPr>
+          <w:rFonts w:ascii="Times New Roman" w:hAnsi="Times New Roman" w:eastAsia="Times New Roman" w:cs="Times New Roman"/>
           <w:sz w:val="24"/>
           <w:szCs w:val="24"/>
         </w:rPr>
         <w:t xml:space="preserve"> </w:t>
       </w:r>
-      <w:r>
-        <w:rPr>
-          <w:rFonts w:ascii="Times New Roman" w:hAnsi="Times New Roman" w:eastAsia="Times New Roman" w:cs="Times New Roman"/>
-          <w:b/>
-          <w:bCs/>
-          <w:sz w:val="24"/>
-          <w:szCs w:val="24"/>
-        </w:rPr>
-        <w:t xml:space="preserve">Conclusão </w:t>
-      </w:r>
-      <w:r>
-        <w:br/>
-      </w:r>
-      <w:r>
-        <w:rPr>
-          <w:rFonts w:ascii="Times New Roman" w:hAnsi="Times New Roman" w:eastAsia="Times New Roman" w:cs="Times New Roman"/>
-          <w:sz w:val="24"/>
-          <w:szCs w:val="24"/>
-        </w:rPr>
-        <w:t xml:space="preserve">O desenvolvimento da arquitetura para o </w:t>
-      </w:r>
-      <w:r>
-        <w:rPr>
-          <w:rFonts w:ascii="Times New Roman" w:hAnsi="Times New Roman" w:eastAsia="Times New Roman" w:cs="Times New Roman"/>
-          <w:b/>
-          <w:bCs/>
-          <w:sz w:val="24"/>
-          <w:szCs w:val="24"/>
-        </w:rPr>
-        <w:t>Sistema de Apoio à Alfabetização Hospitalar</w:t>
-      </w:r>
-      <w:r>
-        <w:rPr>
-          <w:rFonts w:ascii="Times New Roman" w:hAnsi="Times New Roman" w:eastAsia="Times New Roman" w:cs="Times New Roman"/>
-          <w:sz w:val="24"/>
-          <w:szCs w:val="24"/>
-        </w:rPr>
-        <w:t xml:space="preserve"> demonstra que a tecnologia, quando aplicada de forma humanizada, pode mitigar os impactos negativos do internamento prolongado no desenvolvimento educacional de crianças e adolescentes.</w:t>
+      <w:proofErr w:type="spellStart"/>
+      <w:r>
+        <w:rPr>
+          <w:rFonts w:ascii="Times New Roman" w:hAnsi="Times New Roman" w:eastAsia="Times New Roman" w:cs="Times New Roman"/>
+          <w:sz w:val="24"/>
+          <w:szCs w:val="24"/>
+        </w:rPr>
+        <w:t>by</w:t>
+      </w:r>
+      <w:proofErr w:type="spellEnd"/>
+      <w:r>
+        <w:rPr>
+          <w:rFonts w:ascii="Times New Roman" w:hAnsi="Times New Roman" w:eastAsia="Times New Roman" w:cs="Times New Roman"/>
+          <w:sz w:val="24"/>
+          <w:szCs w:val="24"/>
+        </w:rPr>
+        <w:t xml:space="preserve"> Design" mostrou-se a decisão mais acertada para este cenário. Ao distribuir o risco e restringir as responsabilidades em compartimentos onde as interfaces controlam com exatidão o fluxo de dados, o projeto entrega uma infraestrutura robusta que protege a privacidade infantil não apenas juridicamente, mas tecnicamente.</w:t>
       </w:r>
     </w:p>
     <w:p>
       <w:pPr>
         <w:spacing w:before="240" w:after="240" w:line="360" w:lineRule="auto"/>
-      </w:pPr>
-      <w:r>
-        <w:rPr>
-          <w:rFonts w:ascii="Times New Roman" w:hAnsi="Times New Roman" w:eastAsia="Times New Roman" w:cs="Times New Roman"/>
-          <w:sz w:val="24"/>
-          <w:szCs w:val="24"/>
-        </w:rPr>
-        <w:t xml:space="preserve">A escolha pela organização </w:t>
-      </w:r>
-      <w:r>
-        <w:rPr>
-          <w:rFonts w:ascii="Times New Roman" w:hAnsi="Times New Roman" w:eastAsia="Times New Roman" w:cs="Times New Roman"/>
-          <w:sz w:val="24"/>
-          <w:szCs w:val="24"/>
-        </w:rPr>
-        <w:t>hexagonal</w:t>
-      </w:r>
-      <w:r>
-        <w:rPr>
-          <w:rFonts w:ascii="Times New Roman" w:hAnsi="Times New Roman" w:eastAsia="Times New Roman" w:cs="Times New Roman"/>
-          <w:sz w:val="24"/>
-          <w:szCs w:val="24"/>
-        </w:rPr>
-        <w:t xml:space="preserve"> e pelo "</w:t>
-      </w:r>
-      <w:proofErr w:type="spellStart"/>
-      <w:r>
-        <w:rPr>
-          <w:rFonts w:ascii="Times New Roman" w:hAnsi="Times New Roman" w:eastAsia="Times New Roman" w:cs="Times New Roman"/>
-          <w:sz w:val="24"/>
-          <w:szCs w:val="24"/>
-        </w:rPr>
-        <w:t>Privacy</w:t>
-      </w:r>
-      <w:proofErr w:type="spellEnd"/>
-      <w:r>
-        <w:rPr>
-          <w:rFonts w:ascii="Times New Roman" w:hAnsi="Times New Roman" w:eastAsia="Times New Roman" w:cs="Times New Roman"/>
+        <w:rPr>
+          <w:rFonts w:ascii="Times New Roman" w:hAnsi="Times New Roman" w:eastAsia="Times New Roman" w:cs="Times New Roman"/>
+          <w:sz w:val="24"/>
+          <w:szCs w:val="24"/>
+        </w:rPr>
+      </w:pPr>
+      <w:r>
+        <w:rPr>
+          <w:rFonts w:ascii="Times New Roman" w:hAnsi="Times New Roman" w:eastAsia="Times New Roman" w:cs="Times New Roman"/>
+          <w:sz w:val="24"/>
+          <w:szCs w:val="24"/>
+        </w:rPr>
+        <w:t xml:space="preserve">A escolha pela </w:t>
+      </w:r>
+      <w:r>
+        <w:rPr>
+          <w:rFonts w:ascii="Times New Roman" w:hAnsi="Times New Roman" w:eastAsia="Times New Roman" w:cs="Times New Roman"/>
+          <w:b w:val="1"/>
+          <w:bCs w:val="1"/>
+          <w:sz w:val="24"/>
+          <w:szCs w:val="24"/>
+        </w:rPr>
+        <w:t>Arquitetura</w:t>
+      </w:r>
+      <w:r>
+        <w:rPr>
+          <w:rFonts w:ascii="Times New Roman" w:hAnsi="Times New Roman" w:eastAsia="Times New Roman" w:cs="Times New Roman"/>
+          <w:b w:val="1"/>
+          <w:bCs w:val="1"/>
+          <w:sz w:val="24"/>
+          <w:szCs w:val="24"/>
+        </w:rPr>
+        <w:t xml:space="preserve"> em</w:t>
+      </w:r>
+      <w:r>
+        <w:rPr>
+          <w:rFonts w:ascii="Times New Roman" w:hAnsi="Times New Roman" w:eastAsia="Times New Roman" w:cs="Times New Roman"/>
+          <w:b w:val="1"/>
+          <w:bCs w:val="1"/>
           <w:sz w:val="24"/>
           <w:szCs w:val="24"/>
         </w:rPr>
         <w:t xml:space="preserve"> </w:t>
       </w:r>
-      <w:proofErr w:type="spellStart"/>
-      <w:r>
-        <w:rPr>
-          <w:rFonts w:ascii="Times New Roman" w:hAnsi="Times New Roman" w:eastAsia="Times New Roman" w:cs="Times New Roman"/>
-          <w:sz w:val="24"/>
-          <w:szCs w:val="24"/>
-        </w:rPr>
-        <w:t>by</w:t>
-      </w:r>
-      <w:proofErr w:type="spellEnd"/>
-      <w:r>
-        <w:rPr>
-          <w:rFonts w:ascii="Times New Roman" w:hAnsi="Times New Roman" w:eastAsia="Times New Roman" w:cs="Times New Roman"/>
-          <w:sz w:val="24"/>
-          <w:szCs w:val="24"/>
-        </w:rPr>
-        <w:t xml:space="preserve"> Design" mostrou-se a decisão mais acertada para este cenário. Ao distribuir o risco e restringir as responsabilidades em compartimentos onde as interfaces controlam com exatidão o fluxo de dados, o projeto entrega uma infraestrutura robusta que protege a privacidade infantil não apenas juridicamente, mas tecnicamente.</w:t>
-      </w:r>
-    </w:p>
-    <w:p>
-      <w:pPr>
-        <w:spacing w:before="240" w:after="240" w:line="360" w:lineRule="auto"/>
-      </w:pPr>
-      <w:r>
-        <w:rPr>
-          <w:rFonts w:ascii="Times New Roman" w:hAnsi="Times New Roman" w:eastAsia="Times New Roman" w:cs="Times New Roman"/>
-          <w:sz w:val="24"/>
-          <w:szCs w:val="24"/>
-        </w:rPr>
-        <w:t xml:space="preserve">A escolha pela </w:t>
-      </w:r>
-      <w:r>
-        <w:rPr>
-          <w:rFonts w:ascii="Times New Roman" w:hAnsi="Times New Roman" w:eastAsia="Times New Roman" w:cs="Times New Roman"/>
-          <w:b/>
-          <w:bCs/>
-          <w:sz w:val="24"/>
-          <w:szCs w:val="24"/>
-        </w:rPr>
-        <w:t>Arquitetura</w:t>
-      </w:r>
-      <w:r>
-        <w:rPr>
-          <w:rFonts w:ascii="Times New Roman" w:hAnsi="Times New Roman" w:eastAsia="Times New Roman" w:cs="Times New Roman"/>
-          <w:b/>
-          <w:bCs/>
-          <w:sz w:val="24"/>
-          <w:szCs w:val="24"/>
-        </w:rPr>
-        <w:t xml:space="preserve"> em</w:t>
-      </w:r>
-      <w:r>
-        <w:rPr>
-          <w:rFonts w:ascii="Times New Roman" w:hAnsi="Times New Roman" w:eastAsia="Times New Roman" w:cs="Times New Roman"/>
-          <w:b/>
-          <w:bCs/>
+      <w:r>
+        <w:rPr>
+          <w:rFonts w:ascii="Times New Roman" w:hAnsi="Times New Roman" w:eastAsia="Times New Roman" w:cs="Times New Roman"/>
+          <w:b w:val="1"/>
+          <w:bCs w:val="1"/>
+          <w:sz w:val="24"/>
+          <w:szCs w:val="24"/>
+        </w:rPr>
+        <w:t>Hexagonal</w:t>
+      </w:r>
+      <w:r>
+        <w:rPr>
+          <w:rFonts w:ascii="Times New Roman" w:hAnsi="Times New Roman" w:eastAsia="Times New Roman" w:cs="Times New Roman"/>
+          <w:b w:val="1"/>
+          <w:bCs w:val="1"/>
+          <w:sz w:val="24"/>
+          <w:szCs w:val="24"/>
+        </w:rPr>
+        <w:t xml:space="preserve"> (</w:t>
+      </w:r>
+      <w:r>
+        <w:rPr>
+          <w:rFonts w:ascii="Times New Roman" w:hAnsi="Times New Roman" w:eastAsia="Times New Roman" w:cs="Times New Roman"/>
+          <w:b w:val="1"/>
+          <w:bCs w:val="1"/>
+          <w:sz w:val="24"/>
+          <w:szCs w:val="24"/>
+        </w:rPr>
+        <w:t>Ports</w:t>
+      </w:r>
+      <w:r>
+        <w:rPr>
+          <w:rFonts w:ascii="Times New Roman" w:hAnsi="Times New Roman" w:eastAsia="Times New Roman" w:cs="Times New Roman"/>
+          <w:b w:val="1"/>
+          <w:bCs w:val="1"/>
           <w:sz w:val="24"/>
           <w:szCs w:val="24"/>
         </w:rPr>
@@ -4980,84 +5157,38 @@
       <w:r>
         <w:rPr>
           <w:rFonts w:ascii="Times New Roman" w:hAnsi="Times New Roman" w:eastAsia="Times New Roman" w:cs="Times New Roman"/>
-          <w:b/>
-          <w:bCs/>
-          <w:sz w:val="24"/>
-          <w:szCs w:val="24"/>
-        </w:rPr>
-        <w:t>Hexagonal</w:t>
-      </w:r>
-      <w:r>
-        <w:rPr>
-          <w:rFonts w:ascii="Times New Roman" w:hAnsi="Times New Roman" w:eastAsia="Times New Roman" w:cs="Times New Roman"/>
-          <w:b/>
-          <w:bCs/>
-          <w:sz w:val="24"/>
-          <w:szCs w:val="24"/>
-        </w:rPr>
-        <w:t xml:space="preserve"> (</w:t>
-      </w:r>
-      <w:proofErr w:type="spellStart"/>
-      <w:r>
-        <w:rPr>
-          <w:rFonts w:ascii="Times New Roman" w:hAnsi="Times New Roman" w:eastAsia="Times New Roman" w:cs="Times New Roman"/>
-          <w:b/>
-          <w:bCs/>
-          <w:sz w:val="24"/>
-          <w:szCs w:val="24"/>
-        </w:rPr>
-        <w:t>Ports</w:t>
-      </w:r>
-      <w:proofErr w:type="spellEnd"/>
-      <w:r>
-        <w:rPr>
-          <w:rFonts w:ascii="Times New Roman" w:hAnsi="Times New Roman" w:eastAsia="Times New Roman" w:cs="Times New Roman"/>
-          <w:b/>
-          <w:bCs/>
+          <w:b w:val="1"/>
+          <w:bCs w:val="1"/>
+          <w:sz w:val="24"/>
+          <w:szCs w:val="24"/>
+        </w:rPr>
+        <w:t>and</w:t>
+      </w:r>
+      <w:r>
+        <w:rPr>
+          <w:rFonts w:ascii="Times New Roman" w:hAnsi="Times New Roman" w:eastAsia="Times New Roman" w:cs="Times New Roman"/>
+          <w:b w:val="1"/>
+          <w:bCs w:val="1"/>
           <w:sz w:val="24"/>
           <w:szCs w:val="24"/>
         </w:rPr>
         <w:t xml:space="preserve"> </w:t>
       </w:r>
-      <w:proofErr w:type="spellStart"/>
-      <w:r>
-        <w:rPr>
-          <w:rFonts w:ascii="Times New Roman" w:hAnsi="Times New Roman" w:eastAsia="Times New Roman" w:cs="Times New Roman"/>
-          <w:b/>
-          <w:bCs/>
-          <w:sz w:val="24"/>
-          <w:szCs w:val="24"/>
-        </w:rPr>
-        <w:t>and</w:t>
-      </w:r>
-      <w:proofErr w:type="spellEnd"/>
-      <w:r>
-        <w:rPr>
-          <w:rFonts w:ascii="Times New Roman" w:hAnsi="Times New Roman" w:eastAsia="Times New Roman" w:cs="Times New Roman"/>
-          <w:b/>
-          <w:bCs/>
-          <w:sz w:val="24"/>
-          <w:szCs w:val="24"/>
-        </w:rPr>
-        <w:t xml:space="preserve"> </w:t>
-      </w:r>
-      <w:proofErr w:type="spellStart"/>
-      <w:r>
-        <w:rPr>
-          <w:rFonts w:ascii="Times New Roman" w:hAnsi="Times New Roman" w:eastAsia="Times New Roman" w:cs="Times New Roman"/>
-          <w:b/>
-          <w:bCs/>
+      <w:r>
+        <w:rPr>
+          <w:rFonts w:ascii="Times New Roman" w:hAnsi="Times New Roman" w:eastAsia="Times New Roman" w:cs="Times New Roman"/>
+          <w:b w:val="1"/>
+          <w:bCs w:val="1"/>
           <w:sz w:val="24"/>
           <w:szCs w:val="24"/>
         </w:rPr>
         <w:t>Adapters</w:t>
       </w:r>
-      <w:proofErr w:type="spellEnd"/>
-      <w:r>
-        <w:rPr>
-          <w:rFonts w:ascii="Times New Roman" w:hAnsi="Times New Roman" w:eastAsia="Times New Roman" w:cs="Times New Roman"/>
-          <w:b/>
-          <w:bCs/>
+      <w:r>
+        <w:rPr>
+          <w:rFonts w:ascii="Times New Roman" w:hAnsi="Times New Roman" w:eastAsia="Times New Roman" w:cs="Times New Roman"/>
+          <w:b w:val="1"/>
+          <w:bCs w:val="1"/>
           <w:sz w:val="24"/>
           <w:szCs w:val="24"/>
         </w:rPr>
@@ -5079,7 +5210,6 @@
         </w:rPr>
         <w:t xml:space="preserve">o uso de designs </w:t>
       </w:r>
-      <w:proofErr w:type="spellStart"/>
       <w:r>
         <w:rPr>
           <w:rFonts w:ascii="Times New Roman" w:hAnsi="Times New Roman" w:eastAsia="Times New Roman" w:cs="Times New Roman"/>
@@ -5088,14 +5218,29 @@
         </w:rPr>
         <w:t>patterns</w:t>
       </w:r>
-      <w:proofErr w:type="spellEnd"/>
-      <w:r>
-        <w:rPr>
-          <w:rFonts w:ascii="Times New Roman" w:hAnsi="Times New Roman" w:eastAsia="Times New Roman" w:cs="Times New Roman"/>
-          <w:sz w:val="24"/>
-          <w:szCs w:val="24"/>
-        </w:rPr>
-        <w:t xml:space="preserve"> mostraram-se as decisões mais acertadas para este cenário por três motivos fundamentais:</w:t>
+      <w:r>
+        <w:rPr>
+          <w:rFonts w:ascii="Times New Roman" w:hAnsi="Times New Roman" w:eastAsia="Times New Roman" w:cs="Times New Roman"/>
+          <w:sz w:val="24"/>
+          <w:szCs w:val="24"/>
+        </w:rPr>
+        <w:t xml:space="preserve"> mostr</w:t>
+      </w:r>
+      <w:r>
+        <w:rPr>
+          <w:rFonts w:ascii="Times New Roman" w:hAnsi="Times New Roman" w:eastAsia="Times New Roman" w:cs="Times New Roman"/>
+          <w:sz w:val="24"/>
+          <w:szCs w:val="24"/>
+        </w:rPr>
+        <w:t>ou</w:t>
+      </w:r>
+      <w:r>
+        <w:rPr>
+          <w:rFonts w:ascii="Times New Roman" w:hAnsi="Times New Roman" w:eastAsia="Times New Roman" w:cs="Times New Roman"/>
+          <w:sz w:val="24"/>
+          <w:szCs w:val="24"/>
+        </w:rPr>
+        <w:t>-se as decisões mais acertadas para este cenário por três motivos fundamentais:</w:t>
       </w:r>
     </w:p>
     <w:p>
@@ -6343,14 +6488,17 @@
     <w:nsid w:val="2D5FAAC3"/>
     <w:multiLevelType w:val="hybridMultilevel"/>
     <w:tmpl w:val="FFFFFFFF"/>
-    <w:lvl w:ilvl="0" w:tplc="757CAF9C">
-      <w:start w:val="1"/>
-      <w:numFmt w:val="decimal"/>
-      <w:lvlText w:val="%1."/>
+    <w:lvl w:ilvl="0">
+      <w:start w:val="1"/>
+      <w:numFmt w:val="bullet"/>
+      <w:lvlText w:val=""/>
       <w:lvlJc w:val="left"/>
       <w:pPr>
         <w:ind w:left="720" w:hanging="360"/>
       </w:pPr>
+      <w:rPr>
+        <w:rFonts w:hint="default" w:ascii="Symbol" w:hAnsi="Symbol"/>
+      </w:rPr>
     </w:lvl>
     <w:lvl w:ilvl="1" w:tplc="88AE210C">
       <w:start w:val="1"/>

</xml_diff>